<commit_message>
Update Tamer_Hussen_S23130437 Project Final Report.docx
</commit_message>
<xml_diff>
--- a/Assignements/Tamer_Hussen_S23130437 Project Final Report.docx
+++ b/Assignements/Tamer_Hussen_S23130437 Project Final Report.docx
@@ -680,7 +680,7 @@
       <w:pPr>
         <w:pStyle w:val="Heading1"/>
       </w:pPr>
-      <w:bookmarkStart w:id="7" w:name="_Toc227953097"/>
+      <w:bookmarkStart w:id="7" w:name="_Toc228022991"/>
       <w:r>
         <w:t>Abstract</w:t>
       </w:r>
@@ -944,7 +944,7 @@
           <w:r>
             <w:fldChar w:fldCharType="separate"/>
           </w:r>
-          <w:hyperlink w:anchor="_Toc227953097" w:history="1">
+          <w:hyperlink w:anchor="_Toc228022991" w:history="1">
             <w:r>
               <w:rPr>
                 <w:rStyle w:val="Hyperlink"/>
@@ -971,7 +971,7 @@
                 <w:noProof/>
                 <w:webHidden/>
               </w:rPr>
-              <w:instrText xml:space="preserve"> PAGEREF _Toc227953097 \h </w:instrText>
+              <w:instrText xml:space="preserve"> PAGEREF _Toc228022991 \h </w:instrText>
             </w:r>
             <w:r>
               <w:rPr>
@@ -1014,7 +1014,7 @@
               <w:lang w:eastAsia="en-GB"/>
             </w:rPr>
           </w:pPr>
-          <w:hyperlink w:anchor="_Toc227953098" w:history="1">
+          <w:hyperlink w:anchor="_Toc228022992" w:history="1">
             <w:r>
               <w:rPr>
                 <w:rStyle w:val="Hyperlink"/>
@@ -1041,7 +1041,7 @@
                 <w:noProof/>
                 <w:webHidden/>
               </w:rPr>
-              <w:instrText xml:space="preserve"> PAGEREF _Toc227953098 \h </w:instrText>
+              <w:instrText xml:space="preserve"> PAGEREF _Toc228022992 \h </w:instrText>
             </w:r>
             <w:r>
               <w:rPr>
@@ -1084,7 +1084,7 @@
               <w:lang w:eastAsia="en-GB"/>
             </w:rPr>
           </w:pPr>
-          <w:hyperlink w:anchor="_Toc227953099" w:history="1">
+          <w:hyperlink w:anchor="_Toc228022993" w:history="1">
             <w:r>
               <w:rPr>
                 <w:rStyle w:val="Hyperlink"/>
@@ -1111,7 +1111,7 @@
                 <w:noProof/>
                 <w:webHidden/>
               </w:rPr>
-              <w:instrText xml:space="preserve"> PAGEREF _Toc227953099 \h </w:instrText>
+              <w:instrText xml:space="preserve"> PAGEREF _Toc228022993 \h </w:instrText>
             </w:r>
             <w:r>
               <w:rPr>
@@ -1154,7 +1154,7 @@
               <w:lang w:eastAsia="en-GB"/>
             </w:rPr>
           </w:pPr>
-          <w:hyperlink w:anchor="_Toc227953100" w:history="1">
+          <w:hyperlink w:anchor="_Toc228022994" w:history="1">
             <w:r>
               <w:rPr>
                 <w:rStyle w:val="Hyperlink"/>
@@ -1181,7 +1181,7 @@
                 <w:noProof/>
                 <w:webHidden/>
               </w:rPr>
-              <w:instrText xml:space="preserve"> PAGEREF _Toc227953100 \h </w:instrText>
+              <w:instrText xml:space="preserve"> PAGEREF _Toc228022994 \h </w:instrText>
             </w:r>
             <w:r>
               <w:rPr>
@@ -1224,7 +1224,7 @@
               <w:lang w:eastAsia="en-GB"/>
             </w:rPr>
           </w:pPr>
-          <w:hyperlink w:anchor="_Toc227953101" w:history="1">
+          <w:hyperlink w:anchor="_Toc228022995" w:history="1">
             <w:r>
               <w:rPr>
                 <w:rStyle w:val="Hyperlink"/>
@@ -1251,7 +1251,7 @@
                 <w:noProof/>
                 <w:webHidden/>
               </w:rPr>
-              <w:instrText xml:space="preserve"> PAGEREF _Toc227953101 \h </w:instrText>
+              <w:instrText xml:space="preserve"> PAGEREF _Toc228022995 \h </w:instrText>
             </w:r>
             <w:r>
               <w:rPr>
@@ -1294,7 +1294,7 @@
               <w:lang w:eastAsia="en-GB"/>
             </w:rPr>
           </w:pPr>
-          <w:hyperlink w:anchor="_Toc227953102" w:history="1">
+          <w:hyperlink w:anchor="_Toc228022996" w:history="1">
             <w:r>
               <w:rPr>
                 <w:rStyle w:val="Hyperlink"/>
@@ -1321,7 +1321,7 @@
                 <w:noProof/>
                 <w:webHidden/>
               </w:rPr>
-              <w:instrText xml:space="preserve"> PAGEREF _Toc227953102 \h </w:instrText>
+              <w:instrText xml:space="preserve"> PAGEREF _Toc228022996 \h </w:instrText>
             </w:r>
             <w:r>
               <w:rPr>
@@ -1364,7 +1364,7 @@
               <w:lang w:eastAsia="en-GB"/>
             </w:rPr>
           </w:pPr>
-          <w:hyperlink w:anchor="_Toc227953103" w:history="1">
+          <w:hyperlink w:anchor="_Toc228022997" w:history="1">
             <w:r>
               <w:rPr>
                 <w:rStyle w:val="Hyperlink"/>
@@ -1391,7 +1391,7 @@
                 <w:noProof/>
                 <w:webHidden/>
               </w:rPr>
-              <w:instrText xml:space="preserve"> PAGEREF _Toc227953103 \h </w:instrText>
+              <w:instrText xml:space="preserve"> PAGEREF _Toc228022997 \h </w:instrText>
             </w:r>
             <w:r>
               <w:rPr>
@@ -1434,7 +1434,7 @@
               <w:lang w:eastAsia="en-GB"/>
             </w:rPr>
           </w:pPr>
-          <w:hyperlink w:anchor="_Toc227953104" w:history="1">
+          <w:hyperlink w:anchor="_Toc228022998" w:history="1">
             <w:r>
               <w:rPr>
                 <w:rStyle w:val="Hyperlink"/>
@@ -1461,7 +1461,7 @@
                 <w:noProof/>
                 <w:webHidden/>
               </w:rPr>
-              <w:instrText xml:space="preserve"> PAGEREF _Toc227953104 \h </w:instrText>
+              <w:instrText xml:space="preserve"> PAGEREF _Toc228022998 \h </w:instrText>
             </w:r>
             <w:r>
               <w:rPr>
@@ -1504,7 +1504,7 @@
               <w:lang w:eastAsia="en-GB"/>
             </w:rPr>
           </w:pPr>
-          <w:hyperlink w:anchor="_Toc227953105" w:history="1">
+          <w:hyperlink w:anchor="_Toc228022999" w:history="1">
             <w:r>
               <w:rPr>
                 <w:rStyle w:val="Hyperlink"/>
@@ -1531,7 +1531,7 @@
                 <w:noProof/>
                 <w:webHidden/>
               </w:rPr>
-              <w:instrText xml:space="preserve"> PAGEREF _Toc227953105 \h </w:instrText>
+              <w:instrText xml:space="preserve"> PAGEREF _Toc228022999 \h </w:instrText>
             </w:r>
             <w:r>
               <w:rPr>
@@ -1574,7 +1574,7 @@
               <w:lang w:eastAsia="en-GB"/>
             </w:rPr>
           </w:pPr>
-          <w:hyperlink w:anchor="_Toc227953106" w:history="1">
+          <w:hyperlink w:anchor="_Toc228023000" w:history="1">
             <w:r>
               <w:rPr>
                 <w:rStyle w:val="Hyperlink"/>
@@ -1601,7 +1601,7 @@
                 <w:noProof/>
                 <w:webHidden/>
               </w:rPr>
-              <w:instrText xml:space="preserve"> PAGEREF _Toc227953106 \h </w:instrText>
+              <w:instrText xml:space="preserve"> PAGEREF _Toc228023000 \h </w:instrText>
             </w:r>
             <w:r>
               <w:rPr>
@@ -1644,7 +1644,7 @@
               <w:lang w:eastAsia="en-GB"/>
             </w:rPr>
           </w:pPr>
-          <w:hyperlink w:anchor="_Toc227953107" w:history="1">
+          <w:hyperlink w:anchor="_Toc228023001" w:history="1">
             <w:r>
               <w:rPr>
                 <w:rStyle w:val="Hyperlink"/>
@@ -1671,7 +1671,7 @@
                 <w:noProof/>
                 <w:webHidden/>
               </w:rPr>
-              <w:instrText xml:space="preserve"> PAGEREF _Toc227953107 \h </w:instrText>
+              <w:instrText xml:space="preserve"> PAGEREF _Toc228023001 \h </w:instrText>
             </w:r>
             <w:r>
               <w:rPr>
@@ -1714,7 +1714,7 @@
               <w:lang w:eastAsia="en-GB"/>
             </w:rPr>
           </w:pPr>
-          <w:hyperlink w:anchor="_Toc227953108" w:history="1">
+          <w:hyperlink w:anchor="_Toc228023002" w:history="1">
             <w:r>
               <w:rPr>
                 <w:rStyle w:val="Hyperlink"/>
@@ -1741,7 +1741,7 @@
                 <w:noProof/>
                 <w:webHidden/>
               </w:rPr>
-              <w:instrText xml:space="preserve"> PAGEREF _Toc227953108 \h </w:instrText>
+              <w:instrText xml:space="preserve"> PAGEREF _Toc228023002 \h </w:instrText>
             </w:r>
             <w:r>
               <w:rPr>
@@ -1784,7 +1784,7 @@
               <w:lang w:eastAsia="en-GB"/>
             </w:rPr>
           </w:pPr>
-          <w:hyperlink w:anchor="_Toc227953109" w:history="1">
+          <w:hyperlink w:anchor="_Toc228023003" w:history="1">
             <w:r>
               <w:rPr>
                 <w:rStyle w:val="Hyperlink"/>
@@ -1811,7 +1811,7 @@
                 <w:noProof/>
                 <w:webHidden/>
               </w:rPr>
-              <w:instrText xml:space="preserve"> PAGEREF _Toc227953109 \h </w:instrText>
+              <w:instrText xml:space="preserve"> PAGEREF _Toc228023003 \h </w:instrText>
             </w:r>
             <w:r>
               <w:rPr>
@@ -1854,7 +1854,7 @@
               <w:lang w:eastAsia="en-GB"/>
             </w:rPr>
           </w:pPr>
-          <w:hyperlink w:anchor="_Toc227953110" w:history="1">
+          <w:hyperlink w:anchor="_Toc228023004" w:history="1">
             <w:r>
               <w:rPr>
                 <w:rStyle w:val="Hyperlink"/>
@@ -1881,7 +1881,7 @@
                 <w:noProof/>
                 <w:webHidden/>
               </w:rPr>
-              <w:instrText xml:space="preserve"> PAGEREF _Toc227953110 \h </w:instrText>
+              <w:instrText xml:space="preserve"> PAGEREF _Toc228023004 \h </w:instrText>
             </w:r>
             <w:r>
               <w:rPr>
@@ -1924,7 +1924,7 @@
               <w:lang w:eastAsia="en-GB"/>
             </w:rPr>
           </w:pPr>
-          <w:hyperlink w:anchor="_Toc227953111" w:history="1">
+          <w:hyperlink w:anchor="_Toc228023005" w:history="1">
             <w:r>
               <w:rPr>
                 <w:rStyle w:val="Hyperlink"/>
@@ -1951,7 +1951,7 @@
                 <w:noProof/>
                 <w:webHidden/>
               </w:rPr>
-              <w:instrText xml:space="preserve"> PAGEREF _Toc227953111 \h </w:instrText>
+              <w:instrText xml:space="preserve"> PAGEREF _Toc228023005 \h </w:instrText>
             </w:r>
             <w:r>
               <w:rPr>
@@ -1994,7 +1994,7 @@
               <w:lang w:eastAsia="en-GB"/>
             </w:rPr>
           </w:pPr>
-          <w:hyperlink w:anchor="_Toc227953112" w:history="1">
+          <w:hyperlink w:anchor="_Toc228023006" w:history="1">
             <w:r>
               <w:rPr>
                 <w:rStyle w:val="Hyperlink"/>
@@ -2021,7 +2021,7 @@
                 <w:noProof/>
                 <w:webHidden/>
               </w:rPr>
-              <w:instrText xml:space="preserve"> PAGEREF _Toc227953112 \h </w:instrText>
+              <w:instrText xml:space="preserve"> PAGEREF _Toc228023006 \h </w:instrText>
             </w:r>
             <w:r>
               <w:rPr>
@@ -2064,7 +2064,7 @@
               <w:lang w:eastAsia="en-GB"/>
             </w:rPr>
           </w:pPr>
-          <w:hyperlink w:anchor="_Toc227953113" w:history="1">
+          <w:hyperlink w:anchor="_Toc228023007" w:history="1">
             <w:r>
               <w:rPr>
                 <w:rStyle w:val="Hyperlink"/>
@@ -2091,7 +2091,7 @@
                 <w:noProof/>
                 <w:webHidden/>
               </w:rPr>
-              <w:instrText xml:space="preserve"> PAGEREF _Toc227953113 \h </w:instrText>
+              <w:instrText xml:space="preserve"> PAGEREF _Toc228023007 \h </w:instrText>
             </w:r>
             <w:r>
               <w:rPr>
@@ -2134,7 +2134,7 @@
               <w:lang w:eastAsia="en-GB"/>
             </w:rPr>
           </w:pPr>
-          <w:hyperlink w:anchor="_Toc227953114" w:history="1">
+          <w:hyperlink w:anchor="_Toc228023008" w:history="1">
             <w:r>
               <w:rPr>
                 <w:rStyle w:val="Hyperlink"/>
@@ -2161,7 +2161,7 @@
                 <w:noProof/>
                 <w:webHidden/>
               </w:rPr>
-              <w:instrText xml:space="preserve"> PAGEREF _Toc227953114 \h </w:instrText>
+              <w:instrText xml:space="preserve"> PAGEREF _Toc228023008 \h </w:instrText>
             </w:r>
             <w:r>
               <w:rPr>
@@ -2204,7 +2204,7 @@
               <w:lang w:eastAsia="en-GB"/>
             </w:rPr>
           </w:pPr>
-          <w:hyperlink w:anchor="_Toc227953115" w:history="1">
+          <w:hyperlink w:anchor="_Toc228023009" w:history="1">
             <w:r>
               <w:rPr>
                 <w:rStyle w:val="Hyperlink"/>
@@ -2231,7 +2231,7 @@
                 <w:noProof/>
                 <w:webHidden/>
               </w:rPr>
-              <w:instrText xml:space="preserve"> PAGEREF _Toc227953115 \h </w:instrText>
+              <w:instrText xml:space="preserve"> PAGEREF _Toc228023009 \h </w:instrText>
             </w:r>
             <w:r>
               <w:rPr>
@@ -2274,7 +2274,7 @@
               <w:lang w:eastAsia="en-GB"/>
             </w:rPr>
           </w:pPr>
-          <w:hyperlink w:anchor="_Toc227953116" w:history="1">
+          <w:hyperlink w:anchor="_Toc228023010" w:history="1">
             <w:r>
               <w:rPr>
                 <w:rStyle w:val="Hyperlink"/>
@@ -2301,7 +2301,7 @@
                 <w:noProof/>
                 <w:webHidden/>
               </w:rPr>
-              <w:instrText xml:space="preserve"> PAGEREF _Toc227953116 \h </w:instrText>
+              <w:instrText xml:space="preserve"> PAGEREF _Toc228023010 \h </w:instrText>
             </w:r>
             <w:r>
               <w:rPr>
@@ -2344,7 +2344,7 @@
               <w:lang w:eastAsia="en-GB"/>
             </w:rPr>
           </w:pPr>
-          <w:hyperlink w:anchor="_Toc227953117" w:history="1">
+          <w:hyperlink w:anchor="_Toc228023011" w:history="1">
             <w:r>
               <w:rPr>
                 <w:rStyle w:val="Hyperlink"/>
@@ -2371,7 +2371,7 @@
                 <w:noProof/>
                 <w:webHidden/>
               </w:rPr>
-              <w:instrText xml:space="preserve"> PAGEREF _Toc227953117 \h </w:instrText>
+              <w:instrText xml:space="preserve"> PAGEREF _Toc228023011 \h </w:instrText>
             </w:r>
             <w:r>
               <w:rPr>
@@ -2414,7 +2414,7 @@
               <w:lang w:eastAsia="en-GB"/>
             </w:rPr>
           </w:pPr>
-          <w:hyperlink w:anchor="_Toc227953118" w:history="1">
+          <w:hyperlink w:anchor="_Toc228023012" w:history="1">
             <w:r>
               <w:rPr>
                 <w:rStyle w:val="Hyperlink"/>
@@ -2441,7 +2441,7 @@
                 <w:noProof/>
                 <w:webHidden/>
               </w:rPr>
-              <w:instrText xml:space="preserve"> PAGEREF _Toc227953118 \h </w:instrText>
+              <w:instrText xml:space="preserve"> PAGEREF _Toc228023012 \h </w:instrText>
             </w:r>
             <w:r>
               <w:rPr>
@@ -2484,7 +2484,7 @@
               <w:lang w:eastAsia="en-GB"/>
             </w:rPr>
           </w:pPr>
-          <w:hyperlink w:anchor="_Toc227953119" w:history="1">
+          <w:hyperlink w:anchor="_Toc228023013" w:history="1">
             <w:r>
               <w:rPr>
                 <w:rStyle w:val="Hyperlink"/>
@@ -2511,7 +2511,7 @@
                 <w:noProof/>
                 <w:webHidden/>
               </w:rPr>
-              <w:instrText xml:space="preserve"> PAGEREF _Toc227953119 \h </w:instrText>
+              <w:instrText xml:space="preserve"> PAGEREF _Toc228023013 \h </w:instrText>
             </w:r>
             <w:r>
               <w:rPr>
@@ -2554,7 +2554,7 @@
               <w:lang w:eastAsia="en-GB"/>
             </w:rPr>
           </w:pPr>
-          <w:hyperlink w:anchor="_Toc227953120" w:history="1">
+          <w:hyperlink w:anchor="_Toc228023014" w:history="1">
             <w:r>
               <w:rPr>
                 <w:rStyle w:val="Hyperlink"/>
@@ -2581,7 +2581,7 @@
                 <w:noProof/>
                 <w:webHidden/>
               </w:rPr>
-              <w:instrText xml:space="preserve"> PAGEREF _Toc227953120 \h </w:instrText>
+              <w:instrText xml:space="preserve"> PAGEREF _Toc228023014 \h </w:instrText>
             </w:r>
             <w:r>
               <w:rPr>
@@ -2624,7 +2624,7 @@
               <w:lang w:eastAsia="en-GB"/>
             </w:rPr>
           </w:pPr>
-          <w:hyperlink w:anchor="_Toc227953121" w:history="1">
+          <w:hyperlink w:anchor="_Toc228023015" w:history="1">
             <w:r>
               <w:rPr>
                 <w:rStyle w:val="Hyperlink"/>
@@ -2651,7 +2651,7 @@
                 <w:noProof/>
                 <w:webHidden/>
               </w:rPr>
-              <w:instrText xml:space="preserve"> PAGEREF _Toc227953121 \h </w:instrText>
+              <w:instrText xml:space="preserve"> PAGEREF _Toc228023015 \h </w:instrText>
             </w:r>
             <w:r>
               <w:rPr>
@@ -2694,7 +2694,7 @@
               <w:lang w:eastAsia="en-GB"/>
             </w:rPr>
           </w:pPr>
-          <w:hyperlink w:anchor="_Toc227953122" w:history="1">
+          <w:hyperlink w:anchor="_Toc228023016" w:history="1">
             <w:r>
               <w:rPr>
                 <w:rStyle w:val="Hyperlink"/>
@@ -2721,7 +2721,7 @@
                 <w:noProof/>
                 <w:webHidden/>
               </w:rPr>
-              <w:instrText xml:space="preserve"> PAGEREF _Toc227953122 \h </w:instrText>
+              <w:instrText xml:space="preserve"> PAGEREF _Toc228023016 \h </w:instrText>
             </w:r>
             <w:r>
               <w:rPr>
@@ -2764,7 +2764,7 @@
               <w:lang w:eastAsia="en-GB"/>
             </w:rPr>
           </w:pPr>
-          <w:hyperlink w:anchor="_Toc227953123" w:history="1">
+          <w:hyperlink w:anchor="_Toc228023017" w:history="1">
             <w:r>
               <w:rPr>
                 <w:rStyle w:val="Hyperlink"/>
@@ -2791,7 +2791,7 @@
                 <w:noProof/>
                 <w:webHidden/>
               </w:rPr>
-              <w:instrText xml:space="preserve"> PAGEREF _Toc227953123 \h </w:instrText>
+              <w:instrText xml:space="preserve"> PAGEREF _Toc228023017 \h </w:instrText>
             </w:r>
             <w:r>
               <w:rPr>
@@ -2834,7 +2834,7 @@
               <w:lang w:eastAsia="en-GB"/>
             </w:rPr>
           </w:pPr>
-          <w:hyperlink w:anchor="_Toc227953124" w:history="1">
+          <w:hyperlink w:anchor="_Toc228023018" w:history="1">
             <w:r>
               <w:rPr>
                 <w:rStyle w:val="Hyperlink"/>
@@ -2861,7 +2861,7 @@
                 <w:noProof/>
                 <w:webHidden/>
               </w:rPr>
-              <w:instrText xml:space="preserve"> PAGEREF _Toc227953124 \h </w:instrText>
+              <w:instrText xml:space="preserve"> PAGEREF _Toc228023018 \h </w:instrText>
             </w:r>
             <w:r>
               <w:rPr>
@@ -2904,7 +2904,7 @@
               <w:lang w:eastAsia="en-GB"/>
             </w:rPr>
           </w:pPr>
-          <w:hyperlink w:anchor="_Toc227953125" w:history="1">
+          <w:hyperlink w:anchor="_Toc228023019" w:history="1">
             <w:r>
               <w:rPr>
                 <w:rStyle w:val="Hyperlink"/>
@@ -2931,7 +2931,7 @@
                 <w:noProof/>
                 <w:webHidden/>
               </w:rPr>
-              <w:instrText xml:space="preserve"> PAGEREF _Toc227953125 \h </w:instrText>
+              <w:instrText xml:space="preserve"> PAGEREF _Toc228023019 \h </w:instrText>
             </w:r>
             <w:r>
               <w:rPr>
@@ -2974,7 +2974,7 @@
               <w:lang w:eastAsia="en-GB"/>
             </w:rPr>
           </w:pPr>
-          <w:hyperlink w:anchor="_Toc227953126" w:history="1">
+          <w:hyperlink w:anchor="_Toc228023020" w:history="1">
             <w:r>
               <w:rPr>
                 <w:rStyle w:val="Hyperlink"/>
@@ -3001,7 +3001,7 @@
                 <w:noProof/>
                 <w:webHidden/>
               </w:rPr>
-              <w:instrText xml:space="preserve"> PAGEREF _Toc227953126 \h </w:instrText>
+              <w:instrText xml:space="preserve"> PAGEREF _Toc228023020 \h </w:instrText>
             </w:r>
             <w:r>
               <w:rPr>
@@ -3044,7 +3044,7 @@
               <w:lang w:eastAsia="en-GB"/>
             </w:rPr>
           </w:pPr>
-          <w:hyperlink w:anchor="_Toc227953127" w:history="1">
+          <w:hyperlink w:anchor="_Toc228023021" w:history="1">
             <w:r>
               <w:rPr>
                 <w:rStyle w:val="Hyperlink"/>
@@ -3071,7 +3071,7 @@
                 <w:noProof/>
                 <w:webHidden/>
               </w:rPr>
-              <w:instrText xml:space="preserve"> PAGEREF _Toc227953127 \h </w:instrText>
+              <w:instrText xml:space="preserve"> PAGEREF _Toc228023021 \h </w:instrText>
             </w:r>
             <w:r>
               <w:rPr>
@@ -3114,7 +3114,7 @@
               <w:lang w:eastAsia="en-GB"/>
             </w:rPr>
           </w:pPr>
-          <w:hyperlink w:anchor="_Toc227953128" w:history="1">
+          <w:hyperlink w:anchor="_Toc228023022" w:history="1">
             <w:r>
               <w:rPr>
                 <w:rStyle w:val="Hyperlink"/>
@@ -3141,7 +3141,7 @@
                 <w:noProof/>
                 <w:webHidden/>
               </w:rPr>
-              <w:instrText xml:space="preserve"> PAGEREF _Toc227953128 \h </w:instrText>
+              <w:instrText xml:space="preserve"> PAGEREF _Toc228023022 \h </w:instrText>
             </w:r>
             <w:r>
               <w:rPr>
@@ -3184,7 +3184,7 @@
               <w:lang w:eastAsia="en-GB"/>
             </w:rPr>
           </w:pPr>
-          <w:hyperlink w:anchor="_Toc227953129" w:history="1">
+          <w:hyperlink w:anchor="_Toc228023023" w:history="1">
             <w:r>
               <w:rPr>
                 <w:rStyle w:val="Hyperlink"/>
@@ -3211,7 +3211,7 @@
                 <w:noProof/>
                 <w:webHidden/>
               </w:rPr>
-              <w:instrText xml:space="preserve"> PAGEREF _Toc227953129 \h </w:instrText>
+              <w:instrText xml:space="preserve"> PAGEREF _Toc228023023 \h </w:instrText>
             </w:r>
             <w:r>
               <w:rPr>
@@ -3254,7 +3254,7 @@
               <w:lang w:eastAsia="en-GB"/>
             </w:rPr>
           </w:pPr>
-          <w:hyperlink w:anchor="_Toc227953130" w:history="1">
+          <w:hyperlink w:anchor="_Toc228023024" w:history="1">
             <w:r>
               <w:rPr>
                 <w:rStyle w:val="Hyperlink"/>
@@ -3281,7 +3281,7 @@
                 <w:noProof/>
                 <w:webHidden/>
               </w:rPr>
-              <w:instrText xml:space="preserve"> PAGEREF _Toc227953130 \h </w:instrText>
+              <w:instrText xml:space="preserve"> PAGEREF _Toc228023024 \h </w:instrText>
             </w:r>
             <w:r>
               <w:rPr>
@@ -3324,7 +3324,7 @@
               <w:lang w:eastAsia="en-GB"/>
             </w:rPr>
           </w:pPr>
-          <w:hyperlink w:anchor="_Toc227953131" w:history="1">
+          <w:hyperlink w:anchor="_Toc228023025" w:history="1">
             <w:r>
               <w:rPr>
                 <w:rStyle w:val="Hyperlink"/>
@@ -3351,7 +3351,7 @@
                 <w:noProof/>
                 <w:webHidden/>
               </w:rPr>
-              <w:instrText xml:space="preserve"> PAGEREF _Toc227953131 \h </w:instrText>
+              <w:instrText xml:space="preserve"> PAGEREF _Toc228023025 \h </w:instrText>
             </w:r>
             <w:r>
               <w:rPr>
@@ -3394,7 +3394,7 @@
               <w:lang w:eastAsia="en-GB"/>
             </w:rPr>
           </w:pPr>
-          <w:hyperlink w:anchor="_Toc227953132" w:history="1">
+          <w:hyperlink w:anchor="_Toc228023026" w:history="1">
             <w:r>
               <w:rPr>
                 <w:rStyle w:val="Hyperlink"/>
@@ -3421,7 +3421,7 @@
                 <w:noProof/>
                 <w:webHidden/>
               </w:rPr>
-              <w:instrText xml:space="preserve"> PAGEREF _Toc227953132 \h </w:instrText>
+              <w:instrText xml:space="preserve"> PAGEREF _Toc228023026 \h </w:instrText>
             </w:r>
             <w:r>
               <w:rPr>
@@ -4660,7 +4660,7 @@
         </w:rPr>
         <w:br w:type="page"/>
       </w:r>
-      <w:bookmarkStart w:id="8" w:name="_Toc227953098"/>
+      <w:bookmarkStart w:id="8" w:name="_Toc228022992"/>
       <w:r>
         <w:lastRenderedPageBreak/>
         <w:t>1.</w:t>
@@ -4683,7 +4683,7 @@
       <w:pPr>
         <w:pStyle w:val="Heading2"/>
       </w:pPr>
-      <w:bookmarkStart w:id="9" w:name="_Toc227953099"/>
+      <w:bookmarkStart w:id="9" w:name="_Toc228022993"/>
       <w:r>
         <w:t xml:space="preserve">1.1 </w:t>
       </w:r>
@@ -5402,7 +5402,7 @@
       <w:pPr>
         <w:pStyle w:val="Heading2"/>
       </w:pPr>
-      <w:bookmarkStart w:id="10" w:name="_Toc227953100"/>
+      <w:bookmarkStart w:id="10" w:name="_Toc228022994"/>
       <w:r>
         <w:t>1.</w:t>
       </w:r>
@@ -5784,7 +5784,7 @@
       <w:pPr>
         <w:pStyle w:val="Heading1"/>
       </w:pPr>
-      <w:bookmarkStart w:id="11" w:name="_Toc227953101"/>
+      <w:bookmarkStart w:id="11" w:name="_Toc228022995"/>
       <w:r>
         <w:t xml:space="preserve">2.0 </w:t>
       </w:r>
@@ -5797,7 +5797,7 @@
       <w:pPr>
         <w:pStyle w:val="Heading2"/>
       </w:pPr>
-      <w:bookmarkStart w:id="12" w:name="_Toc227953102"/>
+      <w:bookmarkStart w:id="12" w:name="_Toc228022996"/>
       <w:r>
         <w:t xml:space="preserve">2.1 </w:t>
       </w:r>
@@ -6264,7 +6264,7 @@
       <w:pPr>
         <w:pStyle w:val="Heading2"/>
       </w:pPr>
-      <w:bookmarkStart w:id="13" w:name="_Toc227953103"/>
+      <w:bookmarkStart w:id="13" w:name="_Toc228022997"/>
       <w:r>
         <w:t>2.</w:t>
       </w:r>
@@ -6670,7 +6670,7 @@
       <w:pPr>
         <w:pStyle w:val="Heading2"/>
       </w:pPr>
-      <w:bookmarkStart w:id="14" w:name="_Toc227953104"/>
+      <w:bookmarkStart w:id="14" w:name="_Toc228022998"/>
       <w:r>
         <w:t>2.</w:t>
       </w:r>
@@ -7132,7 +7132,7 @@
       <w:pPr>
         <w:pStyle w:val="Heading1"/>
       </w:pPr>
-      <w:bookmarkStart w:id="15" w:name="_Toc227953105"/>
+      <w:bookmarkStart w:id="15" w:name="_Toc228022999"/>
       <w:r>
         <w:t xml:space="preserve">3.0 </w:t>
       </w:r>
@@ -7145,7 +7145,7 @@
       <w:pPr>
         <w:pStyle w:val="Heading2"/>
       </w:pPr>
-      <w:bookmarkStart w:id="16" w:name="_Toc227953106"/>
+      <w:bookmarkStart w:id="16" w:name="_Toc228023000"/>
       <w:r>
         <w:t>3.1 Project Aim</w:t>
       </w:r>
@@ -7275,7 +7275,7 @@
       <w:pPr>
         <w:pStyle w:val="Heading2"/>
       </w:pPr>
-      <w:bookmarkStart w:id="17" w:name="_Toc227953107"/>
+      <w:bookmarkStart w:id="17" w:name="_Toc228023001"/>
       <w:r>
         <w:t xml:space="preserve">3.2 </w:t>
       </w:r>
@@ -8186,7 +8186,7 @@
       <w:pPr>
         <w:pStyle w:val="Heading2"/>
       </w:pPr>
-      <w:bookmarkStart w:id="18" w:name="_Toc227953108"/>
+      <w:bookmarkStart w:id="18" w:name="_Toc228023002"/>
       <w:r>
         <w:t xml:space="preserve">3.3 </w:t>
       </w:r>
@@ -8753,7 +8753,7 @@
       <w:pPr>
         <w:pStyle w:val="Heading1"/>
       </w:pPr>
-      <w:bookmarkStart w:id="19" w:name="_Toc227953109"/>
+      <w:bookmarkStart w:id="19" w:name="_Toc228023003"/>
       <w:r>
         <w:t>4. System Design and Architecture</w:t>
       </w:r>
@@ -8763,7 +8763,7 @@
       <w:pPr>
         <w:pStyle w:val="Heading2"/>
       </w:pPr>
-      <w:bookmarkStart w:id="20" w:name="_Toc227953110"/>
+      <w:bookmarkStart w:id="20" w:name="_Toc228023004"/>
       <w:r>
         <w:t>4</w:t>
       </w:r>
@@ -9860,7 +9860,7 @@
       <w:pPr>
         <w:pStyle w:val="Heading2"/>
       </w:pPr>
-      <w:bookmarkStart w:id="24" w:name="_Toc227953111"/>
+      <w:bookmarkStart w:id="24" w:name="_Toc228023005"/>
       <w:r>
         <w:t>4.2 Justification of Methods</w:t>
       </w:r>
@@ -10214,7 +10214,7 @@
       <w:pPr>
         <w:pStyle w:val="Heading2"/>
       </w:pPr>
-      <w:bookmarkStart w:id="25" w:name="_Toc227953112"/>
+      <w:bookmarkStart w:id="25" w:name="_Toc228023006"/>
       <w:r>
         <w:t>4</w:t>
       </w:r>
@@ -11311,14 +11311,21 @@
       <w:r>
         <w:rPr>
           <w:rFonts w:ascii="Arial" w:hAnsi="Arial" w:cs="Arial"/>
+          <w:noProof/>
           <w:sz w:val="22"/>
           <w:szCs w:val="22"/>
         </w:rPr>
         <w:drawing>
-          <wp:inline distT="0" distB="0" distL="0" distR="0" wp14:anchorId="73972146" wp14:editId="5D00814B">
+          <wp:inline distT="0" distB="0" distL="0" distR="0" wp14:anchorId="73972146" wp14:editId="1D90EE6A">
             <wp:extent cx="5474335" cy="5334635"/>
             <wp:effectExtent l="0" t="0" r="0" b="0"/>
-            <wp:docPr id="76867737" name="Picture 1"/>
+            <wp:docPr id="76867737" name="Picture 1" descr="Top-down screenshot of a video game scene showing a character surrounded by various icons and yellow lines radiating outward, indicating connections or interactions. Key elements include a red hexagonal icon, a blue lightning bolt icon, and a green glowing icon near a rock and a tree, suggesting resource or ability indicators within a dark, forested environment.&#10;&#10;AI-generated content may be incorrect.">
+              <a:extLst xmlns:a="http://schemas.openxmlformats.org/drawingml/2006/main">
+                <a:ext uri="{C183D7F6-B498-43B3-948B-1728B52AA6E4}">
+                  <adec:decorative xmlns:adec="http://schemas.microsoft.com/office/drawing/2017/decorative" val="1"/>
+                </a:ext>
+              </a:extLst>
+            </wp:docPr>
             <wp:cNvGraphicFramePr>
               <a:graphicFrameLocks xmlns:a="http://schemas.openxmlformats.org/drawingml/2006/main" noChangeAspect="1"/>
             </wp:cNvGraphicFramePr>
@@ -11326,7 +11333,13 @@
               <a:graphicData uri="http://schemas.openxmlformats.org/drawingml/2006/picture">
                 <pic:pic xmlns:pic="http://schemas.openxmlformats.org/drawingml/2006/picture">
                   <pic:nvPicPr>
-                    <pic:cNvPr id="76867737" name=""/>
+                    <pic:cNvPr id="76867737" name="Picture 1" descr="Top-down screenshot of a video game scene showing a character surrounded by various icons and yellow lines radiating outward, indicating connections or interactions. Key elements include a red hexagonal icon, a blue lightning bolt icon, and a green glowing icon near a rock and a tree, suggesting resource or ability indicators within a dark, forested environment.&#10;&#10;AI-generated content may be incorrect.">
+                      <a:extLst>
+                        <a:ext uri="{C183D7F6-B498-43B3-948B-1728B52AA6E4}">
+                          <adec:decorative xmlns:adec="http://schemas.microsoft.com/office/drawing/2017/decorative" val="1"/>
+                        </a:ext>
+                      </a:extLst>
+                    </pic:cNvPr>
                     <pic:cNvPicPr/>
                   </pic:nvPicPr>
                   <pic:blipFill>
@@ -11440,12 +11453,21 @@
         </w:rPr>
       </w:pPr>
       <w:r>
+        <w:rPr>
+          <w:noProof/>
+        </w:rPr>
         <w:lastRenderedPageBreak/>
         <w:drawing>
-          <wp:inline distT="0" distB="0" distL="0" distR="0" wp14:anchorId="6CCA4233" wp14:editId="12940D12">
+          <wp:inline distT="0" distB="0" distL="0" distR="0" wp14:anchorId="6CCA4233" wp14:editId="56ABF2DD">
             <wp:extent cx="4581525" cy="3813597"/>
             <wp:effectExtent l="0" t="0" r="0" b="0"/>
-            <wp:docPr id="590513415" name="Picture 1"/>
+            <wp:docPr id="590513415" name="Picture 1">
+              <a:extLst xmlns:a="http://schemas.openxmlformats.org/drawingml/2006/main">
+                <a:ext uri="{C183D7F6-B498-43B3-948B-1728B52AA6E4}">
+                  <adec:decorative xmlns:adec="http://schemas.microsoft.com/office/drawing/2017/decorative" val="1"/>
+                </a:ext>
+              </a:extLst>
+            </wp:docPr>
             <wp:cNvGraphicFramePr>
               <a:graphicFrameLocks xmlns:a="http://schemas.openxmlformats.org/drawingml/2006/main" noChangeAspect="1"/>
             </wp:cNvGraphicFramePr>
@@ -11453,7 +11475,13 @@
               <a:graphicData uri="http://schemas.openxmlformats.org/drawingml/2006/picture">
                 <pic:pic xmlns:pic="http://schemas.openxmlformats.org/drawingml/2006/picture">
                   <pic:nvPicPr>
-                    <pic:cNvPr id="590513415" name=""/>
+                    <pic:cNvPr id="590513415" name="Picture 1">
+                      <a:extLst>
+                        <a:ext uri="{C183D7F6-B498-43B3-948B-1728B52AA6E4}">
+                          <adec:decorative xmlns:adec="http://schemas.microsoft.com/office/drawing/2017/decorative" val="1"/>
+                        </a:ext>
+                      </a:extLst>
+                    </pic:cNvPr>
                     <pic:cNvPicPr/>
                   </pic:nvPicPr>
                   <pic:blipFill>
@@ -11561,11 +11589,20 @@
         <w:jc w:val="center"/>
       </w:pPr>
       <w:r>
+        <w:rPr>
+          <w:noProof/>
+        </w:rPr>
         <w:drawing>
-          <wp:inline distT="0" distB="0" distL="0" distR="0" wp14:anchorId="64CD5847" wp14:editId="58895558">
+          <wp:inline distT="0" distB="0" distL="0" distR="0" wp14:anchorId="64CD5847" wp14:editId="1A9E36B4">
             <wp:extent cx="5474335" cy="3075305"/>
             <wp:effectExtent l="0" t="0" r="0" b="0"/>
-            <wp:docPr id="75390274" name="Picture 1"/>
+            <wp:docPr id="75390274" name="Picture 1">
+              <a:extLst xmlns:a="http://schemas.openxmlformats.org/drawingml/2006/main">
+                <a:ext uri="{C183D7F6-B498-43B3-948B-1728B52AA6E4}">
+                  <adec:decorative xmlns:adec="http://schemas.microsoft.com/office/drawing/2017/decorative" val="1"/>
+                </a:ext>
+              </a:extLst>
+            </wp:docPr>
             <wp:cNvGraphicFramePr>
               <a:graphicFrameLocks xmlns:a="http://schemas.openxmlformats.org/drawingml/2006/main" noChangeAspect="1"/>
             </wp:cNvGraphicFramePr>
@@ -11573,7 +11610,13 @@
               <a:graphicData uri="http://schemas.openxmlformats.org/drawingml/2006/picture">
                 <pic:pic xmlns:pic="http://schemas.openxmlformats.org/drawingml/2006/picture">
                   <pic:nvPicPr>
-                    <pic:cNvPr id="75390274" name=""/>
+                    <pic:cNvPr id="75390274" name="Picture 1">
+                      <a:extLst>
+                        <a:ext uri="{C183D7F6-B498-43B3-948B-1728B52AA6E4}">
+                          <adec:decorative xmlns:adec="http://schemas.microsoft.com/office/drawing/2017/decorative" val="1"/>
+                        </a:ext>
+                      </a:extLst>
+                    </pic:cNvPr>
                     <pic:cNvPicPr/>
                   </pic:nvPicPr>
                   <pic:blipFill>
@@ -11674,7 +11717,7 @@
       <w:pPr>
         <w:pStyle w:val="Heading2"/>
       </w:pPr>
-      <w:bookmarkStart w:id="29" w:name="_Toc227953113"/>
+      <w:bookmarkStart w:id="29" w:name="_Toc228023007"/>
       <w:r>
         <w:lastRenderedPageBreak/>
         <w:t>4</w:t>
@@ -12581,11 +12624,20 @@
         </mc:AlternateContent>
       </w:r>
       <w:r>
+        <w:rPr>
+          <w:noProof/>
+        </w:rPr>
         <w:drawing>
-          <wp:inline distT="0" distB="0" distL="0" distR="0" wp14:anchorId="1A642126" wp14:editId="0DBBC1FD">
+          <wp:inline distT="0" distB="0" distL="0" distR="0" wp14:anchorId="1A642126" wp14:editId="5D973164">
             <wp:extent cx="4071498" cy="4295775"/>
             <wp:effectExtent l="0" t="0" r="5715" b="0"/>
-            <wp:docPr id="347346192" name="Picture 1"/>
+            <wp:docPr id="347346192" name="Picture 1">
+              <a:extLst xmlns:a="http://schemas.openxmlformats.org/drawingml/2006/main">
+                <a:ext uri="{C183D7F6-B498-43B3-948B-1728B52AA6E4}">
+                  <adec:decorative xmlns:adec="http://schemas.microsoft.com/office/drawing/2017/decorative" val="1"/>
+                </a:ext>
+              </a:extLst>
+            </wp:docPr>
             <wp:cNvGraphicFramePr>
               <a:graphicFrameLocks xmlns:a="http://schemas.openxmlformats.org/drawingml/2006/main" noChangeAspect="1"/>
             </wp:cNvGraphicFramePr>
@@ -12593,7 +12645,13 @@
               <a:graphicData uri="http://schemas.openxmlformats.org/drawingml/2006/picture">
                 <pic:pic xmlns:pic="http://schemas.openxmlformats.org/drawingml/2006/picture">
                   <pic:nvPicPr>
-                    <pic:cNvPr id="347346192" name=""/>
+                    <pic:cNvPr id="347346192" name="Picture 1">
+                      <a:extLst>
+                        <a:ext uri="{C183D7F6-B498-43B3-948B-1728B52AA6E4}">
+                          <adec:decorative xmlns:adec="http://schemas.microsoft.com/office/drawing/2017/decorative" val="1"/>
+                        </a:ext>
+                      </a:extLst>
+                    </pic:cNvPr>
                     <pic:cNvPicPr/>
                   </pic:nvPicPr>
                   <pic:blipFill>
@@ -12711,7 +12769,7 @@
       <w:pPr>
         <w:pStyle w:val="Heading2"/>
       </w:pPr>
-      <w:bookmarkStart w:id="31" w:name="_Toc227953114"/>
+      <w:bookmarkStart w:id="31" w:name="_Toc228023008"/>
       <w:r>
         <w:t>4</w:t>
       </w:r>
@@ -13064,47 +13122,6 @@
     </w:p>
     <w:p>
       <w:pPr>
-        <w:rPr>
-          <w:rFonts w:ascii="Arial" w:hAnsi="Arial" w:cs="Arial"/>
-          <w:sz w:val="22"/>
-          <w:szCs w:val="22"/>
-        </w:rPr>
-      </w:pPr>
-      <w:r>
-        <w:rPr>
-          <w:rFonts w:ascii="Arial" w:hAnsi="Arial" w:cs="Arial"/>
-          <w:sz w:val="22"/>
-          <w:szCs w:val="22"/>
-        </w:rPr>
-        <w:t xml:space="preserve">Training was executed via the command line console over a massive 20 million step curriculum. The reward function was heavily shaped to encourage efficient hunting while penalising </w:t>
-      </w:r>
-      <w:r>
-        <w:rPr>
-          <w:rFonts w:ascii="Arial" w:hAnsi="Arial" w:cs="Arial"/>
-          <w:sz w:val="22"/>
-          <w:szCs w:val="22"/>
-        </w:rPr>
-        <w:t>unreliable</w:t>
-      </w:r>
-      <w:r>
-        <w:rPr>
-          <w:rFonts w:ascii="Arial" w:hAnsi="Arial" w:cs="Arial"/>
-          <w:sz w:val="22"/>
-          <w:szCs w:val="22"/>
-        </w:rPr>
-        <w:t xml:space="preserve"> movement</w:t>
-      </w:r>
-      <w:r>
-        <w:rPr>
-          <w:rFonts w:ascii="Arial" w:hAnsi="Arial" w:cs="Arial"/>
-          <w:sz w:val="22"/>
-          <w:szCs w:val="22"/>
-        </w:rPr>
-        <w:t>s:</w:t>
-      </w:r>
-    </w:p>
-    <w:p>
-      <w:pPr>
         <w:pStyle w:val="ListParagraph"/>
         <w:numPr>
           <w:ilvl w:val="0"/>
@@ -13122,23 +13139,15 @@
           <w:sz w:val="22"/>
           <w:szCs w:val="22"/>
         </w:rPr>
-        <w:t xml:space="preserve">Positive rewards: Granted for moving closer to the player, maintain the line of sight and successfully capturing the </w:t>
-      </w:r>
-      <w:r>
-        <w:rPr>
-          <w:rFonts w:ascii="Arial" w:hAnsi="Arial" w:cs="Arial"/>
-          <w:sz w:val="22"/>
-          <w:szCs w:val="22"/>
-        </w:rPr>
-        <w:t>player</w:t>
-      </w:r>
-      <w:r>
-        <w:rPr>
-          <w:rFonts w:ascii="Arial" w:hAnsi="Arial" w:cs="Arial"/>
-          <w:sz w:val="22"/>
-          <w:szCs w:val="22"/>
-        </w:rPr>
-        <w:t>.</w:t>
+        <w:t xml:space="preserve">Network Capacity: </w:t>
+      </w:r>
+      <w:r>
+        <w:rPr>
+          <w:rFonts w:ascii="Arial" w:hAnsi="Arial" w:cs="Arial"/>
+          <w:sz w:val="22"/>
+          <w:szCs w:val="22"/>
+        </w:rPr>
+        <w:t>To handle to complex sensory system, the network capacity had the original 256 hidden units and 2 layers increased to 512 and 3 layers . A memory variable was originally tested but was removed after causing the training process to slow down.</w:t>
       </w:r>
     </w:p>
     <w:p>
@@ -13160,47 +13169,63 @@
           <w:sz w:val="22"/>
           <w:szCs w:val="22"/>
         </w:rPr>
-        <w:t>Negative rewards: Applied for colliding with solid obstacles, losing the scent trail</w:t>
-      </w:r>
-      <w:r>
-        <w:rPr>
-          <w:rFonts w:ascii="Arial" w:hAnsi="Arial" w:cs="Arial"/>
-          <w:sz w:val="22"/>
-          <w:szCs w:val="22"/>
-        </w:rPr>
-        <w:t xml:space="preserve">, </w:t>
-      </w:r>
-      <w:r>
-        <w:rPr>
-          <w:rFonts w:ascii="Arial" w:hAnsi="Arial" w:cs="Arial"/>
-          <w:sz w:val="22"/>
-          <w:szCs w:val="22"/>
-        </w:rPr>
-        <w:t xml:space="preserve">failing to capture the </w:t>
-      </w:r>
-      <w:r>
-        <w:rPr>
-          <w:rFonts w:ascii="Arial" w:hAnsi="Arial" w:cs="Arial"/>
-          <w:sz w:val="22"/>
-          <w:szCs w:val="22"/>
-        </w:rPr>
-        <w:t>player</w:t>
-      </w:r>
-      <w:r>
-        <w:rPr>
-          <w:rFonts w:ascii="Arial" w:hAnsi="Arial" w:cs="Arial"/>
-          <w:sz w:val="22"/>
-          <w:szCs w:val="22"/>
-        </w:rPr>
-        <w:t xml:space="preserve"> within a set time limit</w:t>
-      </w:r>
-      <w:r>
-        <w:rPr>
-          <w:rFonts w:ascii="Arial" w:hAnsi="Arial" w:cs="Arial"/>
-          <w:sz w:val="22"/>
-          <w:szCs w:val="22"/>
-        </w:rPr>
-        <w:t xml:space="preserve"> or exploiting reward loopholes( like spinning to artificially maintain line of sight)</w:t>
+        <w:t>Fixing learning curve: when</w:t>
+      </w:r>
+      <w:r>
+        <w:rPr>
+          <w:rFonts w:ascii="Arial" w:hAnsi="Arial" w:cs="Arial"/>
+          <w:sz w:val="22"/>
+          <w:szCs w:val="22"/>
+        </w:rPr>
+        <w:t xml:space="preserve"> the</w:t>
+      </w:r>
+      <w:r>
+        <w:rPr>
+          <w:rFonts w:ascii="Arial" w:hAnsi="Arial" w:cs="Arial"/>
+          <w:sz w:val="22"/>
+          <w:szCs w:val="22"/>
+        </w:rPr>
+        <w:t xml:space="preserve"> early mean reward plateaued , the buffer size was reduced</w:t>
+      </w:r>
+      <w:r>
+        <w:rPr>
+          <w:rFonts w:ascii="Arial" w:hAnsi="Arial" w:cs="Arial"/>
+          <w:sz w:val="22"/>
+          <w:szCs w:val="22"/>
+        </w:rPr>
+        <w:t xml:space="preserve"> from 81920</w:t>
+      </w:r>
+      <w:r>
+        <w:rPr>
+          <w:rFonts w:ascii="Arial" w:hAnsi="Arial" w:cs="Arial"/>
+          <w:sz w:val="22"/>
+          <w:szCs w:val="22"/>
+        </w:rPr>
+        <w:t xml:space="preserve"> to 20480 and the beta was increased</w:t>
+      </w:r>
+      <w:r>
+        <w:rPr>
+          <w:rFonts w:ascii="Arial" w:hAnsi="Arial" w:cs="Arial"/>
+          <w:sz w:val="22"/>
+          <w:szCs w:val="22"/>
+        </w:rPr>
+        <w:t xml:space="preserve"> from 1.0e-3</w:t>
+      </w:r>
+      <w:r>
+        <w:rPr>
+          <w:rFonts w:ascii="Arial" w:hAnsi="Arial" w:cs="Arial"/>
+          <w:sz w:val="22"/>
+          <w:szCs w:val="22"/>
+        </w:rPr>
+        <w:t xml:space="preserve"> to 5.0e-4. This forced the agent to become more active in exploring the environment</w:t>
+      </w:r>
+      <w:r>
+        <w:rPr>
+          <w:rFonts w:ascii="Arial" w:hAnsi="Arial" w:cs="Arial"/>
+          <w:sz w:val="22"/>
+          <w:szCs w:val="22"/>
+        </w:rPr>
+        <w:t xml:space="preserve"> instead of staying with early bad habits</w:t>
       </w:r>
       <w:r>
         <w:rPr>
@@ -13213,19 +13238,88 @@
     </w:p>
     <w:p>
       <w:pPr>
-        <w:rPr>
-          <w:rFonts w:ascii="Arial" w:hAnsi="Arial" w:cs="Arial"/>
-          <w:sz w:val="22"/>
-          <w:szCs w:val="22"/>
-        </w:rPr>
-      </w:pPr>
-      <w:r>
-        <w:rPr>
-          <w:rFonts w:ascii="Arial" w:hAnsi="Arial" w:cs="Arial"/>
-          <w:sz w:val="22"/>
-          <w:szCs w:val="22"/>
-        </w:rPr>
-        <w:t>Once a training phase stabilised , the resulting neural network was exported as an ONNX ( open neural network exchange) checkpoint and assigned to the in-game agent for real time inference and testing.</w:t>
+        <w:pStyle w:val="ListParagraph"/>
+        <w:numPr>
+          <w:ilvl w:val="0"/>
+          <w:numId w:val="1"/>
+        </w:numPr>
+        <w:rPr>
+          <w:rFonts w:ascii="Arial" w:hAnsi="Arial" w:cs="Arial"/>
+          <w:sz w:val="22"/>
+          <w:szCs w:val="22"/>
+        </w:rPr>
+      </w:pPr>
+      <w:r>
+        <w:rPr>
+          <w:rFonts w:ascii="Arial" w:hAnsi="Arial" w:cs="Arial"/>
+          <w:sz w:val="22"/>
+          <w:szCs w:val="22"/>
+        </w:rPr>
+        <w:t xml:space="preserve">Late-stage stability: As the environment became more complex, the batch size was increased </w:t>
+      </w:r>
+      <w:r>
+        <w:rPr>
+          <w:rFonts w:ascii="Arial" w:hAnsi="Arial" w:cs="Arial"/>
+          <w:sz w:val="22"/>
+          <w:szCs w:val="22"/>
+        </w:rPr>
+        <w:t xml:space="preserve">from 1024 </w:t>
+      </w:r>
+      <w:r>
+        <w:rPr>
+          <w:rFonts w:ascii="Arial" w:hAnsi="Arial" w:cs="Arial"/>
+          <w:sz w:val="22"/>
+          <w:szCs w:val="22"/>
+        </w:rPr>
+        <w:t xml:space="preserve">to 2048 for smoother </w:t>
+      </w:r>
+      <w:r>
+        <w:rPr>
+          <w:rFonts w:ascii="Arial" w:hAnsi="Arial" w:cs="Arial"/>
+          <w:sz w:val="22"/>
+          <w:szCs w:val="22"/>
+        </w:rPr>
+        <w:t>network</w:t>
+      </w:r>
+      <w:r>
+        <w:rPr>
+          <w:rFonts w:ascii="Arial" w:hAnsi="Arial" w:cs="Arial"/>
+          <w:sz w:val="22"/>
+          <w:szCs w:val="22"/>
+        </w:rPr>
+        <w:t xml:space="preserve"> updates. Also, the learning rate was </w:t>
+      </w:r>
+      <w:r>
+        <w:rPr>
+          <w:rFonts w:ascii="Arial" w:hAnsi="Arial" w:cs="Arial"/>
+          <w:sz w:val="22"/>
+          <w:szCs w:val="22"/>
+        </w:rPr>
+        <w:t>lowered</w:t>
+      </w:r>
+      <w:r>
+        <w:rPr>
+          <w:rFonts w:ascii="Arial" w:hAnsi="Arial" w:cs="Arial"/>
+          <w:sz w:val="22"/>
+          <w:szCs w:val="22"/>
+        </w:rPr>
+        <w:t xml:space="preserve"> to 1.5e-4 to secure the agent’s behaviour</w:t>
+      </w:r>
+      <w:r>
+        <w:rPr>
+          <w:rFonts w:ascii="Arial" w:hAnsi="Arial" w:cs="Arial"/>
+          <w:sz w:val="22"/>
+          <w:szCs w:val="22"/>
+        </w:rPr>
+        <w:t xml:space="preserve"> and stop it from forgetting its progress</w:t>
+      </w:r>
+      <w:r>
+        <w:rPr>
+          <w:rFonts w:ascii="Arial" w:hAnsi="Arial" w:cs="Arial"/>
+          <w:sz w:val="22"/>
+          <w:szCs w:val="22"/>
+        </w:rPr>
+        <w:t>.</w:t>
       </w:r>
     </w:p>
     <w:p>
@@ -13236,12 +13330,178 @@
           <w:szCs w:val="22"/>
         </w:rPr>
       </w:pPr>
+      <w:r>
+        <w:rPr>
+          <w:rFonts w:ascii="Arial" w:hAnsi="Arial" w:cs="Arial"/>
+          <w:sz w:val="22"/>
+          <w:szCs w:val="22"/>
+        </w:rPr>
+        <w:t xml:space="preserve">Training was executed via the command line console over a massive 20 million step curriculum. The reward function was heavily shaped to encourage efficient hunting while penalising </w:t>
+      </w:r>
+      <w:r>
+        <w:rPr>
+          <w:rFonts w:ascii="Arial" w:hAnsi="Arial" w:cs="Arial"/>
+          <w:sz w:val="22"/>
+          <w:szCs w:val="22"/>
+        </w:rPr>
+        <w:t>unreliable</w:t>
+      </w:r>
+      <w:r>
+        <w:rPr>
+          <w:rFonts w:ascii="Arial" w:hAnsi="Arial" w:cs="Arial"/>
+          <w:sz w:val="22"/>
+          <w:szCs w:val="22"/>
+        </w:rPr>
+        <w:t xml:space="preserve"> movement</w:t>
+      </w:r>
+      <w:r>
+        <w:rPr>
+          <w:rFonts w:ascii="Arial" w:hAnsi="Arial" w:cs="Arial"/>
+          <w:sz w:val="22"/>
+          <w:szCs w:val="22"/>
+        </w:rPr>
+        <w:t>s:</w:t>
+      </w:r>
     </w:p>
     <w:p>
       <w:pPr>
+        <w:pStyle w:val="ListParagraph"/>
+        <w:numPr>
+          <w:ilvl w:val="0"/>
+          <w:numId w:val="1"/>
+        </w:numPr>
+        <w:rPr>
+          <w:rFonts w:ascii="Arial" w:hAnsi="Arial" w:cs="Arial"/>
+          <w:sz w:val="22"/>
+          <w:szCs w:val="22"/>
+        </w:rPr>
+      </w:pPr>
+      <w:r>
+        <w:rPr>
+          <w:rFonts w:ascii="Arial" w:hAnsi="Arial" w:cs="Arial"/>
+          <w:sz w:val="22"/>
+          <w:szCs w:val="22"/>
+        </w:rPr>
+        <w:t xml:space="preserve">Positive rewards: Granted for moving closer to the player, maintain the line of sight and successfully capturing the </w:t>
+      </w:r>
+      <w:r>
+        <w:rPr>
+          <w:rFonts w:ascii="Arial" w:hAnsi="Arial" w:cs="Arial"/>
+          <w:sz w:val="22"/>
+          <w:szCs w:val="22"/>
+        </w:rPr>
+        <w:t>player</w:t>
+      </w:r>
+      <w:r>
+        <w:rPr>
+          <w:rFonts w:ascii="Arial" w:hAnsi="Arial" w:cs="Arial"/>
+          <w:sz w:val="22"/>
+          <w:szCs w:val="22"/>
+        </w:rPr>
+        <w:t>.</w:t>
+      </w:r>
+    </w:p>
+    <w:p>
+      <w:pPr>
+        <w:pStyle w:val="ListParagraph"/>
+        <w:numPr>
+          <w:ilvl w:val="0"/>
+          <w:numId w:val="1"/>
+        </w:numPr>
+        <w:rPr>
+          <w:rFonts w:ascii="Arial" w:hAnsi="Arial" w:cs="Arial"/>
+          <w:sz w:val="22"/>
+          <w:szCs w:val="22"/>
+        </w:rPr>
+      </w:pPr>
+      <w:r>
+        <w:rPr>
+          <w:rFonts w:ascii="Arial" w:hAnsi="Arial" w:cs="Arial"/>
+          <w:sz w:val="22"/>
+          <w:szCs w:val="22"/>
+        </w:rPr>
+        <w:t>Negative rewards: Applied for colliding with solid obstacles, losing the scent trail</w:t>
+      </w:r>
+      <w:r>
+        <w:rPr>
+          <w:rFonts w:ascii="Arial" w:hAnsi="Arial" w:cs="Arial"/>
+          <w:sz w:val="22"/>
+          <w:szCs w:val="22"/>
+        </w:rPr>
+        <w:t xml:space="preserve">, </w:t>
+      </w:r>
+      <w:r>
+        <w:rPr>
+          <w:rFonts w:ascii="Arial" w:hAnsi="Arial" w:cs="Arial"/>
+          <w:sz w:val="22"/>
+          <w:szCs w:val="22"/>
+        </w:rPr>
+        <w:t xml:space="preserve">failing to capture the </w:t>
+      </w:r>
+      <w:r>
+        <w:rPr>
+          <w:rFonts w:ascii="Arial" w:hAnsi="Arial" w:cs="Arial"/>
+          <w:sz w:val="22"/>
+          <w:szCs w:val="22"/>
+        </w:rPr>
+        <w:t>player</w:t>
+      </w:r>
+      <w:r>
+        <w:rPr>
+          <w:rFonts w:ascii="Arial" w:hAnsi="Arial" w:cs="Arial"/>
+          <w:sz w:val="22"/>
+          <w:szCs w:val="22"/>
+        </w:rPr>
+        <w:t xml:space="preserve"> within a set time limit</w:t>
+      </w:r>
+      <w:r>
+        <w:rPr>
+          <w:rFonts w:ascii="Arial" w:hAnsi="Arial" w:cs="Arial"/>
+          <w:sz w:val="22"/>
+          <w:szCs w:val="22"/>
+        </w:rPr>
+        <w:t xml:space="preserve"> or exploiting reward loopholes( like spinning to artificially maintain line of sight)</w:t>
+      </w:r>
+      <w:r>
+        <w:rPr>
+          <w:rFonts w:ascii="Arial" w:hAnsi="Arial" w:cs="Arial"/>
+          <w:sz w:val="22"/>
+          <w:szCs w:val="22"/>
+        </w:rPr>
+        <w:t>.</w:t>
+      </w:r>
+    </w:p>
+    <w:p>
+      <w:pPr>
+        <w:rPr>
+          <w:rFonts w:ascii="Arial" w:hAnsi="Arial" w:cs="Arial"/>
+          <w:sz w:val="22"/>
+          <w:szCs w:val="22"/>
+        </w:rPr>
+      </w:pPr>
+      <w:r>
+        <w:rPr>
+          <w:rFonts w:ascii="Arial" w:hAnsi="Arial" w:cs="Arial"/>
+          <w:sz w:val="22"/>
+          <w:szCs w:val="22"/>
+        </w:rPr>
+        <w:t>Once a training phase stabilised , the resulting neural network was exported as an ONNX ( open neural network exchange) checkpoint and assigned to the in-game agent for real time inference and testing.</w:t>
+      </w:r>
+    </w:p>
+    <w:p>
+      <w:pPr>
+        <w:rPr>
+          <w:rFonts w:ascii="Arial" w:hAnsi="Arial" w:cs="Arial"/>
+          <w:sz w:val="22"/>
+          <w:szCs w:val="22"/>
+        </w:rPr>
+      </w:pPr>
+    </w:p>
+    <w:p>
+      <w:pPr>
         <w:pStyle w:val="Heading1"/>
       </w:pPr>
-      <w:bookmarkStart w:id="32" w:name="_Toc227953115"/>
+      <w:bookmarkStart w:id="32" w:name="_Toc228023009"/>
       <w:r>
         <w:t>5. Implementation (Unity, ML Agents, YAML)</w:t>
       </w:r>
@@ -13251,7 +13511,7 @@
       <w:pPr>
         <w:pStyle w:val="Heading2"/>
       </w:pPr>
-      <w:bookmarkStart w:id="33" w:name="_Toc227953116"/>
+      <w:bookmarkStart w:id="33" w:name="_Toc228023010"/>
       <w:r>
         <w:t>5</w:t>
       </w:r>
@@ -13383,7 +13643,16 @@
           <w:sz w:val="22"/>
           <w:szCs w:val="22"/>
         </w:rPr>
-        <w:t xml:space="preserve">. The hierarchy evaluates eight distinct states per frame, prioritising immediate strikes if the player is visible, falling back to scent tracking and </w:t>
+        <w:t xml:space="preserve">. The hierarchy evaluates eight distinct states per frame, prioritising immediate strikes if </w:t>
+      </w:r>
+      <w:r>
+        <w:rPr>
+          <w:rFonts w:ascii="Arial" w:hAnsi="Arial" w:cs="Arial"/>
+          <w:sz w:val="22"/>
+          <w:szCs w:val="22"/>
+        </w:rPr>
+        <w:lastRenderedPageBreak/>
+        <w:t xml:space="preserve">the player is visible, falling back to scent tracking and </w:t>
       </w:r>
       <w:r>
         <w:rPr>
@@ -13542,9 +13811,8 @@
       <w:pPr>
         <w:pStyle w:val="Heading2"/>
       </w:pPr>
-      <w:bookmarkStart w:id="34" w:name="_Toc227953117"/>
-      <w:r>
-        <w:lastRenderedPageBreak/>
+      <w:bookmarkStart w:id="34" w:name="_Toc228023011"/>
+      <w:r>
         <w:t>5</w:t>
       </w:r>
       <w:r>
@@ -14120,7 +14388,7 @@
       <w:pPr>
         <w:pStyle w:val="Heading2"/>
       </w:pPr>
-      <w:bookmarkStart w:id="35" w:name="_Toc227953118"/>
+      <w:bookmarkStart w:id="35" w:name="_Toc228023012"/>
       <w:r>
         <w:t>5</w:t>
       </w:r>
@@ -14240,6 +14508,7 @@
           <w:sz w:val="22"/>
           <w:szCs w:val="22"/>
         </w:rPr>
+        <w:lastRenderedPageBreak/>
         <w:t>To integrate this into the final game, the ONNX model was assigned to the Behaviour Parameters component on the Predator prefab. Switching from default/ heuristic mode (training mode) to inference mode meant the agent could now make real time decisions directly inside the Unity engine, completely independent of the Python API. This ensured the agent could run efficiently as a standalone feature of the game without any external lag or connection requirements</w:t>
       </w:r>
       <w:sdt>
@@ -14327,9 +14596,8 @@
       <w:pPr>
         <w:pStyle w:val="Heading1"/>
       </w:pPr>
-      <w:bookmarkStart w:id="36" w:name="_Toc227953119"/>
-      <w:r>
-        <w:lastRenderedPageBreak/>
+      <w:bookmarkStart w:id="36" w:name="_Toc228023013"/>
+      <w:r>
         <w:t>6</w:t>
       </w:r>
       <w:r>
@@ -14344,7 +14612,7 @@
       <w:pPr>
         <w:pStyle w:val="Heading2"/>
       </w:pPr>
-      <w:bookmarkStart w:id="37" w:name="_Toc227953120"/>
+      <w:bookmarkStart w:id="37" w:name="_Toc228023014"/>
       <w:r>
         <w:t>6</w:t>
       </w:r>
@@ -14941,7 +15209,7 @@
       <w:pPr>
         <w:pStyle w:val="Heading1"/>
       </w:pPr>
-      <w:bookmarkStart w:id="38" w:name="_Toc227953121"/>
+      <w:bookmarkStart w:id="38" w:name="_Toc228023015"/>
       <w:r>
         <w:t>7</w:t>
       </w:r>
@@ -15224,10 +15492,16 @@
         </w:rPr>
         <w:lastRenderedPageBreak/>
         <w:drawing>
-          <wp:inline distT="0" distB="0" distL="0" distR="0" wp14:anchorId="4AE85985" wp14:editId="00FDD3CF">
+          <wp:inline distT="0" distB="0" distL="0" distR="0" wp14:anchorId="4AE85985" wp14:editId="43996EF8">
             <wp:extent cx="5715000" cy="3305175"/>
             <wp:effectExtent l="0" t="0" r="0" b="0"/>
-            <wp:docPr id="1283913599" name="Chart 7"/>
+            <wp:docPr id="1283913599" name="Chart 7">
+              <a:extLst xmlns:a="http://schemas.openxmlformats.org/drawingml/2006/main">
+                <a:ext uri="{C183D7F6-B498-43B3-948B-1728B52AA6E4}">
+                  <adec:decorative xmlns:adec="http://schemas.microsoft.com/office/drawing/2017/decorative" val="1"/>
+                </a:ext>
+              </a:extLst>
+            </wp:docPr>
             <wp:cNvGraphicFramePr/>
             <a:graphic xmlns:a="http://schemas.openxmlformats.org/drawingml/2006/main">
               <a:graphicData uri="http://schemas.openxmlformats.org/drawingml/2006/chart">
@@ -16925,7 +17199,7 @@
       <w:pPr>
         <w:pStyle w:val="Heading1"/>
       </w:pPr>
-      <w:bookmarkStart w:id="42" w:name="_Toc227953122"/>
+      <w:bookmarkStart w:id="42" w:name="_Toc228023016"/>
       <w:r>
         <w:t>8</w:t>
       </w:r>
@@ -16941,7 +17215,7 @@
       <w:pPr>
         <w:pStyle w:val="Heading2"/>
       </w:pPr>
-      <w:bookmarkStart w:id="43" w:name="_Toc227953123"/>
+      <w:bookmarkStart w:id="43" w:name="_Toc228023017"/>
       <w:r>
         <w:t>8</w:t>
       </w:r>
@@ -17339,7 +17613,7 @@
       <w:pPr>
         <w:pStyle w:val="Heading1"/>
       </w:pPr>
-      <w:bookmarkStart w:id="46" w:name="_Toc227953124"/>
+      <w:bookmarkStart w:id="46" w:name="_Toc228023018"/>
       <w:r>
         <w:t>9</w:t>
       </w:r>
@@ -17530,7 +17804,7 @@
       <w:pPr>
         <w:pStyle w:val="Heading2"/>
       </w:pPr>
-      <w:bookmarkStart w:id="47" w:name="_Toc227953125"/>
+      <w:bookmarkStart w:id="47" w:name="_Toc228023019"/>
       <w:r>
         <w:t>9</w:t>
       </w:r>
@@ -18314,7 +18588,7 @@
       <w:pPr>
         <w:pStyle w:val="Heading2"/>
       </w:pPr>
-      <w:bookmarkStart w:id="48" w:name="_Toc227953126"/>
+      <w:bookmarkStart w:id="48" w:name="_Toc228023020"/>
       <w:r>
         <w:t>9</w:t>
       </w:r>
@@ -18633,7 +18907,7 @@
       <w:pPr>
         <w:pStyle w:val="Heading1"/>
       </w:pPr>
-      <w:bookmarkStart w:id="49" w:name="_Toc227953127"/>
+      <w:bookmarkStart w:id="49" w:name="_Toc228023021"/>
       <w:r>
         <w:t>10</w:t>
       </w:r>
@@ -18646,7 +18920,7 @@
       <w:pPr>
         <w:pStyle w:val="Heading2"/>
       </w:pPr>
-      <w:bookmarkStart w:id="50" w:name="_Toc227953128"/>
+      <w:bookmarkStart w:id="50" w:name="_Toc228023022"/>
       <w:r>
         <w:t>10</w:t>
       </w:r>
@@ -19015,7 +19289,7 @@
       <w:pPr>
         <w:pStyle w:val="Heading2"/>
       </w:pPr>
-      <w:bookmarkStart w:id="51" w:name="_Toc227953129"/>
+      <w:bookmarkStart w:id="51" w:name="_Toc228023023"/>
       <w:r>
         <w:t>10</w:t>
       </w:r>
@@ -19626,7 +19900,7 @@
         <w:t>.</w:t>
       </w:r>
     </w:p>
-    <w:bookmarkStart w:id="52" w:name="_Toc227953130" w:displacedByCustomXml="next"/>
+    <w:bookmarkStart w:id="52" w:name="_Toc228023024" w:displacedByCustomXml="next"/>
     <w:sdt>
       <w:sdtPr>
         <w:rPr>
@@ -20296,7 +20570,7 @@
       <w:pPr>
         <w:pStyle w:val="Heading2"/>
       </w:pPr>
-      <w:bookmarkStart w:id="53" w:name="_Toc227953131"/>
+      <w:bookmarkStart w:id="53" w:name="_Toc228023025"/>
       <w:r>
         <w:t>List of Assets used in implementation</w:t>
       </w:r>
@@ -20907,7 +21181,7 @@
       <w:pPr>
         <w:pStyle w:val="Heading1"/>
       </w:pPr>
-      <w:bookmarkStart w:id="54" w:name="_Toc227953132"/>
+      <w:bookmarkStart w:id="54" w:name="_Toc228023026"/>
       <w:r>
         <w:t>Appendices</w:t>
       </w:r>
@@ -20971,10 +21245,10 @@
             <v:path o:extrusionok="f" gradientshapeok="t" o:connecttype="rect"/>
             <o:lock v:ext="edit" aspectratio="t"/>
           </v:shapetype>
-          <v:shape id="_x0000_i1190" type="#_x0000_t75" style="width:324pt;height:387.75pt" o:ole="">
+          <v:shape id="_x0000_i1025" type="#_x0000_t75" alt="" style="width:324pt;height:387.75pt" o:ole="">
             <v:imagedata r:id="rId40" o:title=""/>
           </v:shape>
-          <o:OLEObject Type="Embed" ProgID="Word.OpenDocumentText.12" ShapeID="_x0000_i1190" DrawAspect="Content" ObjectID="_1838580243" r:id="rId41"/>
+          <o:OLEObject Type="Embed" ProgID="Word.OpenDocumentText.12" ShapeID="_x0000_i1025" DrawAspect="Content" ObjectID="_1838668152" r:id="rId41"/>
         </w:object>
       </w:r>
     </w:p>
@@ -21107,10 +21381,10 @@
           <w:bCs/>
         </w:rPr>
         <w:object w:dxaOrig="9026" w:dyaOrig="13910" w14:anchorId="19A3EC3C">
-          <v:shape id="_x0000_i1191" type="#_x0000_t75" style="width:195.75pt;height:313.5pt" o:ole="">
+          <v:shape id="_x0000_i1026" type="#_x0000_t75" style="width:195.75pt;height:313.5pt" o:ole="">
             <v:imagedata r:id="rId42" o:title=""/>
           </v:shape>
-          <o:OLEObject Type="Embed" ProgID="Word.OpenDocumentText.12" ShapeID="_x0000_i1191" DrawAspect="Content" ObjectID="_1838580244" r:id="rId43"/>
+          <o:OLEObject Type="Embed" ProgID="Word.OpenDocumentText.12" ShapeID="_x0000_i1026" DrawAspect="Content" ObjectID="_1838668153" r:id="rId43"/>
         </w:object>
       </w:r>
       <w:bookmarkStart w:id="58" w:name="_MON_1838484010"/>
@@ -21122,10 +21396,10 @@
           <w:bCs/>
         </w:rPr>
         <w:object w:dxaOrig="9360" w:dyaOrig="12806" w14:anchorId="314D5B2D">
-          <v:shape id="_x0000_i1192" type="#_x0000_t75" style="width:217.5pt;height:312.75pt" o:ole="">
+          <v:shape id="_x0000_i1027" type="#_x0000_t75" style="width:217.5pt;height:312.75pt" o:ole="">
             <v:imagedata r:id="rId44" o:title=""/>
           </v:shape>
-          <o:OLEObject Type="Embed" ProgID="Word.OpenDocumentText.12" ShapeID="_x0000_i1192" DrawAspect="Content" ObjectID="_1838580245" r:id="rId45"/>
+          <o:OLEObject Type="Embed" ProgID="Word.OpenDocumentText.12" ShapeID="_x0000_i1027" DrawAspect="Content" ObjectID="_1838668154" r:id="rId45"/>
         </w:object>
       </w:r>
     </w:p>
@@ -21249,10 +21523,10 @@
           <w:bCs/>
         </w:rPr>
         <w:object w:dxaOrig="9026" w:dyaOrig="13647" w14:anchorId="1E3D96E0">
-          <v:shape id="_x0000_i1193" type="#_x0000_t75" style="width:215.25pt;height:325.5pt" o:ole="">
+          <v:shape id="_x0000_i1028" type="#_x0000_t75" style="width:215.25pt;height:325.5pt" o:ole="">
             <v:imagedata r:id="rId46" o:title=""/>
           </v:shape>
-          <o:OLEObject Type="Embed" ProgID="Word.OpenDocumentText.12" ShapeID="_x0000_i1193" DrawAspect="Content" ObjectID="_1838580246" r:id="rId47"/>
+          <o:OLEObject Type="Embed" ProgID="Word.OpenDocumentText.12" ShapeID="_x0000_i1028" DrawAspect="Content" ObjectID="_1838668155" r:id="rId47"/>
         </w:object>
       </w:r>
       <w:bookmarkStart w:id="61" w:name="_MON_1838484536"/>
@@ -21264,10 +21538,10 @@
           <w:bCs/>
         </w:rPr>
         <w:object w:dxaOrig="9026" w:dyaOrig="13910" w14:anchorId="08993597">
-          <v:shape id="_x0000_i1194" type="#_x0000_t75" style="width:211.5pt;height:324.75pt" o:ole="">
+          <v:shape id="_x0000_i1029" type="#_x0000_t75" style="width:211.5pt;height:324.75pt" o:ole="">
             <v:imagedata r:id="rId48" o:title=""/>
           </v:shape>
-          <o:OLEObject Type="Embed" ProgID="Word.OpenDocumentText.12" ShapeID="_x0000_i1194" DrawAspect="Content" ObjectID="_1838580247" r:id="rId49"/>
+          <o:OLEObject Type="Embed" ProgID="Word.OpenDocumentText.12" ShapeID="_x0000_i1029" DrawAspect="Content" ObjectID="_1838668156" r:id="rId49"/>
         </w:object>
       </w:r>
     </w:p>

</xml_diff>

<commit_message>
consent forms and report
</commit_message>
<xml_diff>
--- a/Assignements/Tamer_Hussen_S23130437 Project Final Report.docx
+++ b/Assignements/Tamer_Hussen_S23130437 Project Final Report.docx
@@ -2,38 +2,10 @@
 <file path=word/document.xml><?xml version="1.0" encoding="utf-8"?>
 <w:document xmlns:wpc="http://schemas.microsoft.com/office/word/2010/wordprocessingCanvas" xmlns:cx="http://schemas.microsoft.com/office/drawing/2014/chartex" xmlns:cx1="http://schemas.microsoft.com/office/drawing/2015/9/8/chartex" xmlns:cx2="http://schemas.microsoft.com/office/drawing/2015/10/21/chartex" xmlns:cx3="http://schemas.microsoft.com/office/drawing/2016/5/9/chartex" xmlns:cx4="http://schemas.microsoft.com/office/drawing/2016/5/10/chartex" xmlns:cx5="http://schemas.microsoft.com/office/drawing/2016/5/11/chartex" xmlns:cx6="http://schemas.microsoft.com/office/drawing/2016/5/12/chartex" xmlns:cx7="http://schemas.microsoft.com/office/drawing/2016/5/13/chartex" xmlns:cx8="http://schemas.microsoft.com/office/drawing/2016/5/14/chartex" xmlns:mc="http://schemas.openxmlformats.org/markup-compatibility/2006" xmlns:aink="http://schemas.microsoft.com/office/drawing/2016/ink" xmlns:am3d="http://schemas.microsoft.com/office/drawing/2017/model3d" xmlns:o="urn:schemas-microsoft-com:office:office" xmlns:oel="http://schemas.microsoft.com/office/2019/extlst" xmlns:r="http://schemas.openxmlformats.org/officeDocument/2006/relationships" xmlns:m="http://schemas.openxmlformats.org/officeDocument/2006/math" xmlns:v="urn:schemas-microsoft-com:vml" xmlns:wp14="http://schemas.microsoft.com/office/word/2010/wordprocessingDrawing" xmlns:wp="http://schemas.openxmlformats.org/drawingml/2006/wordprocessingDrawing" xmlns:w10="urn:schemas-microsoft-com:office:word" xmlns:w="http://schemas.openxmlformats.org/wordprocessingml/2006/main" xmlns:w14="http://schemas.microsoft.com/office/word/2010/wordml" xmlns:w15="http://schemas.microsoft.com/office/word/2012/wordml" xmlns:w16cex="http://schemas.microsoft.com/office/word/2018/wordml/cex" xmlns:w16cid="http://schemas.microsoft.com/office/word/2016/wordml/cid" xmlns:w16="http://schemas.microsoft.com/office/word/2018/wordml" xmlns:w16du="http://schemas.microsoft.com/office/word/2023/wordml/word16du" xmlns:w16sdtdh="http://schemas.microsoft.com/office/word/2020/wordml/sdtdatahash" xmlns:w16sdtfl="http://schemas.microsoft.com/office/word/2024/wordml/sdtformatlock" xmlns:w16se="http://schemas.microsoft.com/office/word/2015/wordml/symex" xmlns:wpg="http://schemas.microsoft.com/office/word/2010/wordprocessingGroup" xmlns:wpi="http://schemas.microsoft.com/office/word/2010/wordprocessingInk" xmlns:wne="http://schemas.microsoft.com/office/word/2006/wordml" xmlns:wps="http://schemas.microsoft.com/office/word/2010/wordprocessingShape" mc:Ignorable="w14 w15 w16se w16cid w16 w16cex w16sdtdh w16sdtfl w16du wp14">
   <w:body>
-    <w:p>
-      <w:pPr>
-        <w:spacing w:line="360" w:lineRule="auto"/>
-        <w:jc w:val="center"/>
-        <w:rPr>
-          <w:rFonts w:ascii="Arial" w:hAnsi="Arial" w:cs="Arial"/>
-          <w:b/>
-          <w:bCs/>
-          <w:color w:val="000000" w:themeColor="text1"/>
-          <w:sz w:val="40"/>
-          <w:szCs w:val="40"/>
-        </w:rPr>
-      </w:pPr>
-      <w:bookmarkStart w:id="0" w:name="_Toc209044157"/>
-      <w:bookmarkStart w:id="1" w:name="_Toc209049988"/>
-      <w:bookmarkStart w:id="2" w:name="_Toc209050904"/>
-      <w:bookmarkStart w:id="3" w:name="_Toc209031048"/>
-    </w:p>
-    <w:p>
-      <w:pPr>
-        <w:spacing w:line="360" w:lineRule="auto"/>
-        <w:jc w:val="center"/>
-        <w:rPr>
-          <w:rFonts w:ascii="Arial" w:hAnsi="Arial" w:cs="Arial"/>
-          <w:b/>
-          <w:bCs/>
-          <w:color w:val="000000" w:themeColor="text1"/>
-          <w:sz w:val="40"/>
-          <w:szCs w:val="40"/>
-        </w:rPr>
-      </w:pPr>
-    </w:p>
+    <w:bookmarkStart w:id="0" w:name="_Toc209044157"/>
+    <w:bookmarkStart w:id="1" w:name="_Toc209049988"/>
+    <w:bookmarkStart w:id="2" w:name="_Toc209050904"/>
+    <w:bookmarkStart w:id="3" w:name="_Toc209031048"/>
     <w:p>
       <w:pPr>
         <w:spacing w:line="360" w:lineRule="auto"/>
@@ -569,7 +541,6 @@
           <w:sz w:val="32"/>
           <w:szCs w:val="32"/>
         </w:rPr>
-        <w:lastRenderedPageBreak/>
         <w:t>Course:</w:t>
       </w:r>
       <w:r>
@@ -707,7 +678,7 @@
           <w:rFonts w:ascii="Arial" w:hAnsi="Arial" w:cs="Arial"/>
         </w:rPr>
       </w:pPr>
-      <w:bookmarkStart w:id="7" w:name="_Toc228557229"/>
+      <w:bookmarkStart w:id="7" w:name="_Toc228820537"/>
       <w:r>
         <w:rPr>
           <w:rFonts w:ascii="Arial" w:hAnsi="Arial" w:cs="Arial"/>
@@ -999,7 +970,7 @@
             </w:rPr>
             <w:fldChar w:fldCharType="separate"/>
           </w:r>
-          <w:hyperlink w:anchor="_Toc228557229" w:history="1">
+          <w:hyperlink w:anchor="_Toc228820537" w:history="1">
             <w:r>
               <w:rPr>
                 <w:rStyle w:val="Hyperlink"/>
@@ -1027,7 +998,7 @@
                 <w:noProof/>
                 <w:webHidden/>
               </w:rPr>
-              <w:instrText xml:space="preserve"> PAGEREF _Toc228557229 \h </w:instrText>
+              <w:instrText xml:space="preserve"> PAGEREF _Toc228820537 \h </w:instrText>
             </w:r>
             <w:r>
               <w:rPr>
@@ -1070,7 +1041,7 @@
               <w:lang w:eastAsia="en-GB"/>
             </w:rPr>
           </w:pPr>
-          <w:hyperlink w:anchor="_Toc228557230" w:history="1">
+          <w:hyperlink w:anchor="_Toc228820538" w:history="1">
             <w:r>
               <w:rPr>
                 <w:rStyle w:val="Hyperlink"/>
@@ -1098,7 +1069,7 @@
                 <w:noProof/>
                 <w:webHidden/>
               </w:rPr>
-              <w:instrText xml:space="preserve"> PAGEREF _Toc228557230 \h </w:instrText>
+              <w:instrText xml:space="preserve"> PAGEREF _Toc228820538 \h </w:instrText>
             </w:r>
             <w:r>
               <w:rPr>
@@ -1141,7 +1112,7 @@
               <w:lang w:eastAsia="en-GB"/>
             </w:rPr>
           </w:pPr>
-          <w:hyperlink w:anchor="_Toc228557231" w:history="1">
+          <w:hyperlink w:anchor="_Toc228820539" w:history="1">
             <w:r>
               <w:rPr>
                 <w:rStyle w:val="Hyperlink"/>
@@ -1169,7 +1140,7 @@
                 <w:noProof/>
                 <w:webHidden/>
               </w:rPr>
-              <w:instrText xml:space="preserve"> PAGEREF _Toc228557231 \h </w:instrText>
+              <w:instrText xml:space="preserve"> PAGEREF _Toc228820539 \h </w:instrText>
             </w:r>
             <w:r>
               <w:rPr>
@@ -1212,7 +1183,7 @@
               <w:lang w:eastAsia="en-GB"/>
             </w:rPr>
           </w:pPr>
-          <w:hyperlink w:anchor="_Toc228557232" w:history="1">
+          <w:hyperlink w:anchor="_Toc228820540" w:history="1">
             <w:r>
               <w:rPr>
                 <w:rStyle w:val="Hyperlink"/>
@@ -1240,7 +1211,7 @@
                 <w:noProof/>
                 <w:webHidden/>
               </w:rPr>
-              <w:instrText xml:space="preserve"> PAGEREF _Toc228557232 \h </w:instrText>
+              <w:instrText xml:space="preserve"> PAGEREF _Toc228820540 \h </w:instrText>
             </w:r>
             <w:r>
               <w:rPr>
@@ -1283,7 +1254,7 @@
               <w:lang w:eastAsia="en-GB"/>
             </w:rPr>
           </w:pPr>
-          <w:hyperlink w:anchor="_Toc228557233" w:history="1">
+          <w:hyperlink w:anchor="_Toc228820541" w:history="1">
             <w:r>
               <w:rPr>
                 <w:rStyle w:val="Hyperlink"/>
@@ -1311,7 +1282,7 @@
                 <w:noProof/>
                 <w:webHidden/>
               </w:rPr>
-              <w:instrText xml:space="preserve"> PAGEREF _Toc228557233 \h </w:instrText>
+              <w:instrText xml:space="preserve"> PAGEREF _Toc228820541 \h </w:instrText>
             </w:r>
             <w:r>
               <w:rPr>
@@ -1354,7 +1325,7 @@
               <w:lang w:eastAsia="en-GB"/>
             </w:rPr>
           </w:pPr>
-          <w:hyperlink w:anchor="_Toc228557234" w:history="1">
+          <w:hyperlink w:anchor="_Toc228820542" w:history="1">
             <w:r>
               <w:rPr>
                 <w:rStyle w:val="Hyperlink"/>
@@ -1382,7 +1353,7 @@
                 <w:noProof/>
                 <w:webHidden/>
               </w:rPr>
-              <w:instrText xml:space="preserve"> PAGEREF _Toc228557234 \h </w:instrText>
+              <w:instrText xml:space="preserve"> PAGEREF _Toc228820542 \h </w:instrText>
             </w:r>
             <w:r>
               <w:rPr>
@@ -1425,7 +1396,7 @@
               <w:lang w:eastAsia="en-GB"/>
             </w:rPr>
           </w:pPr>
-          <w:hyperlink w:anchor="_Toc228557235" w:history="1">
+          <w:hyperlink w:anchor="_Toc228820543" w:history="1">
             <w:r>
               <w:rPr>
                 <w:rStyle w:val="Hyperlink"/>
@@ -1453,7 +1424,7 @@
                 <w:noProof/>
                 <w:webHidden/>
               </w:rPr>
-              <w:instrText xml:space="preserve"> PAGEREF _Toc228557235 \h </w:instrText>
+              <w:instrText xml:space="preserve"> PAGEREF _Toc228820543 \h </w:instrText>
             </w:r>
             <w:r>
               <w:rPr>
@@ -1496,7 +1467,7 @@
               <w:lang w:eastAsia="en-GB"/>
             </w:rPr>
           </w:pPr>
-          <w:hyperlink w:anchor="_Toc228557236" w:history="1">
+          <w:hyperlink w:anchor="_Toc228820544" w:history="1">
             <w:r>
               <w:rPr>
                 <w:rStyle w:val="Hyperlink"/>
@@ -1524,7 +1495,7 @@
                 <w:noProof/>
                 <w:webHidden/>
               </w:rPr>
-              <w:instrText xml:space="preserve"> PAGEREF _Toc228557236 \h </w:instrText>
+              <w:instrText xml:space="preserve"> PAGEREF _Toc228820544 \h </w:instrText>
             </w:r>
             <w:r>
               <w:rPr>
@@ -1567,7 +1538,7 @@
               <w:lang w:eastAsia="en-GB"/>
             </w:rPr>
           </w:pPr>
-          <w:hyperlink w:anchor="_Toc228557237" w:history="1">
+          <w:hyperlink w:anchor="_Toc228820545" w:history="1">
             <w:r>
               <w:rPr>
                 <w:rStyle w:val="Hyperlink"/>
@@ -1595,7 +1566,7 @@
                 <w:noProof/>
                 <w:webHidden/>
               </w:rPr>
-              <w:instrText xml:space="preserve"> PAGEREF _Toc228557237 \h </w:instrText>
+              <w:instrText xml:space="preserve"> PAGEREF _Toc228820545 \h </w:instrText>
             </w:r>
             <w:r>
               <w:rPr>
@@ -1638,7 +1609,7 @@
               <w:lang w:eastAsia="en-GB"/>
             </w:rPr>
           </w:pPr>
-          <w:hyperlink w:anchor="_Toc228557238" w:history="1">
+          <w:hyperlink w:anchor="_Toc228820546" w:history="1">
             <w:r>
               <w:rPr>
                 <w:rStyle w:val="Hyperlink"/>
@@ -1666,7 +1637,7 @@
                 <w:noProof/>
                 <w:webHidden/>
               </w:rPr>
-              <w:instrText xml:space="preserve"> PAGEREF _Toc228557238 \h </w:instrText>
+              <w:instrText xml:space="preserve"> PAGEREF _Toc228820546 \h </w:instrText>
             </w:r>
             <w:r>
               <w:rPr>
@@ -1709,7 +1680,7 @@
               <w:lang w:eastAsia="en-GB"/>
             </w:rPr>
           </w:pPr>
-          <w:hyperlink w:anchor="_Toc228557239" w:history="1">
+          <w:hyperlink w:anchor="_Toc228820547" w:history="1">
             <w:r>
               <w:rPr>
                 <w:rStyle w:val="Hyperlink"/>
@@ -1737,7 +1708,7 @@
                 <w:noProof/>
                 <w:webHidden/>
               </w:rPr>
-              <w:instrText xml:space="preserve"> PAGEREF _Toc228557239 \h </w:instrText>
+              <w:instrText xml:space="preserve"> PAGEREF _Toc228820547 \h </w:instrText>
             </w:r>
             <w:r>
               <w:rPr>
@@ -1780,7 +1751,7 @@
               <w:lang w:eastAsia="en-GB"/>
             </w:rPr>
           </w:pPr>
-          <w:hyperlink w:anchor="_Toc228557240" w:history="1">
+          <w:hyperlink w:anchor="_Toc228820548" w:history="1">
             <w:r>
               <w:rPr>
                 <w:rStyle w:val="Hyperlink"/>
@@ -1808,7 +1779,7 @@
                 <w:noProof/>
                 <w:webHidden/>
               </w:rPr>
-              <w:instrText xml:space="preserve"> PAGEREF _Toc228557240 \h </w:instrText>
+              <w:instrText xml:space="preserve"> PAGEREF _Toc228820548 \h </w:instrText>
             </w:r>
             <w:r>
               <w:rPr>
@@ -1851,7 +1822,7 @@
               <w:lang w:eastAsia="en-GB"/>
             </w:rPr>
           </w:pPr>
-          <w:hyperlink w:anchor="_Toc228557241" w:history="1">
+          <w:hyperlink w:anchor="_Toc228820549" w:history="1">
             <w:r>
               <w:rPr>
                 <w:rStyle w:val="Hyperlink"/>
@@ -1879,7 +1850,7 @@
                 <w:noProof/>
                 <w:webHidden/>
               </w:rPr>
-              <w:instrText xml:space="preserve"> PAGEREF _Toc228557241 \h </w:instrText>
+              <w:instrText xml:space="preserve"> PAGEREF _Toc228820549 \h </w:instrText>
             </w:r>
             <w:r>
               <w:rPr>
@@ -1922,7 +1893,7 @@
               <w:lang w:eastAsia="en-GB"/>
             </w:rPr>
           </w:pPr>
-          <w:hyperlink w:anchor="_Toc228557242" w:history="1">
+          <w:hyperlink w:anchor="_Toc228820550" w:history="1">
             <w:r>
               <w:rPr>
                 <w:rStyle w:val="Hyperlink"/>
@@ -1950,7 +1921,7 @@
                 <w:noProof/>
                 <w:webHidden/>
               </w:rPr>
-              <w:instrText xml:space="preserve"> PAGEREF _Toc228557242 \h </w:instrText>
+              <w:instrText xml:space="preserve"> PAGEREF _Toc228820550 \h </w:instrText>
             </w:r>
             <w:r>
               <w:rPr>
@@ -1993,7 +1964,7 @@
               <w:lang w:eastAsia="en-GB"/>
             </w:rPr>
           </w:pPr>
-          <w:hyperlink w:anchor="_Toc228557243" w:history="1">
+          <w:hyperlink w:anchor="_Toc228820551" w:history="1">
             <w:r>
               <w:rPr>
                 <w:rStyle w:val="Hyperlink"/>
@@ -2021,7 +1992,7 @@
                 <w:noProof/>
                 <w:webHidden/>
               </w:rPr>
-              <w:instrText xml:space="preserve"> PAGEREF _Toc228557243 \h </w:instrText>
+              <w:instrText xml:space="preserve"> PAGEREF _Toc228820551 \h </w:instrText>
             </w:r>
             <w:r>
               <w:rPr>
@@ -2064,7 +2035,7 @@
               <w:lang w:eastAsia="en-GB"/>
             </w:rPr>
           </w:pPr>
-          <w:hyperlink w:anchor="_Toc228557244" w:history="1">
+          <w:hyperlink w:anchor="_Toc228820552" w:history="1">
             <w:r>
               <w:rPr>
                 <w:rStyle w:val="Hyperlink"/>
@@ -2092,7 +2063,7 @@
                 <w:noProof/>
                 <w:webHidden/>
               </w:rPr>
-              <w:instrText xml:space="preserve"> PAGEREF _Toc228557244 \h </w:instrText>
+              <w:instrText xml:space="preserve"> PAGEREF _Toc228820552 \h </w:instrText>
             </w:r>
             <w:r>
               <w:rPr>
@@ -2135,7 +2106,7 @@
               <w:lang w:eastAsia="en-GB"/>
             </w:rPr>
           </w:pPr>
-          <w:hyperlink w:anchor="_Toc228557245" w:history="1">
+          <w:hyperlink w:anchor="_Toc228820553" w:history="1">
             <w:r>
               <w:rPr>
                 <w:rStyle w:val="Hyperlink"/>
@@ -2163,7 +2134,7 @@
                 <w:noProof/>
                 <w:webHidden/>
               </w:rPr>
-              <w:instrText xml:space="preserve"> PAGEREF _Toc228557245 \h </w:instrText>
+              <w:instrText xml:space="preserve"> PAGEREF _Toc228820553 \h </w:instrText>
             </w:r>
             <w:r>
               <w:rPr>
@@ -2206,7 +2177,7 @@
               <w:lang w:eastAsia="en-GB"/>
             </w:rPr>
           </w:pPr>
-          <w:hyperlink w:anchor="_Toc228557246" w:history="1">
+          <w:hyperlink w:anchor="_Toc228820554" w:history="1">
             <w:r>
               <w:rPr>
                 <w:rStyle w:val="Hyperlink"/>
@@ -2234,7 +2205,7 @@
                 <w:noProof/>
                 <w:webHidden/>
               </w:rPr>
-              <w:instrText xml:space="preserve"> PAGEREF _Toc228557246 \h </w:instrText>
+              <w:instrText xml:space="preserve"> PAGEREF _Toc228820554 \h </w:instrText>
             </w:r>
             <w:r>
               <w:rPr>
@@ -2277,7 +2248,7 @@
               <w:lang w:eastAsia="en-GB"/>
             </w:rPr>
           </w:pPr>
-          <w:hyperlink w:anchor="_Toc228557247" w:history="1">
+          <w:hyperlink w:anchor="_Toc228820555" w:history="1">
             <w:r>
               <w:rPr>
                 <w:rStyle w:val="Hyperlink"/>
@@ -2305,7 +2276,7 @@
                 <w:noProof/>
                 <w:webHidden/>
               </w:rPr>
-              <w:instrText xml:space="preserve"> PAGEREF _Toc228557247 \h </w:instrText>
+              <w:instrText xml:space="preserve"> PAGEREF _Toc228820555 \h </w:instrText>
             </w:r>
             <w:r>
               <w:rPr>
@@ -2348,7 +2319,7 @@
               <w:lang w:eastAsia="en-GB"/>
             </w:rPr>
           </w:pPr>
-          <w:hyperlink w:anchor="_Toc228557248" w:history="1">
+          <w:hyperlink w:anchor="_Toc228820556" w:history="1">
             <w:r>
               <w:rPr>
                 <w:rStyle w:val="Hyperlink"/>
@@ -2376,7 +2347,7 @@
                 <w:noProof/>
                 <w:webHidden/>
               </w:rPr>
-              <w:instrText xml:space="preserve"> PAGEREF _Toc228557248 \h </w:instrText>
+              <w:instrText xml:space="preserve"> PAGEREF _Toc228820556 \h </w:instrText>
             </w:r>
             <w:r>
               <w:rPr>
@@ -2419,7 +2390,7 @@
               <w:lang w:eastAsia="en-GB"/>
             </w:rPr>
           </w:pPr>
-          <w:hyperlink w:anchor="_Toc228557249" w:history="1">
+          <w:hyperlink w:anchor="_Toc228820557" w:history="1">
             <w:r>
               <w:rPr>
                 <w:rStyle w:val="Hyperlink"/>
@@ -2447,7 +2418,7 @@
                 <w:noProof/>
                 <w:webHidden/>
               </w:rPr>
-              <w:instrText xml:space="preserve"> PAGEREF _Toc228557249 \h </w:instrText>
+              <w:instrText xml:space="preserve"> PAGEREF _Toc228820557 \h </w:instrText>
             </w:r>
             <w:r>
               <w:rPr>
@@ -2490,7 +2461,7 @@
               <w:lang w:eastAsia="en-GB"/>
             </w:rPr>
           </w:pPr>
-          <w:hyperlink w:anchor="_Toc228557250" w:history="1">
+          <w:hyperlink w:anchor="_Toc228820558" w:history="1">
             <w:r>
               <w:rPr>
                 <w:rStyle w:val="Hyperlink"/>
@@ -2518,7 +2489,7 @@
                 <w:noProof/>
                 <w:webHidden/>
               </w:rPr>
-              <w:instrText xml:space="preserve"> PAGEREF _Toc228557250 \h </w:instrText>
+              <w:instrText xml:space="preserve"> PAGEREF _Toc228820558 \h </w:instrText>
             </w:r>
             <w:r>
               <w:rPr>
@@ -2561,7 +2532,7 @@
               <w:lang w:eastAsia="en-GB"/>
             </w:rPr>
           </w:pPr>
-          <w:hyperlink w:anchor="_Toc228557251" w:history="1">
+          <w:hyperlink w:anchor="_Toc228820559" w:history="1">
             <w:r>
               <w:rPr>
                 <w:rStyle w:val="Hyperlink"/>
@@ -2589,7 +2560,7 @@
                 <w:noProof/>
                 <w:webHidden/>
               </w:rPr>
-              <w:instrText xml:space="preserve"> PAGEREF _Toc228557251 \h </w:instrText>
+              <w:instrText xml:space="preserve"> PAGEREF _Toc228820559 \h </w:instrText>
             </w:r>
             <w:r>
               <w:rPr>
@@ -2632,7 +2603,7 @@
               <w:lang w:eastAsia="en-GB"/>
             </w:rPr>
           </w:pPr>
-          <w:hyperlink w:anchor="_Toc228557252" w:history="1">
+          <w:hyperlink w:anchor="_Toc228820560" w:history="1">
             <w:r>
               <w:rPr>
                 <w:rStyle w:val="Hyperlink"/>
@@ -2660,7 +2631,7 @@
                 <w:noProof/>
                 <w:webHidden/>
               </w:rPr>
-              <w:instrText xml:space="preserve"> PAGEREF _Toc228557252 \h </w:instrText>
+              <w:instrText xml:space="preserve"> PAGEREF _Toc228820560 \h </w:instrText>
             </w:r>
             <w:r>
               <w:rPr>
@@ -2680,7 +2651,7 @@
                 <w:noProof/>
                 <w:webHidden/>
               </w:rPr>
-              <w:t>22</w:t>
+              <w:t>23</w:t>
             </w:r>
             <w:r>
               <w:rPr>
@@ -2703,7 +2674,7 @@
               <w:lang w:eastAsia="en-GB"/>
             </w:rPr>
           </w:pPr>
-          <w:hyperlink w:anchor="_Toc228557253" w:history="1">
+          <w:hyperlink w:anchor="_Toc228820561" w:history="1">
             <w:r>
               <w:rPr>
                 <w:rStyle w:val="Hyperlink"/>
@@ -2731,7 +2702,7 @@
                 <w:noProof/>
                 <w:webHidden/>
               </w:rPr>
-              <w:instrText xml:space="preserve"> PAGEREF _Toc228557253 \h </w:instrText>
+              <w:instrText xml:space="preserve"> PAGEREF _Toc228820561 \h </w:instrText>
             </w:r>
             <w:r>
               <w:rPr>
@@ -2751,7 +2722,7 @@
                 <w:noProof/>
                 <w:webHidden/>
               </w:rPr>
-              <w:t>22</w:t>
+              <w:t>23</w:t>
             </w:r>
             <w:r>
               <w:rPr>
@@ -2774,7 +2745,7 @@
               <w:lang w:eastAsia="en-GB"/>
             </w:rPr>
           </w:pPr>
-          <w:hyperlink w:anchor="_Toc228557254" w:history="1">
+          <w:hyperlink w:anchor="_Toc228820562" w:history="1">
             <w:r>
               <w:rPr>
                 <w:rStyle w:val="Hyperlink"/>
@@ -2802,7 +2773,7 @@
                 <w:noProof/>
                 <w:webHidden/>
               </w:rPr>
-              <w:instrText xml:space="preserve"> PAGEREF _Toc228557254 \h </w:instrText>
+              <w:instrText xml:space="preserve"> PAGEREF _Toc228820562 \h </w:instrText>
             </w:r>
             <w:r>
               <w:rPr>
@@ -2845,7 +2816,7 @@
               <w:lang w:eastAsia="en-GB"/>
             </w:rPr>
           </w:pPr>
-          <w:hyperlink w:anchor="_Toc228557255" w:history="1">
+          <w:hyperlink w:anchor="_Toc228820563" w:history="1">
             <w:r>
               <w:rPr>
                 <w:rStyle w:val="Hyperlink"/>
@@ -2873,7 +2844,7 @@
                 <w:noProof/>
                 <w:webHidden/>
               </w:rPr>
-              <w:instrText xml:space="preserve"> PAGEREF _Toc228557255 \h </w:instrText>
+              <w:instrText xml:space="preserve"> PAGEREF _Toc228820563 \h </w:instrText>
             </w:r>
             <w:r>
               <w:rPr>
@@ -2916,7 +2887,7 @@
               <w:lang w:eastAsia="en-GB"/>
             </w:rPr>
           </w:pPr>
-          <w:hyperlink w:anchor="_Toc228557256" w:history="1">
+          <w:hyperlink w:anchor="_Toc228820564" w:history="1">
             <w:r>
               <w:rPr>
                 <w:rStyle w:val="Hyperlink"/>
@@ -2944,7 +2915,7 @@
                 <w:noProof/>
                 <w:webHidden/>
               </w:rPr>
-              <w:instrText xml:space="preserve"> PAGEREF _Toc228557256 \h </w:instrText>
+              <w:instrText xml:space="preserve"> PAGEREF _Toc228820564 \h </w:instrText>
             </w:r>
             <w:r>
               <w:rPr>
@@ -2987,7 +2958,7 @@
               <w:lang w:eastAsia="en-GB"/>
             </w:rPr>
           </w:pPr>
-          <w:hyperlink w:anchor="_Toc228557257" w:history="1">
+          <w:hyperlink w:anchor="_Toc228820565" w:history="1">
             <w:r>
               <w:rPr>
                 <w:rStyle w:val="Hyperlink"/>
@@ -3015,7 +2986,7 @@
                 <w:noProof/>
                 <w:webHidden/>
               </w:rPr>
-              <w:instrText xml:space="preserve"> PAGEREF _Toc228557257 \h </w:instrText>
+              <w:instrText xml:space="preserve"> PAGEREF _Toc228820565 \h </w:instrText>
             </w:r>
             <w:r>
               <w:rPr>
@@ -3058,7 +3029,7 @@
               <w:lang w:eastAsia="en-GB"/>
             </w:rPr>
           </w:pPr>
-          <w:hyperlink w:anchor="_Toc228557258" w:history="1">
+          <w:hyperlink w:anchor="_Toc228820566" w:history="1">
             <w:r>
               <w:rPr>
                 <w:rStyle w:val="Hyperlink"/>
@@ -3086,7 +3057,7 @@
                 <w:noProof/>
                 <w:webHidden/>
               </w:rPr>
-              <w:instrText xml:space="preserve"> PAGEREF _Toc228557258 \h </w:instrText>
+              <w:instrText xml:space="preserve"> PAGEREF _Toc228820566 \h </w:instrText>
             </w:r>
             <w:r>
               <w:rPr>
@@ -3129,7 +3100,7 @@
               <w:lang w:eastAsia="en-GB"/>
             </w:rPr>
           </w:pPr>
-          <w:hyperlink w:anchor="_Toc228557259" w:history="1">
+          <w:hyperlink w:anchor="_Toc228820567" w:history="1">
             <w:r>
               <w:rPr>
                 <w:rStyle w:val="Hyperlink"/>
@@ -3157,7 +3128,7 @@
                 <w:noProof/>
                 <w:webHidden/>
               </w:rPr>
-              <w:instrText xml:space="preserve"> PAGEREF _Toc228557259 \h </w:instrText>
+              <w:instrText xml:space="preserve"> PAGEREF _Toc228820567 \h </w:instrText>
             </w:r>
             <w:r>
               <w:rPr>
@@ -3177,7 +3148,7 @@
                 <w:noProof/>
                 <w:webHidden/>
               </w:rPr>
-              <w:t>30</w:t>
+              <w:t>31</w:t>
             </w:r>
             <w:r>
               <w:rPr>
@@ -3200,7 +3171,7 @@
               <w:lang w:eastAsia="en-GB"/>
             </w:rPr>
           </w:pPr>
-          <w:hyperlink w:anchor="_Toc228557260" w:history="1">
+          <w:hyperlink w:anchor="_Toc228820568" w:history="1">
             <w:r>
               <w:rPr>
                 <w:rStyle w:val="Hyperlink"/>
@@ -3228,7 +3199,7 @@
                 <w:noProof/>
                 <w:webHidden/>
               </w:rPr>
-              <w:instrText xml:space="preserve"> PAGEREF _Toc228557260 \h </w:instrText>
+              <w:instrText xml:space="preserve"> PAGEREF _Toc228820568 \h </w:instrText>
             </w:r>
             <w:r>
               <w:rPr>
@@ -3248,7 +3219,7 @@
                 <w:noProof/>
                 <w:webHidden/>
               </w:rPr>
-              <w:t>30</w:t>
+              <w:t>31</w:t>
             </w:r>
             <w:r>
               <w:rPr>
@@ -3271,7 +3242,7 @@
               <w:lang w:eastAsia="en-GB"/>
             </w:rPr>
           </w:pPr>
-          <w:hyperlink w:anchor="_Toc228557261" w:history="1">
+          <w:hyperlink w:anchor="_Toc228820569" w:history="1">
             <w:r>
               <w:rPr>
                 <w:rStyle w:val="Hyperlink"/>
@@ -3299,7 +3270,7 @@
                 <w:noProof/>
                 <w:webHidden/>
               </w:rPr>
-              <w:instrText xml:space="preserve"> PAGEREF _Toc228557261 \h </w:instrText>
+              <w:instrText xml:space="preserve"> PAGEREF _Toc228820569 \h </w:instrText>
             </w:r>
             <w:r>
               <w:rPr>
@@ -3319,7 +3290,7 @@
                 <w:noProof/>
                 <w:webHidden/>
               </w:rPr>
-              <w:t>32</w:t>
+              <w:t>33</w:t>
             </w:r>
             <w:r>
               <w:rPr>
@@ -3342,7 +3313,7 @@
               <w:lang w:eastAsia="en-GB"/>
             </w:rPr>
           </w:pPr>
-          <w:hyperlink w:anchor="_Toc228557262" w:history="1">
+          <w:hyperlink w:anchor="_Toc228820570" w:history="1">
             <w:r>
               <w:rPr>
                 <w:rStyle w:val="Hyperlink"/>
@@ -3370,7 +3341,7 @@
                 <w:noProof/>
                 <w:webHidden/>
               </w:rPr>
-              <w:instrText xml:space="preserve"> PAGEREF _Toc228557262 \h </w:instrText>
+              <w:instrText xml:space="preserve"> PAGEREF _Toc228820570 \h </w:instrText>
             </w:r>
             <w:r>
               <w:rPr>
@@ -3390,7 +3361,7 @@
                 <w:noProof/>
                 <w:webHidden/>
               </w:rPr>
-              <w:t>33</w:t>
+              <w:t>34</w:t>
             </w:r>
             <w:r>
               <w:rPr>
@@ -3413,7 +3384,7 @@
               <w:lang w:eastAsia="en-GB"/>
             </w:rPr>
           </w:pPr>
-          <w:hyperlink w:anchor="_Toc228557263" w:history="1">
+          <w:hyperlink w:anchor="_Toc228820571" w:history="1">
             <w:r>
               <w:rPr>
                 <w:rStyle w:val="Hyperlink"/>
@@ -3441,7 +3412,7 @@
                 <w:noProof/>
                 <w:webHidden/>
               </w:rPr>
-              <w:instrText xml:space="preserve"> PAGEREF _Toc228557263 \h </w:instrText>
+              <w:instrText xml:space="preserve"> PAGEREF _Toc228820571 \h </w:instrText>
             </w:r>
             <w:r>
               <w:rPr>
@@ -3461,7 +3432,7 @@
                 <w:noProof/>
                 <w:webHidden/>
               </w:rPr>
-              <w:t>33</w:t>
+              <w:t>34</w:t>
             </w:r>
             <w:r>
               <w:rPr>
@@ -3484,7 +3455,7 @@
               <w:lang w:eastAsia="en-GB"/>
             </w:rPr>
           </w:pPr>
-          <w:hyperlink w:anchor="_Toc228557264" w:history="1">
+          <w:hyperlink w:anchor="_Toc228820572" w:history="1">
             <w:r>
               <w:rPr>
                 <w:rStyle w:val="Hyperlink"/>
@@ -3512,7 +3483,7 @@
                 <w:noProof/>
                 <w:webHidden/>
               </w:rPr>
-              <w:instrText xml:space="preserve"> PAGEREF _Toc228557264 \h </w:instrText>
+              <w:instrText xml:space="preserve"> PAGEREF _Toc228820572 \h </w:instrText>
             </w:r>
             <w:r>
               <w:rPr>
@@ -3532,7 +3503,7 @@
                 <w:noProof/>
                 <w:webHidden/>
               </w:rPr>
-              <w:t>34</w:t>
+              <w:t>36</w:t>
             </w:r>
             <w:r>
               <w:rPr>
@@ -3555,7 +3526,7 @@
               <w:lang w:eastAsia="en-GB"/>
             </w:rPr>
           </w:pPr>
-          <w:hyperlink w:anchor="_Toc228557265" w:history="1">
+          <w:hyperlink w:anchor="_Toc228820573" w:history="1">
             <w:r>
               <w:rPr>
                 <w:rStyle w:val="Hyperlink"/>
@@ -3583,7 +3554,7 @@
                 <w:noProof/>
                 <w:webHidden/>
               </w:rPr>
-              <w:instrText xml:space="preserve"> PAGEREF _Toc228557265 \h </w:instrText>
+              <w:instrText xml:space="preserve"> PAGEREF _Toc228820573 \h </w:instrText>
             </w:r>
             <w:r>
               <w:rPr>
@@ -3603,7 +3574,7 @@
                 <w:noProof/>
                 <w:webHidden/>
               </w:rPr>
-              <w:t>34</w:t>
+              <w:t>36</w:t>
             </w:r>
             <w:r>
               <w:rPr>
@@ -3626,7 +3597,7 @@
               <w:lang w:eastAsia="en-GB"/>
             </w:rPr>
           </w:pPr>
-          <w:hyperlink w:anchor="_Toc228557266" w:history="1">
+          <w:hyperlink w:anchor="_Toc228820574" w:history="1">
             <w:r>
               <w:rPr>
                 <w:rStyle w:val="Hyperlink"/>
@@ -3654,7 +3625,7 @@
                 <w:noProof/>
                 <w:webHidden/>
               </w:rPr>
-              <w:instrText xml:space="preserve"> PAGEREF _Toc228557266 \h </w:instrText>
+              <w:instrText xml:space="preserve"> PAGEREF _Toc228820574 \h </w:instrText>
             </w:r>
             <w:r>
               <w:rPr>
@@ -3674,7 +3645,7 @@
                 <w:noProof/>
                 <w:webHidden/>
               </w:rPr>
-              <w:t>34</w:t>
+              <w:t>36</w:t>
             </w:r>
             <w:r>
               <w:rPr>
@@ -3697,7 +3668,7 @@
               <w:lang w:eastAsia="en-GB"/>
             </w:rPr>
           </w:pPr>
-          <w:hyperlink w:anchor="_Toc228557267" w:history="1">
+          <w:hyperlink w:anchor="_Toc228820575" w:history="1">
             <w:r>
               <w:rPr>
                 <w:rStyle w:val="Hyperlink"/>
@@ -3725,7 +3696,7 @@
                 <w:noProof/>
                 <w:webHidden/>
               </w:rPr>
-              <w:instrText xml:space="preserve"> PAGEREF _Toc228557267 \h </w:instrText>
+              <w:instrText xml:space="preserve"> PAGEREF _Toc228820575 \h </w:instrText>
             </w:r>
             <w:r>
               <w:rPr>
@@ -3745,7 +3716,7 @@
                 <w:noProof/>
                 <w:webHidden/>
               </w:rPr>
-              <w:t>35</w:t>
+              <w:t>37</w:t>
             </w:r>
             <w:r>
               <w:rPr>
@@ -3768,7 +3739,7 @@
               <w:lang w:eastAsia="en-GB"/>
             </w:rPr>
           </w:pPr>
-          <w:hyperlink w:anchor="_Toc228557268" w:history="1">
+          <w:hyperlink w:anchor="_Toc228820576" w:history="1">
             <w:r>
               <w:rPr>
                 <w:rStyle w:val="Hyperlink"/>
@@ -3795,7 +3766,7 @@
                 <w:noProof/>
                 <w:webHidden/>
               </w:rPr>
-              <w:instrText xml:space="preserve"> PAGEREF _Toc228557268 \h </w:instrText>
+              <w:instrText xml:space="preserve"> PAGEREF _Toc228820576 \h </w:instrText>
             </w:r>
             <w:r>
               <w:rPr>
@@ -3815,7 +3786,7 @@
                 <w:noProof/>
                 <w:webHidden/>
               </w:rPr>
-              <w:t>36</w:t>
+              <w:t>38</w:t>
             </w:r>
             <w:r>
               <w:rPr>
@@ -3838,7 +3809,7 @@
               <w:lang w:eastAsia="en-GB"/>
             </w:rPr>
           </w:pPr>
-          <w:hyperlink w:anchor="_Toc228557269" w:history="1">
+          <w:hyperlink w:anchor="_Toc228820577" w:history="1">
             <w:r>
               <w:rPr>
                 <w:rStyle w:val="Hyperlink"/>
@@ -3865,7 +3836,7 @@
                 <w:noProof/>
                 <w:webHidden/>
               </w:rPr>
-              <w:instrText xml:space="preserve"> PAGEREF _Toc228557269 \h </w:instrText>
+              <w:instrText xml:space="preserve"> PAGEREF _Toc228820577 \h </w:instrText>
             </w:r>
             <w:r>
               <w:rPr>
@@ -3885,7 +3856,7 @@
                 <w:noProof/>
                 <w:webHidden/>
               </w:rPr>
-              <w:t>38</w:t>
+              <w:t>40</w:t>
             </w:r>
             <w:r>
               <w:rPr>
@@ -3908,7 +3879,7 @@
               <w:lang w:eastAsia="en-GB"/>
             </w:rPr>
           </w:pPr>
-          <w:hyperlink w:anchor="_Toc228557270" w:history="1">
+          <w:hyperlink w:anchor="_Toc228820578" w:history="1">
             <w:r>
               <w:rPr>
                 <w:rStyle w:val="Hyperlink"/>
@@ -3935,7 +3906,7 @@
                 <w:noProof/>
                 <w:webHidden/>
               </w:rPr>
-              <w:instrText xml:space="preserve"> PAGEREF _Toc228557270 \h </w:instrText>
+              <w:instrText xml:space="preserve"> PAGEREF _Toc228820578 \h </w:instrText>
             </w:r>
             <w:r>
               <w:rPr>
@@ -3955,7 +3926,7 @@
                 <w:noProof/>
                 <w:webHidden/>
               </w:rPr>
-              <w:t>39</w:t>
+              <w:t>41</w:t>
             </w:r>
             <w:r>
               <w:rPr>
@@ -3995,7 +3966,7 @@
               <w:szCs w:val="28"/>
             </w:rPr>
           </w:pPr>
-          <w:bookmarkStart w:id="8" w:name="_Toc228557230"/>
+          <w:bookmarkStart w:id="8" w:name="_Toc228820538"/>
           <w:r>
             <w:rPr>
               <w:rFonts w:ascii="Arial" w:hAnsi="Arial" w:cs="Arial"/>
@@ -4043,7 +4014,7 @@
             </w:rPr>
             <w:fldChar w:fldCharType="separate"/>
           </w:r>
-          <w:hyperlink w:anchor="_Toc228557271" w:history="1">
+          <w:hyperlink w:anchor="_Toc228820579" w:history="1">
             <w:r>
               <w:rPr>
                 <w:rStyle w:val="Hyperlink"/>
@@ -4071,7 +4042,7 @@
                 <w:noProof/>
                 <w:webHidden/>
               </w:rPr>
-              <w:instrText xml:space="preserve"> PAGEREF _Toc228557271 \h </w:instrText>
+              <w:instrText xml:space="preserve"> PAGEREF _Toc228820579 \h </w:instrText>
             </w:r>
             <w:r>
               <w:rPr>
@@ -4114,7 +4085,7 @@
               <w:lang w:eastAsia="en-GB"/>
             </w:rPr>
           </w:pPr>
-          <w:hyperlink w:anchor="_Toc228557272" w:history="1">
+          <w:hyperlink w:anchor="_Toc228820580" w:history="1">
             <w:r>
               <w:rPr>
                 <w:rStyle w:val="Hyperlink"/>
@@ -4142,7 +4113,7 @@
                 <w:noProof/>
                 <w:webHidden/>
               </w:rPr>
-              <w:instrText xml:space="preserve"> PAGEREF _Toc228557272 \h </w:instrText>
+              <w:instrText xml:space="preserve"> PAGEREF _Toc228820580 \h </w:instrText>
             </w:r>
             <w:r>
               <w:rPr>
@@ -4185,7 +4156,7 @@
               <w:lang w:eastAsia="en-GB"/>
             </w:rPr>
           </w:pPr>
-          <w:hyperlink w:anchor="_Toc228557273" w:history="1">
+          <w:hyperlink w:anchor="_Toc228820581" w:history="1">
             <w:r>
               <w:rPr>
                 <w:rStyle w:val="Hyperlink"/>
@@ -4213,7 +4184,7 @@
                 <w:noProof/>
                 <w:webHidden/>
               </w:rPr>
-              <w:instrText xml:space="preserve"> PAGEREF _Toc228557273 \h </w:instrText>
+              <w:instrText xml:space="preserve"> PAGEREF _Toc228820581 \h </w:instrText>
             </w:r>
             <w:r>
               <w:rPr>
@@ -4256,30 +4227,14 @@
               <w:lang w:eastAsia="en-GB"/>
             </w:rPr>
           </w:pPr>
-          <w:hyperlink w:anchor="_Toc228557274" w:history="1">
+          <w:hyperlink w:anchor="_Toc228820582" w:history="1">
             <w:r>
               <w:rPr>
                 <w:rStyle w:val="Hyperlink"/>
                 <w:rFonts w:ascii="Arial" w:hAnsi="Arial" w:cs="Arial"/>
                 <w:noProof/>
               </w:rPr>
-              <w:t>Figure 4: GitHub Kanban</w:t>
-            </w:r>
-            <w:r>
-              <w:rPr>
-                <w:rStyle w:val="Hyperlink"/>
-                <w:rFonts w:ascii="Arial" w:hAnsi="Arial" w:cs="Arial"/>
-                <w:noProof/>
-              </w:rPr>
-              <w:t xml:space="preserve"> </w:t>
-            </w:r>
-            <w:r>
-              <w:rPr>
-                <w:rStyle w:val="Hyperlink"/>
-                <w:rFonts w:ascii="Arial" w:hAnsi="Arial" w:cs="Arial"/>
-                <w:noProof/>
-              </w:rPr>
-              <w:t>board shows the transition from technical development phase to the final evaluation and reporting phase</w:t>
+              <w:t>Figure 4: GitHub Kanban board shows the transition from technical development phase to the final evaluation and reporting phase</w:t>
             </w:r>
             <w:r>
               <w:rPr>
@@ -4300,7 +4255,7 @@
                 <w:noProof/>
                 <w:webHidden/>
               </w:rPr>
-              <w:instrText xml:space="preserve"> PAGEREF _Toc228557274 \h </w:instrText>
+              <w:instrText xml:space="preserve"> PAGEREF _Toc228820582 \h </w:instrText>
             </w:r>
             <w:r>
               <w:rPr>
@@ -4343,7 +4298,7 @@
               <w:lang w:eastAsia="en-GB"/>
             </w:rPr>
           </w:pPr>
-          <w:hyperlink w:anchor="_Toc228557275" w:history="1">
+          <w:hyperlink w:anchor="_Toc228820583" w:history="1">
             <w:r>
               <w:rPr>
                 <w:rStyle w:val="Hyperlink"/>
@@ -4371,7 +4326,7 @@
                 <w:noProof/>
                 <w:webHidden/>
               </w:rPr>
-              <w:instrText xml:space="preserve"> PAGEREF _Toc228557275 \h </w:instrText>
+              <w:instrText xml:space="preserve"> PAGEREF _Toc228820583 \h </w:instrText>
             </w:r>
             <w:r>
               <w:rPr>
@@ -4414,7 +4369,7 @@
               <w:lang w:eastAsia="en-GB"/>
             </w:rPr>
           </w:pPr>
-          <w:hyperlink w:anchor="_Toc228557276" w:history="1">
+          <w:hyperlink w:anchor="_Toc228820584" w:history="1">
             <w:r>
               <w:rPr>
                 <w:rStyle w:val="Hyperlink"/>
@@ -4442,7 +4397,7 @@
                 <w:noProof/>
                 <w:webHidden/>
               </w:rPr>
-              <w:instrText xml:space="preserve"> PAGEREF _Toc228557276 \h </w:instrText>
+              <w:instrText xml:space="preserve"> PAGEREF _Toc228820584 \h </w:instrText>
             </w:r>
             <w:r>
               <w:rPr>
@@ -4462,7 +4417,7 @@
                 <w:noProof/>
                 <w:webHidden/>
               </w:rPr>
-              <w:t>15</w:t>
+              <w:t>16</w:t>
             </w:r>
             <w:r>
               <w:rPr>
@@ -4485,7 +4440,7 @@
               <w:lang w:eastAsia="en-GB"/>
             </w:rPr>
           </w:pPr>
-          <w:hyperlink w:anchor="_Toc228557277" w:history="1">
+          <w:hyperlink w:anchor="_Toc228820585" w:history="1">
             <w:r>
               <w:rPr>
                 <w:rStyle w:val="Hyperlink"/>
@@ -4513,7 +4468,7 @@
                 <w:noProof/>
                 <w:webHidden/>
               </w:rPr>
-              <w:instrText xml:space="preserve"> PAGEREF _Toc228557277 \h </w:instrText>
+              <w:instrText xml:space="preserve"> PAGEREF _Toc228820585 \h </w:instrText>
             </w:r>
             <w:r>
               <w:rPr>
@@ -4556,7 +4511,7 @@
               <w:lang w:eastAsia="en-GB"/>
             </w:rPr>
           </w:pPr>
-          <w:hyperlink w:anchor="_Toc228557278" w:history="1">
+          <w:hyperlink w:anchor="_Toc228820586" w:history="1">
             <w:r>
               <w:rPr>
                 <w:rStyle w:val="Hyperlink"/>
@@ -4584,7 +4539,7 @@
                 <w:noProof/>
                 <w:webHidden/>
               </w:rPr>
-              <w:instrText xml:space="preserve"> PAGEREF _Toc228557278 \h </w:instrText>
+              <w:instrText xml:space="preserve"> PAGEREF _Toc228820586 \h </w:instrText>
             </w:r>
             <w:r>
               <w:rPr>
@@ -4627,7 +4582,7 @@
               <w:lang w:eastAsia="en-GB"/>
             </w:rPr>
           </w:pPr>
-          <w:hyperlink w:anchor="_Toc228557279" w:history="1">
+          <w:hyperlink w:anchor="_Toc228820587" w:history="1">
             <w:r>
               <w:rPr>
                 <w:rStyle w:val="Hyperlink"/>
@@ -4655,7 +4610,7 @@
                 <w:noProof/>
                 <w:webHidden/>
               </w:rPr>
-              <w:instrText xml:space="preserve"> PAGEREF _Toc228557279 \h </w:instrText>
+              <w:instrText xml:space="preserve"> PAGEREF _Toc228820587 \h </w:instrText>
             </w:r>
             <w:r>
               <w:rPr>
@@ -4698,7 +4653,7 @@
               <w:lang w:eastAsia="en-GB"/>
             </w:rPr>
           </w:pPr>
-          <w:hyperlink w:anchor="_Toc228557280" w:history="1">
+          <w:hyperlink w:anchor="_Toc228820588" w:history="1">
             <w:r>
               <w:rPr>
                 <w:rStyle w:val="Hyperlink"/>
@@ -4726,7 +4681,7 @@
                 <w:noProof/>
                 <w:webHidden/>
               </w:rPr>
-              <w:instrText xml:space="preserve"> PAGEREF _Toc228557280 \h </w:instrText>
+              <w:instrText xml:space="preserve"> PAGEREF _Toc228820588 \h </w:instrText>
             </w:r>
             <w:r>
               <w:rPr>
@@ -4769,7 +4724,7 @@
               <w:lang w:eastAsia="en-GB"/>
             </w:rPr>
           </w:pPr>
-          <w:hyperlink w:anchor="_Toc228557281" w:history="1">
+          <w:hyperlink w:anchor="_Toc228820589" w:history="1">
             <w:r>
               <w:rPr>
                 <w:rStyle w:val="Hyperlink"/>
@@ -4797,7 +4752,7 @@
                 <w:noProof/>
                 <w:webHidden/>
               </w:rPr>
-              <w:instrText xml:space="preserve"> PAGEREF _Toc228557281 \h </w:instrText>
+              <w:instrText xml:space="preserve"> PAGEREF _Toc228820589 \h </w:instrText>
             </w:r>
             <w:r>
               <w:rPr>
@@ -4840,7 +4795,7 @@
               <w:lang w:eastAsia="en-GB"/>
             </w:rPr>
           </w:pPr>
-          <w:hyperlink w:anchor="_Toc228557282" w:history="1">
+          <w:hyperlink w:anchor="_Toc228820590" w:history="1">
             <w:r>
               <w:rPr>
                 <w:rStyle w:val="Hyperlink"/>
@@ -4868,7 +4823,7 @@
                 <w:noProof/>
                 <w:webHidden/>
               </w:rPr>
-              <w:instrText xml:space="preserve"> PAGEREF _Toc228557282 \h </w:instrText>
+              <w:instrText xml:space="preserve"> PAGEREF _Toc228820590 \h </w:instrText>
             </w:r>
             <w:r>
               <w:rPr>
@@ -4888,7 +4843,7 @@
                 <w:noProof/>
                 <w:webHidden/>
               </w:rPr>
-              <w:t>31</w:t>
+              <w:t>32</w:t>
             </w:r>
             <w:r>
               <w:rPr>
@@ -4911,7 +4866,7 @@
               <w:lang w:eastAsia="en-GB"/>
             </w:rPr>
           </w:pPr>
-          <w:hyperlink w:anchor="_Toc228557283" w:history="1">
+          <w:hyperlink w:anchor="_Toc228820591" w:history="1">
             <w:r>
               <w:rPr>
                 <w:rStyle w:val="Hyperlink"/>
@@ -4939,7 +4894,7 @@
                 <w:noProof/>
                 <w:webHidden/>
               </w:rPr>
-              <w:instrText xml:space="preserve"> PAGEREF _Toc228557283 \h </w:instrText>
+              <w:instrText xml:space="preserve"> PAGEREF _Toc228820591 \h </w:instrText>
             </w:r>
             <w:r>
               <w:rPr>
@@ -4982,7 +4937,7 @@
               <w:lang w:eastAsia="en-GB"/>
             </w:rPr>
           </w:pPr>
-          <w:hyperlink w:anchor="_Toc228557284" w:history="1">
+          <w:hyperlink w:anchor="_Toc228820592" w:history="1">
             <w:r>
               <w:rPr>
                 <w:rStyle w:val="Hyperlink"/>
@@ -5009,7 +4964,7 @@
                 <w:noProof/>
                 <w:webHidden/>
               </w:rPr>
-              <w:instrText xml:space="preserve"> PAGEREF _Toc228557284 \h </w:instrText>
+              <w:instrText xml:space="preserve"> PAGEREF _Toc228820592 \h </w:instrText>
             </w:r>
             <w:r>
               <w:rPr>
@@ -5029,7 +4984,7 @@
                 <w:noProof/>
                 <w:webHidden/>
               </w:rPr>
-              <w:t>39</w:t>
+              <w:t>41</w:t>
             </w:r>
             <w:r>
               <w:rPr>
@@ -5052,7 +5007,7 @@
               <w:lang w:eastAsia="en-GB"/>
             </w:rPr>
           </w:pPr>
-          <w:hyperlink w:anchor="_Toc228557285" w:history="1">
+          <w:hyperlink w:anchor="_Toc228820593" w:history="1">
             <w:r>
               <w:rPr>
                 <w:rStyle w:val="Hyperlink"/>
@@ -5079,7 +5034,7 @@
                 <w:noProof/>
                 <w:webHidden/>
               </w:rPr>
-              <w:instrText xml:space="preserve"> PAGEREF _Toc228557285 \h </w:instrText>
+              <w:instrText xml:space="preserve"> PAGEREF _Toc228820593 \h </w:instrText>
             </w:r>
             <w:r>
               <w:rPr>
@@ -5099,7 +5054,7 @@
                 <w:noProof/>
                 <w:webHidden/>
               </w:rPr>
-              <w:t>40</w:t>
+              <w:t>42</w:t>
             </w:r>
             <w:r>
               <w:rPr>
@@ -5122,7 +5077,7 @@
               <w:lang w:eastAsia="en-GB"/>
             </w:rPr>
           </w:pPr>
-          <w:hyperlink w:anchor="_Toc228557286" w:history="1">
+          <w:hyperlink w:anchor="_Toc228820594" w:history="1">
             <w:r>
               <w:rPr>
                 <w:rStyle w:val="Hyperlink"/>
@@ -5149,7 +5104,7 @@
                 <w:noProof/>
                 <w:webHidden/>
               </w:rPr>
-              <w:instrText xml:space="preserve"> PAGEREF _Toc228557286 \h </w:instrText>
+              <w:instrText xml:space="preserve"> PAGEREF _Toc228820594 \h </w:instrText>
             </w:r>
             <w:r>
               <w:rPr>
@@ -5169,7 +5124,7 @@
                 <w:noProof/>
                 <w:webHidden/>
               </w:rPr>
-              <w:t>41</w:t>
+              <w:t>43</w:t>
             </w:r>
             <w:r>
               <w:rPr>
@@ -5209,7 +5164,7 @@
               <w:szCs w:val="28"/>
             </w:rPr>
           </w:pPr>
-          <w:bookmarkStart w:id="9" w:name="_Toc228557231"/>
+          <w:bookmarkStart w:id="9" w:name="_Toc228820539"/>
           <w:r>
             <w:rPr>
               <w:rFonts w:ascii="Arial" w:hAnsi="Arial" w:cs="Arial"/>
@@ -5258,7 +5213,7 @@
             </w:rPr>
             <w:fldChar w:fldCharType="separate"/>
           </w:r>
-          <w:hyperlink w:anchor="_Toc228557287" w:history="1">
+          <w:hyperlink w:anchor="_Toc228820595" w:history="1">
             <w:r>
               <w:rPr>
                 <w:rStyle w:val="Hyperlink"/>
@@ -5286,7 +5241,7 @@
                 <w:noProof/>
                 <w:webHidden/>
               </w:rPr>
-              <w:instrText xml:space="preserve"> PAGEREF _Toc228557287 \h </w:instrText>
+              <w:instrText xml:space="preserve"> PAGEREF _Toc228820595 \h </w:instrText>
             </w:r>
             <w:r>
               <w:rPr>
@@ -5329,7 +5284,7 @@
               <w:lang w:eastAsia="en-GB"/>
             </w:rPr>
           </w:pPr>
-          <w:hyperlink w:anchor="_Toc228557288" w:history="1">
+          <w:hyperlink w:anchor="_Toc228820596" w:history="1">
             <w:r>
               <w:rPr>
                 <w:rStyle w:val="Hyperlink"/>
@@ -5357,7 +5312,7 @@
                 <w:noProof/>
                 <w:webHidden/>
               </w:rPr>
-              <w:instrText xml:space="preserve"> PAGEREF _Toc228557288 \h </w:instrText>
+              <w:instrText xml:space="preserve"> PAGEREF _Toc228820596 \h </w:instrText>
             </w:r>
             <w:r>
               <w:rPr>
@@ -5400,7 +5355,7 @@
               <w:lang w:eastAsia="en-GB"/>
             </w:rPr>
           </w:pPr>
-          <w:hyperlink w:anchor="_Toc228557289" w:history="1">
+          <w:hyperlink w:anchor="_Toc228820597" w:history="1">
             <w:r>
               <w:rPr>
                 <w:rStyle w:val="Hyperlink"/>
@@ -5427,7 +5382,7 @@
                 <w:noProof/>
                 <w:webHidden/>
               </w:rPr>
-              <w:instrText xml:space="preserve"> PAGEREF _Toc228557289 \h </w:instrText>
+              <w:instrText xml:space="preserve"> PAGEREF _Toc228820597 \h </w:instrText>
             </w:r>
             <w:r>
               <w:rPr>
@@ -5447,7 +5402,7 @@
                 <w:noProof/>
                 <w:webHidden/>
               </w:rPr>
-              <w:t>42</w:t>
+              <w:t>44</w:t>
             </w:r>
             <w:r>
               <w:rPr>
@@ -5488,7 +5443,7 @@
         </w:rPr>
         <w:br w:type="page"/>
       </w:r>
-      <w:bookmarkStart w:id="10" w:name="_Toc228557232"/>
+      <w:bookmarkStart w:id="10" w:name="_Toc228820540"/>
       <w:r>
         <w:rPr>
           <w:rFonts w:ascii="Arial" w:hAnsi="Arial" w:cs="Arial"/>
@@ -5530,7 +5485,7 @@
           <w:rFonts w:ascii="Arial" w:hAnsi="Arial" w:cs="Arial"/>
         </w:rPr>
       </w:pPr>
-      <w:bookmarkStart w:id="11" w:name="_Toc228557233"/>
+      <w:bookmarkStart w:id="11" w:name="_Toc228820541"/>
       <w:r>
         <w:rPr>
           <w:rFonts w:ascii="Arial" w:hAnsi="Arial" w:cs="Arial"/>
@@ -6233,7 +6188,7 @@
           <w:rFonts w:ascii="Arial" w:hAnsi="Arial" w:cs="Arial"/>
         </w:rPr>
       </w:pPr>
-      <w:bookmarkStart w:id="12" w:name="_Toc228557234"/>
+      <w:bookmarkStart w:id="12" w:name="_Toc228820542"/>
       <w:r>
         <w:rPr>
           <w:rFonts w:ascii="Arial" w:hAnsi="Arial" w:cs="Arial"/>
@@ -6607,7 +6562,7 @@
           <w:rFonts w:ascii="Arial" w:hAnsi="Arial" w:cs="Arial"/>
         </w:rPr>
       </w:pPr>
-      <w:bookmarkStart w:id="13" w:name="_Toc228557235"/>
+      <w:bookmarkStart w:id="13" w:name="_Toc228820543"/>
       <w:r>
         <w:rPr>
           <w:rFonts w:ascii="Arial" w:hAnsi="Arial" w:cs="Arial"/>
@@ -6630,7 +6585,7 @@
           <w:rFonts w:ascii="Arial" w:hAnsi="Arial" w:cs="Arial"/>
         </w:rPr>
       </w:pPr>
-      <w:bookmarkStart w:id="14" w:name="_Toc228557236"/>
+      <w:bookmarkStart w:id="14" w:name="_Toc228820544"/>
       <w:r>
         <w:rPr>
           <w:rFonts w:ascii="Arial" w:hAnsi="Arial" w:cs="Arial"/>
@@ -7193,7 +7148,7 @@
           <w:rFonts w:ascii="Arial" w:hAnsi="Arial" w:cs="Arial"/>
         </w:rPr>
       </w:pPr>
-      <w:bookmarkStart w:id="15" w:name="_Toc228557237"/>
+      <w:bookmarkStart w:id="15" w:name="_Toc228820545"/>
       <w:r>
         <w:rPr>
           <w:rFonts w:ascii="Arial" w:hAnsi="Arial" w:cs="Arial"/>
@@ -7624,7 +7579,25 @@
           <w:sz w:val="22"/>
           <w:szCs w:val="22"/>
         </w:rPr>
-        <w:t xml:space="preserve">There is insufficient research evaluating the practical trade offs between the rigid predictability </w:t>
+        <w:t xml:space="preserve">There is insufficient research evaluating the practical </w:t>
+      </w:r>
+      <w:proofErr w:type="spellStart"/>
+      <w:r>
+        <w:rPr>
+          <w:rFonts w:ascii="Arial" w:hAnsi="Arial" w:cs="Arial"/>
+          <w:sz w:val="22"/>
+          <w:szCs w:val="22"/>
+        </w:rPr>
+        <w:t>trade offs</w:t>
+      </w:r>
+      <w:proofErr w:type="spellEnd"/>
+      <w:r>
+        <w:rPr>
+          <w:rFonts w:ascii="Arial" w:hAnsi="Arial" w:cs="Arial"/>
+          <w:sz w:val="22"/>
+          <w:szCs w:val="22"/>
+        </w:rPr>
+        <w:t xml:space="preserve"> between the rigid predictability </w:t>
       </w:r>
       <w:r>
         <w:rPr>
@@ -7707,7 +7680,7 @@
           <w:rFonts w:ascii="Arial" w:hAnsi="Arial" w:cs="Arial"/>
         </w:rPr>
       </w:pPr>
-      <w:bookmarkStart w:id="16" w:name="_Toc228557238"/>
+      <w:bookmarkStart w:id="16" w:name="_Toc228820546"/>
       <w:r>
         <w:rPr>
           <w:rFonts w:ascii="Arial" w:hAnsi="Arial" w:cs="Arial"/>
@@ -8381,7 +8354,7 @@
           <w:rFonts w:ascii="Arial" w:hAnsi="Arial" w:cs="Arial"/>
         </w:rPr>
       </w:pPr>
-      <w:bookmarkStart w:id="17" w:name="_Toc228557239"/>
+      <w:bookmarkStart w:id="17" w:name="_Toc228820547"/>
       <w:r>
         <w:rPr>
           <w:rFonts w:ascii="Arial" w:hAnsi="Arial" w:cs="Arial"/>
@@ -8404,7 +8377,7 @@
           <w:rFonts w:ascii="Arial" w:hAnsi="Arial" w:cs="Arial"/>
         </w:rPr>
       </w:pPr>
-      <w:bookmarkStart w:id="18" w:name="_Toc228557240"/>
+      <w:bookmarkStart w:id="18" w:name="_Toc228820548"/>
       <w:r>
         <w:rPr>
           <w:rFonts w:ascii="Arial" w:hAnsi="Arial" w:cs="Arial"/>
@@ -8533,7 +8506,7 @@
           <w:rFonts w:ascii="Arial" w:hAnsi="Arial" w:cs="Arial"/>
         </w:rPr>
       </w:pPr>
-      <w:bookmarkStart w:id="19" w:name="_Toc228557241"/>
+      <w:bookmarkStart w:id="19" w:name="_Toc228820549"/>
       <w:r>
         <w:rPr>
           <w:rFonts w:ascii="Arial" w:hAnsi="Arial" w:cs="Arial"/>
@@ -9369,7 +9342,7 @@
           <w:rFonts w:ascii="Arial" w:hAnsi="Arial" w:cs="Arial"/>
         </w:rPr>
       </w:pPr>
-      <w:bookmarkStart w:id="20" w:name="_Toc228557242"/>
+      <w:bookmarkStart w:id="20" w:name="_Toc228820550"/>
       <w:r>
         <w:rPr>
           <w:rFonts w:ascii="Arial" w:hAnsi="Arial" w:cs="Arial"/>
@@ -9958,7 +9931,7 @@
           <w:rFonts w:ascii="Arial" w:hAnsi="Arial" w:cs="Arial"/>
         </w:rPr>
       </w:pPr>
-      <w:bookmarkStart w:id="21" w:name="_Toc228557243"/>
+      <w:bookmarkStart w:id="21" w:name="_Toc228820551"/>
       <w:r>
         <w:rPr>
           <w:rFonts w:ascii="Arial" w:hAnsi="Arial" w:cs="Arial"/>
@@ -9976,7 +9949,7 @@
           <w:rFonts w:ascii="Arial" w:hAnsi="Arial" w:cs="Arial"/>
         </w:rPr>
       </w:pPr>
-      <w:bookmarkStart w:id="22" w:name="_Toc228557244"/>
+      <w:bookmarkStart w:id="22" w:name="_Toc228820552"/>
       <w:r>
         <w:rPr>
           <w:rFonts w:ascii="Arial" w:hAnsi="Arial" w:cs="Arial"/>
@@ -10140,7 +10113,7 @@
           <w:szCs w:val="22"/>
         </w:rPr>
       </w:pPr>
-      <w:bookmarkStart w:id="23" w:name="_Toc228557271"/>
+      <w:bookmarkStart w:id="23" w:name="_Toc228820579"/>
       <w:r>
         <w:rPr>
           <w:rFonts w:ascii="Arial" w:hAnsi="Arial" w:cs="Arial"/>
@@ -10373,7 +10346,7 @@
           <w:szCs w:val="22"/>
         </w:rPr>
       </w:pPr>
-      <w:bookmarkStart w:id="24" w:name="_Toc228557272"/>
+      <w:bookmarkStart w:id="24" w:name="_Toc228820580"/>
       <w:r>
         <w:rPr>
           <w:rFonts w:ascii="Arial" w:hAnsi="Arial" w:cs="Arial"/>
@@ -10595,7 +10568,7 @@
           <w:szCs w:val="22"/>
         </w:rPr>
       </w:pPr>
-      <w:bookmarkStart w:id="25" w:name="_Toc228557273"/>
+      <w:bookmarkStart w:id="25" w:name="_Toc228820581"/>
       <w:r>
         <w:rPr>
           <w:rFonts w:ascii="Arial" w:hAnsi="Arial" w:cs="Arial"/>
@@ -10776,7 +10749,7 @@
           <w:rFonts w:ascii="Arial" w:hAnsi="Arial" w:cs="Arial"/>
         </w:rPr>
       </w:pPr>
-      <w:bookmarkStart w:id="26" w:name="_Toc228557245"/>
+      <w:bookmarkStart w:id="26" w:name="_Toc228820553"/>
       <w:r>
         <w:rPr>
           <w:rFonts w:ascii="Arial" w:hAnsi="Arial" w:cs="Arial"/>
@@ -10860,7 +10833,7 @@
           <w:rFonts w:ascii="Arial" w:hAnsi="Arial" w:cs="Arial"/>
         </w:rPr>
       </w:pPr>
-      <w:bookmarkStart w:id="27" w:name="_Toc228557246"/>
+      <w:bookmarkStart w:id="27" w:name="_Toc228820554"/>
       <w:r>
         <w:rPr>
           <w:rFonts w:ascii="Arial" w:hAnsi="Arial" w:cs="Arial"/>
@@ -11331,7 +11304,7 @@
           <w:rFonts w:ascii="Arial" w:hAnsi="Arial" w:cs="Arial"/>
         </w:rPr>
       </w:pPr>
-      <w:bookmarkStart w:id="28" w:name="_Toc228557247"/>
+      <w:bookmarkStart w:id="28" w:name="_Toc228820555"/>
       <w:r>
         <w:rPr>
           <w:rFonts w:ascii="Arial" w:hAnsi="Arial" w:cs="Arial"/>
@@ -11450,6 +11423,7 @@
       <w:r>
         <w:rPr>
           <w:rFonts w:ascii="Arial" w:hAnsi="Arial" w:cs="Arial"/>
+          <w:noProof/>
           <w:sz w:val="22"/>
           <w:szCs w:val="22"/>
         </w:rPr>
@@ -11504,7 +11478,7 @@
           <w:szCs w:val="22"/>
         </w:rPr>
       </w:pPr>
-      <w:bookmarkStart w:id="29" w:name="_Toc228557274"/>
+      <w:bookmarkStart w:id="29" w:name="_Toc228820582"/>
       <w:r>
         <w:rPr>
           <w:rFonts w:ascii="Arial" w:hAnsi="Arial" w:cs="Arial"/>
@@ -11709,7 +11683,7 @@
           <w:szCs w:val="22"/>
         </w:rPr>
       </w:pPr>
-      <w:bookmarkStart w:id="30" w:name="_Toc228557275"/>
+      <w:bookmarkStart w:id="30" w:name="_Toc228820583"/>
       <w:r>
         <w:rPr>
           <w:rFonts w:ascii="Arial" w:hAnsi="Arial" w:cs="Arial"/>
@@ -11791,6 +11765,9 @@
         </w:rPr>
       </w:pPr>
       <w:r>
+        <w:rPr>
+          <w:noProof/>
+        </w:rPr>
         <w:lastRenderedPageBreak/>
         <w:drawing>
           <wp:inline distT="0" distB="0" distL="0" distR="0" wp14:anchorId="7C3B6E50" wp14:editId="48A24DBF">
@@ -11855,7 +11832,7 @@
           <w:szCs w:val="22"/>
         </w:rPr>
       </w:pPr>
-      <w:bookmarkStart w:id="31" w:name="_Toc228557276"/>
+      <w:bookmarkStart w:id="31" w:name="_Toc228820584"/>
       <w:r>
         <w:rPr>
           <w:rFonts w:ascii="Arial" w:hAnsi="Arial" w:cs="Arial"/>
@@ -11943,35 +11920,7 @@
             <w:rStyle w:val="Hyperlink"/>
             <w:rFonts w:ascii="Arial" w:hAnsi="Arial" w:cs="Arial"/>
           </w:rPr>
-          <w:t>Gantt</w:t>
-        </w:r>
-        <w:r>
-          <w:rPr>
-            <w:rStyle w:val="Hyperlink"/>
-            <w:rFonts w:ascii="Arial" w:hAnsi="Arial" w:cs="Arial"/>
-          </w:rPr>
-          <w:t xml:space="preserve"> </w:t>
-        </w:r>
-        <w:r>
-          <w:rPr>
-            <w:rStyle w:val="Hyperlink"/>
-            <w:rFonts w:ascii="Arial" w:hAnsi="Arial" w:cs="Arial"/>
-          </w:rPr>
-          <w:t>Chart</w:t>
-        </w:r>
-        <w:r>
-          <w:rPr>
-            <w:rStyle w:val="Hyperlink"/>
-            <w:rFonts w:ascii="Arial" w:hAnsi="Arial" w:cs="Arial"/>
-          </w:rPr>
-          <w:t>s</w:t>
-        </w:r>
-        <w:r>
-          <w:rPr>
-            <w:rStyle w:val="Hyperlink"/>
-            <w:rFonts w:ascii="Arial" w:hAnsi="Arial" w:cs="Arial"/>
-          </w:rPr>
-          <w:t xml:space="preserve"> Link</w:t>
+          <w:t>Gantt Charts Link</w:t>
         </w:r>
       </w:hyperlink>
     </w:p>
@@ -12009,7 +11958,7 @@
           <w:rFonts w:ascii="Arial" w:hAnsi="Arial" w:cs="Arial"/>
         </w:rPr>
       </w:pPr>
-      <w:bookmarkStart w:id="32" w:name="_Toc228557248"/>
+      <w:bookmarkStart w:id="32" w:name="_Toc228820556"/>
       <w:r>
         <w:rPr>
           <w:rFonts w:ascii="Arial" w:hAnsi="Arial" w:cs="Arial"/>
@@ -12411,7 +12360,7 @@
           <w:rFonts w:ascii="Arial" w:hAnsi="Arial" w:cs="Arial"/>
         </w:rPr>
       </w:pPr>
-      <w:bookmarkStart w:id="33" w:name="_Toc228557249"/>
+      <w:bookmarkStart w:id="33" w:name="_Toc228820557"/>
       <w:r>
         <w:rPr>
           <w:rFonts w:ascii="Arial" w:hAnsi="Arial" w:cs="Arial"/>
@@ -13608,7 +13557,7 @@
           <w:szCs w:val="28"/>
         </w:rPr>
       </w:pPr>
-      <w:bookmarkStart w:id="34" w:name="_Toc228557277"/>
+      <w:bookmarkStart w:id="34" w:name="_Toc228820585"/>
       <w:r>
         <w:rPr>
           <w:rFonts w:ascii="Arial" w:hAnsi="Arial" w:cs="Arial"/>
@@ -13760,7 +13709,7 @@
           <w:szCs w:val="22"/>
         </w:rPr>
       </w:pPr>
-      <w:bookmarkStart w:id="35" w:name="_Toc228557278"/>
+      <w:bookmarkStart w:id="35" w:name="_Toc228820586"/>
       <w:r>
         <w:rPr>
           <w:rFonts w:ascii="Arial" w:hAnsi="Arial" w:cs="Arial"/>
@@ -13907,7 +13856,7 @@
           <w:szCs w:val="22"/>
         </w:rPr>
       </w:pPr>
-      <w:bookmarkStart w:id="36" w:name="_Toc228557279"/>
+      <w:bookmarkStart w:id="36" w:name="_Toc228820587"/>
       <w:r>
         <w:rPr>
           <w:rFonts w:ascii="Arial" w:hAnsi="Arial" w:cs="Arial"/>
@@ -13986,7 +13935,7 @@
           <w:rFonts w:ascii="Arial" w:hAnsi="Arial" w:cs="Arial"/>
         </w:rPr>
       </w:pPr>
-      <w:bookmarkStart w:id="37" w:name="_Toc228557250"/>
+      <w:bookmarkStart w:id="37" w:name="_Toc228820558"/>
       <w:r>
         <w:rPr>
           <w:rFonts w:ascii="Arial" w:hAnsi="Arial" w:cs="Arial"/>
@@ -14969,7 +14918,7 @@
           <w:szCs w:val="22"/>
         </w:rPr>
       </w:pPr>
-      <w:bookmarkStart w:id="38" w:name="_Toc228557280"/>
+      <w:bookmarkStart w:id="38" w:name="_Toc228820588"/>
       <w:r>
         <w:rPr>
           <w:rFonts w:ascii="Arial" w:hAnsi="Arial" w:cs="Arial"/>
@@ -15070,7 +15019,7 @@
           <w:rFonts w:ascii="Arial" w:hAnsi="Arial" w:cs="Arial"/>
         </w:rPr>
       </w:pPr>
-      <w:bookmarkStart w:id="39" w:name="_Toc228557251"/>
+      <w:bookmarkStart w:id="39" w:name="_Toc228820559"/>
       <w:r>
         <w:rPr>
           <w:rFonts w:ascii="Arial" w:hAnsi="Arial" w:cs="Arial"/>
@@ -15805,7 +15754,7 @@
           <w:rFonts w:ascii="Arial" w:hAnsi="Arial" w:cs="Arial"/>
         </w:rPr>
       </w:pPr>
-      <w:bookmarkStart w:id="40" w:name="_Toc228557252"/>
+      <w:bookmarkStart w:id="40" w:name="_Toc228820560"/>
       <w:r>
         <w:rPr>
           <w:rFonts w:ascii="Arial" w:hAnsi="Arial" w:cs="Arial"/>
@@ -15823,7 +15772,7 @@
           <w:rFonts w:ascii="Arial" w:hAnsi="Arial" w:cs="Arial"/>
         </w:rPr>
       </w:pPr>
-      <w:bookmarkStart w:id="41" w:name="_Toc228557253"/>
+      <w:bookmarkStart w:id="41" w:name="_Toc228820561"/>
       <w:r>
         <w:rPr>
           <w:rFonts w:ascii="Arial" w:hAnsi="Arial" w:cs="Arial"/>
@@ -17003,7 +16952,7 @@
           <w:rFonts w:ascii="Arial" w:hAnsi="Arial" w:cs="Arial"/>
         </w:rPr>
       </w:pPr>
-      <w:bookmarkStart w:id="42" w:name="_Toc228557254"/>
+      <w:bookmarkStart w:id="42" w:name="_Toc228820562"/>
       <w:r>
         <w:rPr>
           <w:rFonts w:ascii="Arial" w:hAnsi="Arial" w:cs="Arial"/>
@@ -18193,7 +18142,7 @@
           <w:rFonts w:ascii="Arial" w:hAnsi="Arial" w:cs="Arial"/>
         </w:rPr>
       </w:pPr>
-      <w:bookmarkStart w:id="43" w:name="_Toc228557255"/>
+      <w:bookmarkStart w:id="43" w:name="_Toc228820563"/>
       <w:r>
         <w:rPr>
           <w:rFonts w:ascii="Arial" w:hAnsi="Arial" w:cs="Arial"/>
@@ -18685,7 +18634,7 @@
           <w:rFonts w:ascii="Arial" w:hAnsi="Arial" w:cs="Arial"/>
         </w:rPr>
       </w:pPr>
-      <w:bookmarkStart w:id="44" w:name="_Toc228557256"/>
+      <w:bookmarkStart w:id="44" w:name="_Toc228820564"/>
       <w:r>
         <w:rPr>
           <w:rFonts w:ascii="Arial" w:hAnsi="Arial" w:cs="Arial"/>
@@ -18868,7 +18817,7 @@
           <w:rFonts w:ascii="Arial" w:hAnsi="Arial" w:cs="Arial"/>
         </w:rPr>
       </w:pPr>
-      <w:bookmarkStart w:id="45" w:name="_Toc228557257"/>
+      <w:bookmarkStart w:id="45" w:name="_Toc228820565"/>
       <w:r>
         <w:rPr>
           <w:rFonts w:ascii="Arial" w:hAnsi="Arial" w:cs="Arial"/>
@@ -19613,7 +19562,7 @@
           <w:rFonts w:ascii="Arial" w:hAnsi="Arial" w:cs="Arial"/>
         </w:rPr>
       </w:pPr>
-      <w:bookmarkStart w:id="46" w:name="_Toc228557258"/>
+      <w:bookmarkStart w:id="46" w:name="_Toc228820566"/>
       <w:r>
         <w:rPr>
           <w:rFonts w:ascii="Arial" w:hAnsi="Arial" w:cs="Arial"/>
@@ -20045,7 +19994,7 @@
           <w:szCs w:val="28"/>
         </w:rPr>
       </w:pPr>
-      <w:bookmarkStart w:id="47" w:name="_Toc228557281"/>
+      <w:bookmarkStart w:id="47" w:name="_Toc228820589"/>
       <w:r>
         <w:rPr>
           <w:rFonts w:ascii="Arial" w:hAnsi="Arial" w:cs="Arial"/>
@@ -20144,13 +20093,23 @@
         </w:rPr>
         <w:t xml:space="preserve">training instability </w:t>
       </w:r>
-      <w:r>
-        <w:rPr>
-          <w:rFonts w:ascii="Arial" w:hAnsi="Arial" w:cs="Arial"/>
-          <w:sz w:val="22"/>
-          <w:szCs w:val="22"/>
-        </w:rPr>
-        <w:t>where trying to learn highly specific situations actually degraded its overall performance.</w:t>
+      <w:proofErr w:type="gramStart"/>
+      <w:r>
+        <w:rPr>
+          <w:rFonts w:ascii="Arial" w:hAnsi="Arial" w:cs="Arial"/>
+          <w:sz w:val="22"/>
+          <w:szCs w:val="22"/>
+        </w:rPr>
+        <w:t>where</w:t>
+      </w:r>
+      <w:proofErr w:type="gramEnd"/>
+      <w:r>
+        <w:rPr>
+          <w:rFonts w:ascii="Arial" w:hAnsi="Arial" w:cs="Arial"/>
+          <w:sz w:val="22"/>
+          <w:szCs w:val="22"/>
+        </w:rPr>
+        <w:t xml:space="preserve"> trying to learn highly specific situations actually degraded its overall performance.</w:t>
       </w:r>
       <w:r>
         <w:rPr>
@@ -20647,7 +20606,7 @@
           <w:szCs w:val="22"/>
         </w:rPr>
       </w:pPr>
-      <w:bookmarkStart w:id="48" w:name="_Toc228557287"/>
+      <w:bookmarkStart w:id="48" w:name="_Toc228820595"/>
       <w:r>
         <w:rPr>
           <w:rFonts w:ascii="Arial" w:hAnsi="Arial" w:cs="Arial"/>
@@ -21232,7 +21191,23 @@
                 <w:sz w:val="22"/>
                 <w:szCs w:val="22"/>
               </w:rPr>
-              <w:t>3.67</w:t>
+              <w:t>4</w:t>
+            </w:r>
+            <w:r>
+              <w:rPr>
+                <w:rFonts w:ascii="Arial" w:hAnsi="Arial" w:cs="Arial"/>
+                <w:sz w:val="22"/>
+                <w:szCs w:val="22"/>
+              </w:rPr>
+              <w:t>.</w:t>
+            </w:r>
+            <w:r>
+              <w:rPr>
+                <w:rFonts w:ascii="Arial" w:hAnsi="Arial" w:cs="Arial"/>
+                <w:sz w:val="22"/>
+                <w:szCs w:val="22"/>
+              </w:rPr>
+              <w:t>00</w:t>
             </w:r>
           </w:p>
         </w:tc>
@@ -21257,7 +21232,15 @@
                 <w:sz w:val="22"/>
                 <w:szCs w:val="22"/>
               </w:rPr>
-              <w:t>2.67</w:t>
+              <w:t>2.</w:t>
+            </w:r>
+            <w:r>
+              <w:rPr>
+                <w:rFonts w:ascii="Arial" w:hAnsi="Arial" w:cs="Arial"/>
+                <w:sz w:val="22"/>
+                <w:szCs w:val="22"/>
+              </w:rPr>
+              <w:t>09</w:t>
             </w:r>
           </w:p>
         </w:tc>
@@ -21356,7 +21339,23 @@
                 <w:sz w:val="22"/>
                 <w:szCs w:val="22"/>
               </w:rPr>
-              <w:t>1.83</w:t>
+              <w:t>1.</w:t>
+            </w:r>
+            <w:r>
+              <w:rPr>
+                <w:rFonts w:ascii="Arial" w:hAnsi="Arial" w:cs="Arial"/>
+                <w:sz w:val="22"/>
+                <w:szCs w:val="22"/>
+              </w:rPr>
+              <w:t>9</w:t>
+            </w:r>
+            <w:r>
+              <w:rPr>
+                <w:rFonts w:ascii="Arial" w:hAnsi="Arial" w:cs="Arial"/>
+                <w:sz w:val="22"/>
+                <w:szCs w:val="22"/>
+              </w:rPr>
+              <w:t>1</w:t>
             </w:r>
           </w:p>
         </w:tc>
@@ -21381,7 +21380,23 @@
                 <w:sz w:val="22"/>
                 <w:szCs w:val="22"/>
               </w:rPr>
-              <w:t>2.67</w:t>
+              <w:t>3</w:t>
+            </w:r>
+            <w:r>
+              <w:rPr>
+                <w:rFonts w:ascii="Arial" w:hAnsi="Arial" w:cs="Arial"/>
+                <w:sz w:val="22"/>
+                <w:szCs w:val="22"/>
+              </w:rPr>
+              <w:t>.</w:t>
+            </w:r>
+            <w:r>
+              <w:rPr>
+                <w:rFonts w:ascii="Arial" w:hAnsi="Arial" w:cs="Arial"/>
+                <w:sz w:val="22"/>
+                <w:szCs w:val="22"/>
+              </w:rPr>
+              <w:t>00</w:t>
             </w:r>
           </w:p>
         </w:tc>
@@ -21483,7 +21498,15 @@
                 <w:sz w:val="22"/>
                 <w:szCs w:val="22"/>
               </w:rPr>
-              <w:t>3.17</w:t>
+              <w:t>2.9</w:t>
+            </w:r>
+            <w:r>
+              <w:rPr>
+                <w:rFonts w:ascii="Arial" w:hAnsi="Arial" w:cs="Arial"/>
+                <w:sz w:val="22"/>
+                <w:szCs w:val="22"/>
+              </w:rPr>
+              <w:t>1</w:t>
             </w:r>
           </w:p>
         </w:tc>
@@ -21508,7 +21531,15 @@
                 <w:sz w:val="22"/>
                 <w:szCs w:val="22"/>
               </w:rPr>
-              <w:t>3.00</w:t>
+              <w:t>3.</w:t>
+            </w:r>
+            <w:r>
+              <w:rPr>
+                <w:rFonts w:ascii="Arial" w:hAnsi="Arial" w:cs="Arial"/>
+                <w:sz w:val="22"/>
+                <w:szCs w:val="22"/>
+              </w:rPr>
+              <w:t>73</w:t>
             </w:r>
           </w:p>
         </w:tc>
@@ -21607,7 +21638,15 @@
                 <w:sz w:val="22"/>
                 <w:szCs w:val="22"/>
               </w:rPr>
-              <w:t>2.00</w:t>
+              <w:t>3</w:t>
+            </w:r>
+            <w:r>
+              <w:rPr>
+                <w:rFonts w:ascii="Arial" w:hAnsi="Arial" w:cs="Arial"/>
+                <w:sz w:val="22"/>
+                <w:szCs w:val="22"/>
+              </w:rPr>
+              <w:t>.00</w:t>
             </w:r>
           </w:p>
         </w:tc>
@@ -21632,7 +21671,23 @@
                 <w:sz w:val="22"/>
                 <w:szCs w:val="22"/>
               </w:rPr>
-              <w:t>5.50</w:t>
+              <w:t>6</w:t>
+            </w:r>
+            <w:r>
+              <w:rPr>
+                <w:rFonts w:ascii="Arial" w:hAnsi="Arial" w:cs="Arial"/>
+                <w:sz w:val="22"/>
+                <w:szCs w:val="22"/>
+              </w:rPr>
+              <w:t>.</w:t>
+            </w:r>
+            <w:r>
+              <w:rPr>
+                <w:rFonts w:ascii="Arial" w:hAnsi="Arial" w:cs="Arial"/>
+                <w:sz w:val="22"/>
+                <w:szCs w:val="22"/>
+              </w:rPr>
+              <w:t>27</w:t>
             </w:r>
           </w:p>
         </w:tc>
@@ -21734,7 +21789,15 @@
                 <w:sz w:val="22"/>
                 <w:szCs w:val="22"/>
               </w:rPr>
-              <w:t>3.33</w:t>
+              <w:t>3.</w:t>
+            </w:r>
+            <w:r>
+              <w:rPr>
+                <w:rFonts w:ascii="Arial" w:hAnsi="Arial" w:cs="Arial"/>
+                <w:sz w:val="22"/>
+                <w:szCs w:val="22"/>
+              </w:rPr>
+              <w:t>64</w:t>
             </w:r>
           </w:p>
         </w:tc>
@@ -21759,7 +21822,15 @@
                 <w:sz w:val="22"/>
                 <w:szCs w:val="22"/>
               </w:rPr>
-              <w:t>3.17</w:t>
+              <w:t>3.</w:t>
+            </w:r>
+            <w:r>
+              <w:rPr>
+                <w:rFonts w:ascii="Arial" w:hAnsi="Arial" w:cs="Arial"/>
+                <w:sz w:val="22"/>
+                <w:szCs w:val="22"/>
+              </w:rPr>
+              <w:t>91</w:t>
             </w:r>
           </w:p>
         </w:tc>
@@ -21778,7 +21849,7 @@
           <w:szCs w:val="22"/>
         </w:rPr>
       </w:pPr>
-      <w:bookmarkStart w:id="49" w:name="_Toc228557288"/>
+      <w:bookmarkStart w:id="49" w:name="_Toc228820596"/>
       <w:r>
         <w:rPr>
           <w:rFonts w:ascii="Arial" w:hAnsi="Arial" w:cs="Arial"/>
@@ -22012,7 +22083,7 @@
           <w:rFonts w:ascii="Arial" w:hAnsi="Arial" w:cs="Arial"/>
         </w:rPr>
       </w:pPr>
-      <w:bookmarkStart w:id="50" w:name="_Toc228557259"/>
+      <w:bookmarkStart w:id="50" w:name="_Toc228820567"/>
       <w:r>
         <w:rPr>
           <w:rFonts w:ascii="Arial" w:hAnsi="Arial" w:cs="Arial"/>
@@ -22042,7 +22113,7 @@
           <w:rFonts w:ascii="Arial" w:hAnsi="Arial" w:cs="Arial"/>
         </w:rPr>
       </w:pPr>
-      <w:bookmarkStart w:id="51" w:name="_Toc228557260"/>
+      <w:bookmarkStart w:id="51" w:name="_Toc228820568"/>
       <w:r>
         <w:rPr>
           <w:rFonts w:ascii="Arial" w:hAnsi="Arial" w:cs="Arial"/>
@@ -22643,7 +22714,7 @@
         </w:rPr>
         <w:lastRenderedPageBreak/>
         <w:drawing>
-          <wp:inline distT="0" distB="0" distL="0" distR="0" wp14:anchorId="106BE892" wp14:editId="4D104D63">
+          <wp:inline distT="0" distB="0" distL="0" distR="0" wp14:anchorId="106BE892" wp14:editId="526B4AB8">
             <wp:extent cx="5474335" cy="3193415"/>
             <wp:effectExtent l="0" t="0" r="12065" b="6985"/>
             <wp:docPr id="2040026878" name="Chart 3">
@@ -22676,7 +22747,7 @@
           <w:szCs w:val="22"/>
         </w:rPr>
       </w:pPr>
-      <w:bookmarkStart w:id="52" w:name="_Toc228557282"/>
+      <w:bookmarkStart w:id="52" w:name="_Toc228820590"/>
       <w:r>
         <w:rPr>
           <w:rFonts w:ascii="Arial" w:hAnsi="Arial" w:cs="Arial"/>
@@ -22771,7 +22842,7 @@
           <w:noProof/>
         </w:rPr>
         <w:drawing>
-          <wp:inline distT="0" distB="0" distL="0" distR="0" wp14:anchorId="2FA83CFE" wp14:editId="716F5440">
+          <wp:inline distT="0" distB="0" distL="0" distR="0" wp14:anchorId="2FA83CFE" wp14:editId="11786BDD">
             <wp:extent cx="5474335" cy="3193415"/>
             <wp:effectExtent l="0" t="0" r="12065" b="6985"/>
             <wp:docPr id="1258494985" name="Chart 4">
@@ -22804,7 +22875,7 @@
           <w:szCs w:val="22"/>
         </w:rPr>
       </w:pPr>
-      <w:bookmarkStart w:id="53" w:name="_Toc228557283"/>
+      <w:bookmarkStart w:id="53" w:name="_Toc228820591"/>
       <w:r>
         <w:rPr>
           <w:rFonts w:ascii="Arial" w:hAnsi="Arial" w:cs="Arial"/>
@@ -22886,7 +22957,7 @@
           <w:rFonts w:ascii="Arial" w:hAnsi="Arial" w:cs="Arial"/>
         </w:rPr>
       </w:pPr>
-      <w:bookmarkStart w:id="54" w:name="_Toc228557261"/>
+      <w:bookmarkStart w:id="54" w:name="_Toc228820569"/>
       <w:r>
         <w:rPr>
           <w:rFonts w:ascii="Arial" w:hAnsi="Arial" w:cs="Arial"/>
@@ -22959,7 +23030,25 @@
           <w:sz w:val="22"/>
           <w:szCs w:val="22"/>
         </w:rPr>
-        <w:t>A was extremely easy got to easy 16 min before being bored, B got me in 3 min.</w:t>
+        <w:t xml:space="preserve">A was extremely easy got </w:t>
+      </w:r>
+      <w:proofErr w:type="gramStart"/>
+      <w:r>
+        <w:rPr>
+          <w:rFonts w:ascii="Arial" w:hAnsi="Arial" w:cs="Arial"/>
+          <w:sz w:val="22"/>
+          <w:szCs w:val="22"/>
+        </w:rPr>
+        <w:t>to</w:t>
+      </w:r>
+      <w:proofErr w:type="gramEnd"/>
+      <w:r>
+        <w:rPr>
+          <w:rFonts w:ascii="Arial" w:hAnsi="Arial" w:cs="Arial"/>
+          <w:sz w:val="22"/>
+          <w:szCs w:val="22"/>
+        </w:rPr>
+        <w:t xml:space="preserve"> easy 16 min before being bored, B got me in 3 min.</w:t>
       </w:r>
       <w:r>
         <w:rPr>
@@ -22975,7 +23064,23 @@
           <w:sz w:val="22"/>
           <w:szCs w:val="22"/>
         </w:rPr>
-        <w:t>Enemy B seemed to be a bit more cunning rather than just chasing me but it was difficult to tell</w:t>
+        <w:t xml:space="preserve">Enemy B seemed to be a bit more cunning rather than just chasing </w:t>
+      </w:r>
+      <w:r>
+        <w:rPr>
+          <w:rFonts w:ascii="Arial" w:hAnsi="Arial" w:cs="Arial"/>
+          <w:sz w:val="22"/>
+          <w:szCs w:val="22"/>
+        </w:rPr>
+        <w:t>me,</w:t>
+      </w:r>
+      <w:r>
+        <w:rPr>
+          <w:rFonts w:ascii="Arial" w:hAnsi="Arial" w:cs="Arial"/>
+          <w:sz w:val="22"/>
+          <w:szCs w:val="22"/>
+        </w:rPr>
+        <w:t xml:space="preserve"> but it was difficult to tell</w:t>
       </w:r>
       <w:r>
         <w:rPr>
@@ -23001,71 +23106,23 @@
           <w:sz w:val="22"/>
           <w:szCs w:val="22"/>
         </w:rPr>
-        <w:t xml:space="preserve">However, the RL agent had different strengths. The RL agent’s slower, unscripted stalking approach was seen as useful for creating a more immersive and engaging tension over longer periods of time, rather than just ending the game quickly. Furthermore, the BT agent had clear technical flaws that the RL agent did not share. Testers highlighted this by saying, “ </w:t>
-      </w:r>
-      <w:r>
-        <w:rPr>
-          <w:rFonts w:ascii="Arial" w:hAnsi="Arial" w:cs="Arial"/>
-          <w:sz w:val="22"/>
-          <w:szCs w:val="22"/>
-        </w:rPr>
-        <w:t xml:space="preserve">They both seem to be similar, except B is Buggy (It </w:t>
-      </w:r>
-      <w:r>
-        <w:rPr>
-          <w:rFonts w:ascii="Arial" w:hAnsi="Arial" w:cs="Arial"/>
-          <w:sz w:val="22"/>
-          <w:szCs w:val="22"/>
-        </w:rPr>
-        <w:t>gets</w:t>
-      </w:r>
-      <w:r>
-        <w:rPr>
-          <w:rFonts w:ascii="Arial" w:hAnsi="Arial" w:cs="Arial"/>
-          <w:sz w:val="22"/>
-          <w:szCs w:val="22"/>
-        </w:rPr>
-        <w:t xml:space="preserve"> stuck).</w:t>
-      </w:r>
-      <w:r>
-        <w:rPr>
-          <w:rFonts w:ascii="Arial" w:hAnsi="Arial" w:cs="Arial"/>
-          <w:sz w:val="22"/>
-          <w:szCs w:val="22"/>
-        </w:rPr>
-        <w:t>” Another player mentioned, “</w:t>
-      </w:r>
-      <w:r>
-        <w:rPr>
-          <w:rFonts w:ascii="Arial" w:hAnsi="Arial" w:cs="Arial"/>
-          <w:sz w:val="22"/>
-          <w:szCs w:val="22"/>
-        </w:rPr>
-        <w:t>Once hit with a rock, they would break and stand still for a long period of time</w:t>
-      </w:r>
-      <w:r>
-        <w:rPr>
-          <w:rFonts w:ascii="Arial" w:hAnsi="Arial" w:cs="Arial"/>
-          <w:sz w:val="22"/>
-          <w:szCs w:val="22"/>
-        </w:rPr>
-        <w:t>,” while another confirmed, “</w:t>
-      </w:r>
-      <w:r>
-        <w:rPr>
-          <w:rFonts w:ascii="Arial" w:hAnsi="Arial" w:cs="Arial"/>
-          <w:sz w:val="22"/>
-          <w:szCs w:val="22"/>
-        </w:rPr>
-        <w:t>Enemy B got stuck on the ground for a few seconds while chasing me</w:t>
-      </w:r>
-      <w:r>
-        <w:rPr>
-          <w:rFonts w:ascii="Arial" w:hAnsi="Arial" w:cs="Arial"/>
-          <w:sz w:val="22"/>
-          <w:szCs w:val="22"/>
-        </w:rPr>
-        <w:t>.”</w:t>
+        <w:t>While the majority of players preferred the aggressive challenge of the BT agent, feedback indicated a significantly different experience for non-gamers. For example, Tester 9, who identified as having minimal gaming experience, explicitly preferred the ML agent. Because the ML agent too</w:t>
+      </w:r>
+      <w:r>
+        <w:rPr>
+          <w:rFonts w:ascii="Arial" w:hAnsi="Arial" w:cs="Arial"/>
+          <w:sz w:val="22"/>
+          <w:szCs w:val="22"/>
+        </w:rPr>
+        <w:t>k</w:t>
+      </w:r>
+      <w:r>
+        <w:rPr>
+          <w:rFonts w:ascii="Arial" w:hAnsi="Arial" w:cs="Arial"/>
+          <w:sz w:val="22"/>
+          <w:szCs w:val="22"/>
+        </w:rPr>
+        <w:t xml:space="preserve"> longer to adapt and relied on a slower stalking method, this tester found the encounter much more accessible and less overwhelming. This highlights an important dynamic in game AI design: while mathematical optimal agents appeal to seasoned players seeking high difficulty, the developing, unscripted behaviour of an RL agent may provide a more balanced and approachable experience for casual gamers.</w:t>
       </w:r>
     </w:p>
     <w:p>
@@ -23083,95 +23140,55 @@
           <w:sz w:val="22"/>
           <w:szCs w:val="22"/>
         </w:rPr>
-        <w:t>A key factor in th</w:t>
-      </w:r>
-      <w:r>
-        <w:rPr>
-          <w:rFonts w:ascii="Arial" w:hAnsi="Arial" w:cs="Arial"/>
-          <w:sz w:val="22"/>
-          <w:szCs w:val="22"/>
-        </w:rPr>
-        <w:t>e player</w:t>
-      </w:r>
-      <w:r>
-        <w:rPr>
-          <w:rFonts w:ascii="Arial" w:hAnsi="Arial" w:cs="Arial"/>
-          <w:sz w:val="22"/>
-          <w:szCs w:val="22"/>
-        </w:rPr>
-        <w:t xml:space="preserve"> preference</w:t>
-      </w:r>
-      <w:r>
-        <w:rPr>
-          <w:rFonts w:ascii="Arial" w:hAnsi="Arial" w:cs="Arial"/>
-          <w:sz w:val="22"/>
-          <w:szCs w:val="22"/>
-        </w:rPr>
-        <w:t xml:space="preserve"> for the BT was </w:t>
-      </w:r>
-      <w:r>
-        <w:rPr>
-          <w:rFonts w:ascii="Arial" w:hAnsi="Arial" w:cs="Arial"/>
-          <w:sz w:val="22"/>
-          <w:szCs w:val="22"/>
-        </w:rPr>
-        <w:t xml:space="preserve">the time required for the </w:t>
-      </w:r>
-      <w:r>
-        <w:rPr>
-          <w:rFonts w:ascii="Arial" w:hAnsi="Arial" w:cs="Arial"/>
-          <w:sz w:val="22"/>
-          <w:szCs w:val="22"/>
-        </w:rPr>
-        <w:t>RL</w:t>
-      </w:r>
-      <w:r>
-        <w:rPr>
-          <w:rFonts w:ascii="Arial" w:hAnsi="Arial" w:cs="Arial"/>
-          <w:sz w:val="22"/>
-          <w:szCs w:val="22"/>
-        </w:rPr>
-        <w:t xml:space="preserve"> agent to adapt. While the BT agent’s logic remained identical throughout the five-minute testing sessions, the </w:t>
-      </w:r>
-      <w:r>
-        <w:rPr>
-          <w:rFonts w:ascii="Arial" w:hAnsi="Arial" w:cs="Arial"/>
-          <w:sz w:val="22"/>
-          <w:szCs w:val="22"/>
-        </w:rPr>
-        <w:t xml:space="preserve">RL </w:t>
-      </w:r>
-      <w:r>
-        <w:rPr>
-          <w:rFonts w:ascii="Arial" w:hAnsi="Arial" w:cs="Arial"/>
-          <w:sz w:val="22"/>
-          <w:szCs w:val="22"/>
-        </w:rPr>
-        <w:t>agent was designed to get smarter over time as it gathered more data on a specific play</w:t>
-      </w:r>
-      <w:r>
-        <w:rPr>
-          <w:rFonts w:ascii="Arial" w:hAnsi="Arial" w:cs="Arial"/>
-          <w:sz w:val="22"/>
-          <w:szCs w:val="22"/>
-        </w:rPr>
-        <w:t>er</w:t>
-      </w:r>
-      <w:r>
-        <w:rPr>
-          <w:rFonts w:ascii="Arial" w:hAnsi="Arial" w:cs="Arial"/>
-          <w:sz w:val="22"/>
-          <w:szCs w:val="22"/>
-        </w:rPr>
-        <w:t xml:space="preserve">’s habits. However, evaluation showed that this adaptation process takes approximately 30 minutes of continuous play to become noticeable. Since the test sessions were capped at five minutes, </w:t>
-      </w:r>
-      <w:r>
-        <w:rPr>
-          <w:rFonts w:ascii="Arial" w:hAnsi="Arial" w:cs="Arial"/>
-          <w:sz w:val="22"/>
-          <w:szCs w:val="22"/>
-        </w:rPr>
-        <w:t>the RL agent did not have enough time to catch up to the player’s skill level, making it feel less effective than the BT.</w:t>
+        <w:t xml:space="preserve">However, the RL agent had different strengths. The RL agent’s slower, unscripted stalking approach was seen as useful for creating a more immersive and engaging tension over longer periods of time, rather than just ending the game quickly. Furthermore, the BT agent had clear technical flaws that the RL agent did not share. Testers highlighted this by saying, “ </w:t>
+      </w:r>
+      <w:r>
+        <w:rPr>
+          <w:rFonts w:ascii="Arial" w:hAnsi="Arial" w:cs="Arial"/>
+          <w:sz w:val="22"/>
+          <w:szCs w:val="22"/>
+        </w:rPr>
+        <w:t>They both seem to be similar, except B is Buggy (It gets stuck).</w:t>
+      </w:r>
+      <w:r>
+        <w:rPr>
+          <w:rFonts w:ascii="Arial" w:hAnsi="Arial" w:cs="Arial"/>
+          <w:sz w:val="22"/>
+          <w:szCs w:val="22"/>
+        </w:rPr>
+        <w:t>” Another player mentioned, “</w:t>
+      </w:r>
+      <w:r>
+        <w:rPr>
+          <w:rFonts w:ascii="Arial" w:hAnsi="Arial" w:cs="Arial"/>
+          <w:sz w:val="22"/>
+          <w:szCs w:val="22"/>
+        </w:rPr>
+        <w:t>Once hit with a rock, they would break and stand still for a long period of time</w:t>
+      </w:r>
+      <w:r>
+        <w:rPr>
+          <w:rFonts w:ascii="Arial" w:hAnsi="Arial" w:cs="Arial"/>
+          <w:sz w:val="22"/>
+          <w:szCs w:val="22"/>
+        </w:rPr>
+        <w:t>,” while another confirmed, “</w:t>
+      </w:r>
+      <w:r>
+        <w:rPr>
+          <w:rFonts w:ascii="Arial" w:hAnsi="Arial" w:cs="Arial"/>
+          <w:sz w:val="22"/>
+          <w:szCs w:val="22"/>
+        </w:rPr>
+        <w:t>Enemy B got stuck on the ground for a few seconds while chasing me</w:t>
+      </w:r>
+      <w:r>
+        <w:rPr>
+          <w:rFonts w:ascii="Arial" w:hAnsi="Arial" w:cs="Arial"/>
+          <w:sz w:val="22"/>
+          <w:szCs w:val="22"/>
+        </w:rPr>
+        <w:t>.”</w:t>
       </w:r>
     </w:p>
     <w:p>
@@ -23189,71 +23206,87 @@
           <w:sz w:val="22"/>
           <w:szCs w:val="22"/>
         </w:rPr>
-        <w:t xml:space="preserve">Furthermore, several technical exploits were discovered during the user testing phase that impacted the results. </w:t>
-      </w:r>
-      <w:r>
-        <w:rPr>
-          <w:rFonts w:ascii="Arial" w:hAnsi="Arial" w:cs="Arial"/>
-          <w:sz w:val="22"/>
-          <w:szCs w:val="22"/>
-        </w:rPr>
-        <w:t xml:space="preserve">Players manipulated the environment, with one tester explaining, “ </w:t>
-      </w:r>
-      <w:r>
-        <w:rPr>
-          <w:rFonts w:ascii="Arial" w:hAnsi="Arial" w:cs="Arial"/>
-          <w:sz w:val="22"/>
-          <w:szCs w:val="22"/>
-        </w:rPr>
-        <w:t>I was going in circles around rocks and the AI did not like it :D</w:t>
-      </w:r>
-      <w:r>
-        <w:rPr>
-          <w:rFonts w:ascii="Arial" w:hAnsi="Arial" w:cs="Arial"/>
-          <w:sz w:val="22"/>
-          <w:szCs w:val="22"/>
-        </w:rPr>
-        <w:t xml:space="preserve">.” </w:t>
-      </w:r>
-      <w:r>
-        <w:rPr>
-          <w:rFonts w:ascii="Arial" w:hAnsi="Arial" w:cs="Arial"/>
-          <w:sz w:val="22"/>
-          <w:szCs w:val="22"/>
-        </w:rPr>
-        <w:t xml:space="preserve">Many participants found they could avoid both agents by jumping on top of large rock obstacles. </w:t>
-      </w:r>
-      <w:r>
-        <w:rPr>
-          <w:rFonts w:ascii="Arial" w:hAnsi="Arial" w:cs="Arial"/>
-          <w:sz w:val="22"/>
-          <w:szCs w:val="22"/>
-        </w:rPr>
-        <w:t>One tester stated, “</w:t>
-      </w:r>
-      <w:r>
-        <w:rPr>
-          <w:rFonts w:ascii="Arial" w:hAnsi="Arial" w:cs="Arial"/>
-          <w:sz w:val="22"/>
-          <w:szCs w:val="22"/>
-        </w:rPr>
-        <w:t>I stood on a rock for 5 minutes and the enemies could not get me (clearly I'm smarter)</w:t>
-      </w:r>
-      <w:r>
-        <w:rPr>
-          <w:rFonts w:ascii="Arial" w:hAnsi="Arial" w:cs="Arial"/>
-          <w:sz w:val="22"/>
-          <w:szCs w:val="22"/>
-        </w:rPr>
-        <w:t xml:space="preserve">.” </w:t>
-      </w:r>
-      <w:r>
-        <w:rPr>
-          <w:rFonts w:ascii="Arial" w:hAnsi="Arial" w:cs="Arial"/>
-          <w:sz w:val="22"/>
-          <w:szCs w:val="22"/>
-        </w:rPr>
-        <w:t xml:space="preserve">Because the agents were not designed to navigate vertical terrain or climb, they were unable to reach the players once this tactic was used. While this prevented the agents from successfully completing the hunt, it provided valuable </w:t>
+        <w:t>A key factor in th</w:t>
+      </w:r>
+      <w:r>
+        <w:rPr>
+          <w:rFonts w:ascii="Arial" w:hAnsi="Arial" w:cs="Arial"/>
+          <w:sz w:val="22"/>
+          <w:szCs w:val="22"/>
+        </w:rPr>
+        <w:t>e player</w:t>
+      </w:r>
+      <w:r>
+        <w:rPr>
+          <w:rFonts w:ascii="Arial" w:hAnsi="Arial" w:cs="Arial"/>
+          <w:sz w:val="22"/>
+          <w:szCs w:val="22"/>
+        </w:rPr>
+        <w:t xml:space="preserve"> preference</w:t>
+      </w:r>
+      <w:r>
+        <w:rPr>
+          <w:rFonts w:ascii="Arial" w:hAnsi="Arial" w:cs="Arial"/>
+          <w:sz w:val="22"/>
+          <w:szCs w:val="22"/>
+        </w:rPr>
+        <w:t xml:space="preserve"> for the BT was </w:t>
+      </w:r>
+      <w:r>
+        <w:rPr>
+          <w:rFonts w:ascii="Arial" w:hAnsi="Arial" w:cs="Arial"/>
+          <w:sz w:val="22"/>
+          <w:szCs w:val="22"/>
+        </w:rPr>
+        <w:t xml:space="preserve">the time required for the </w:t>
+      </w:r>
+      <w:r>
+        <w:rPr>
+          <w:rFonts w:ascii="Arial" w:hAnsi="Arial" w:cs="Arial"/>
+          <w:sz w:val="22"/>
+          <w:szCs w:val="22"/>
+        </w:rPr>
+        <w:t>RL</w:t>
+      </w:r>
+      <w:r>
+        <w:rPr>
+          <w:rFonts w:ascii="Arial" w:hAnsi="Arial" w:cs="Arial"/>
+          <w:sz w:val="22"/>
+          <w:szCs w:val="22"/>
+        </w:rPr>
+        <w:t xml:space="preserve"> agent to adapt. While the BT agent’s logic remained identical throughout the five-minute testing sessions, the </w:t>
+      </w:r>
+      <w:r>
+        <w:rPr>
+          <w:rFonts w:ascii="Arial" w:hAnsi="Arial" w:cs="Arial"/>
+          <w:sz w:val="22"/>
+          <w:szCs w:val="22"/>
+        </w:rPr>
+        <w:t xml:space="preserve">RL </w:t>
+      </w:r>
+      <w:r>
+        <w:rPr>
+          <w:rFonts w:ascii="Arial" w:hAnsi="Arial" w:cs="Arial"/>
+          <w:sz w:val="22"/>
+          <w:szCs w:val="22"/>
+        </w:rPr>
+        <w:t>agent was designed to get smarter over time as it gathered more data on a specific play</w:t>
+      </w:r>
+      <w:r>
+        <w:rPr>
+          <w:rFonts w:ascii="Arial" w:hAnsi="Arial" w:cs="Arial"/>
+          <w:sz w:val="22"/>
+          <w:szCs w:val="22"/>
+        </w:rPr>
+        <w:t>er</w:t>
+      </w:r>
+      <w:r>
+        <w:rPr>
+          <w:rFonts w:ascii="Arial" w:hAnsi="Arial" w:cs="Arial"/>
+          <w:sz w:val="22"/>
+          <w:szCs w:val="22"/>
+        </w:rPr>
+        <w:t xml:space="preserve">’s habits. However, evaluation showed that this adaptation process takes approximately 30 minutes of continuous play to become noticeable. Since the test </w:t>
       </w:r>
       <w:r>
         <w:rPr>
@@ -23262,66 +23295,170 @@
           <w:szCs w:val="22"/>
         </w:rPr>
         <w:lastRenderedPageBreak/>
-        <w:t>data on how players naturally look for sa</w:t>
-      </w:r>
-      <w:r>
-        <w:rPr>
-          <w:rFonts w:ascii="Arial" w:hAnsi="Arial" w:cs="Arial"/>
-          <w:sz w:val="22"/>
-          <w:szCs w:val="22"/>
-        </w:rPr>
-        <w:t>f</w:t>
-      </w:r>
-      <w:r>
-        <w:rPr>
-          <w:rFonts w:ascii="Arial" w:hAnsi="Arial" w:cs="Arial"/>
-          <w:sz w:val="22"/>
-          <w:szCs w:val="22"/>
-        </w:rPr>
-        <w:t xml:space="preserve">e zones to exploit AI limitations. These findings suggest that while the </w:t>
-      </w:r>
-      <w:r>
-        <w:rPr>
-          <w:rFonts w:ascii="Arial" w:hAnsi="Arial" w:cs="Arial"/>
-          <w:sz w:val="22"/>
-          <w:szCs w:val="22"/>
-        </w:rPr>
-        <w:t>R</w:t>
-      </w:r>
-      <w:r>
-        <w:rPr>
-          <w:rFonts w:ascii="Arial" w:hAnsi="Arial" w:cs="Arial"/>
-          <w:sz w:val="22"/>
-          <w:szCs w:val="22"/>
-        </w:rPr>
-        <w:t>L agent has more potential for long term variety</w:t>
-      </w:r>
-      <w:r>
-        <w:rPr>
-          <w:rFonts w:ascii="Arial" w:hAnsi="Arial" w:cs="Arial"/>
-          <w:sz w:val="22"/>
-          <w:szCs w:val="22"/>
-        </w:rPr>
-        <w:t xml:space="preserve"> and immersion</w:t>
-      </w:r>
-      <w:r>
-        <w:rPr>
-          <w:rFonts w:ascii="Arial" w:hAnsi="Arial" w:cs="Arial"/>
-          <w:sz w:val="22"/>
-          <w:szCs w:val="22"/>
-        </w:rPr>
-        <w:t>, the immediate challenge provided by the BT agent is more effective for short term gameplay sessions.</w:t>
+        <w:t xml:space="preserve">sessions were capped at five minutes, </w:t>
+      </w:r>
+      <w:r>
+        <w:rPr>
+          <w:rFonts w:ascii="Arial" w:hAnsi="Arial" w:cs="Arial"/>
+          <w:sz w:val="22"/>
+          <w:szCs w:val="22"/>
+        </w:rPr>
+        <w:t>the RL agent did not have enough time to catch up to the player’s skill level, making it feel less effective than the BT.</w:t>
       </w:r>
     </w:p>
     <w:p>
       <w:pPr>
+        <w:spacing w:line="360" w:lineRule="auto"/>
+        <w:rPr>
+          <w:rFonts w:ascii="Arial" w:hAnsi="Arial" w:cs="Arial"/>
+          <w:sz w:val="22"/>
+          <w:szCs w:val="22"/>
+        </w:rPr>
+      </w:pPr>
+      <w:r>
+        <w:rPr>
+          <w:rFonts w:ascii="Arial" w:hAnsi="Arial" w:cs="Arial"/>
+          <w:sz w:val="22"/>
+          <w:szCs w:val="22"/>
+        </w:rPr>
+        <w:t xml:space="preserve">Furthermore, several technical exploits were discovered during the user testing phase that impacted the results. </w:t>
+      </w:r>
+      <w:r>
+        <w:rPr>
+          <w:rFonts w:ascii="Arial" w:hAnsi="Arial" w:cs="Arial"/>
+          <w:sz w:val="22"/>
+          <w:szCs w:val="22"/>
+        </w:rPr>
+        <w:t xml:space="preserve">Players manipulated the environment, with one tester explaining, “ </w:t>
+      </w:r>
+      <w:r>
+        <w:rPr>
+          <w:rFonts w:ascii="Arial" w:hAnsi="Arial" w:cs="Arial"/>
+          <w:sz w:val="22"/>
+          <w:szCs w:val="22"/>
+        </w:rPr>
+        <w:t xml:space="preserve">I was going in circles around </w:t>
+      </w:r>
+      <w:proofErr w:type="gramStart"/>
+      <w:r>
+        <w:rPr>
+          <w:rFonts w:ascii="Arial" w:hAnsi="Arial" w:cs="Arial"/>
+          <w:sz w:val="22"/>
+          <w:szCs w:val="22"/>
+        </w:rPr>
+        <w:t>rocks</w:t>
+      </w:r>
+      <w:proofErr w:type="gramEnd"/>
+      <w:r>
+        <w:rPr>
+          <w:rFonts w:ascii="Arial" w:hAnsi="Arial" w:cs="Arial"/>
+          <w:sz w:val="22"/>
+          <w:szCs w:val="22"/>
+        </w:rPr>
+        <w:t xml:space="preserve"> and the AI did not like it :D</w:t>
+      </w:r>
+      <w:r>
+        <w:rPr>
+          <w:rFonts w:ascii="Arial" w:hAnsi="Arial" w:cs="Arial"/>
+          <w:sz w:val="22"/>
+          <w:szCs w:val="22"/>
+        </w:rPr>
+        <w:t xml:space="preserve">.” </w:t>
+      </w:r>
+      <w:r>
+        <w:rPr>
+          <w:rFonts w:ascii="Arial" w:hAnsi="Arial" w:cs="Arial"/>
+          <w:sz w:val="22"/>
+          <w:szCs w:val="22"/>
+        </w:rPr>
+        <w:t xml:space="preserve">Many participants found they could avoid both agents by jumping on top of large rock obstacles. </w:t>
+      </w:r>
+      <w:r>
+        <w:rPr>
+          <w:rFonts w:ascii="Arial" w:hAnsi="Arial" w:cs="Arial"/>
+          <w:sz w:val="22"/>
+          <w:szCs w:val="22"/>
+        </w:rPr>
+        <w:t>One tester stated, “</w:t>
+      </w:r>
+      <w:r>
+        <w:rPr>
+          <w:rFonts w:ascii="Arial" w:hAnsi="Arial" w:cs="Arial"/>
+          <w:sz w:val="22"/>
+          <w:szCs w:val="22"/>
+        </w:rPr>
+        <w:t>I stood on a rock for 5 minutes and the enemies could not get me (clearly I'm smarter)</w:t>
+      </w:r>
+      <w:r>
+        <w:rPr>
+          <w:rFonts w:ascii="Arial" w:hAnsi="Arial" w:cs="Arial"/>
+          <w:sz w:val="22"/>
+          <w:szCs w:val="22"/>
+        </w:rPr>
+        <w:t xml:space="preserve">.” </w:t>
+      </w:r>
+      <w:r>
+        <w:rPr>
+          <w:rFonts w:ascii="Arial" w:hAnsi="Arial" w:cs="Arial"/>
+          <w:sz w:val="22"/>
+          <w:szCs w:val="22"/>
+        </w:rPr>
+        <w:t>Because the agents were not designed to navigate vertical terrain or climb, they were unable to reach the players once this tactic was used.</w:t>
+      </w:r>
+    </w:p>
+    <w:p>
+      <w:pPr>
+        <w:spacing w:line="360" w:lineRule="auto"/>
+        <w:rPr>
+          <w:rFonts w:ascii="Arial" w:hAnsi="Arial" w:cs="Arial"/>
+          <w:sz w:val="22"/>
+          <w:szCs w:val="22"/>
+        </w:rPr>
+      </w:pPr>
+      <w:r>
+        <w:rPr>
+          <w:rFonts w:ascii="Arial" w:hAnsi="Arial" w:cs="Arial"/>
+          <w:sz w:val="22"/>
+          <w:szCs w:val="22"/>
+        </w:rPr>
+        <w:t xml:space="preserve">In addition to navigation exploits, some participants discovered critical flaws in the combat mechanics. Multiple users reported an “infinite stun” bug were hitting the enemies with rocks caused “eternal paralysis,” which completely broke the pursuit loop and prevented the agents from moving. Testers also experienced sensory disconnects with Enemy B, noting that the audio and music sometimes failed to warn them of incoming threat. These issues provided valuable data on how players naturally look for safe zones and mechanical glitches to exploit AI limitations. </w:t>
+      </w:r>
+    </w:p>
+    <w:p>
+      <w:pPr>
+        <w:spacing w:line="360" w:lineRule="auto"/>
+        <w:rPr>
+          <w:rFonts w:ascii="Arial" w:hAnsi="Arial" w:cs="Arial"/>
+          <w:sz w:val="22"/>
+          <w:szCs w:val="22"/>
+        </w:rPr>
+      </w:pPr>
+      <w:r>
+        <w:rPr>
+          <w:rFonts w:ascii="Arial" w:hAnsi="Arial" w:cs="Arial"/>
+          <w:sz w:val="22"/>
+          <w:szCs w:val="22"/>
+        </w:rPr>
+        <w:t>The</w:t>
+      </w:r>
+      <w:r>
+        <w:rPr>
+          <w:rFonts w:ascii="Arial" w:hAnsi="Arial" w:cs="Arial"/>
+          <w:sz w:val="22"/>
+          <w:szCs w:val="22"/>
+        </w:rPr>
+        <w:t xml:space="preserve"> expanded feedback from all 11 testers also highlighted a distinct divide in how difficult and consistent the two agents felt. Testers widely agreed that Enemy A became predicable over time and was significantly slower, with multiple users noting it was entirely too easy to loop or evade. Enemy B, on the other hand, was described as “more consistent at finding me” and capable of sensing targets at longer ranges, creating a much higher-pressure environment. These findings suggest that while RL agent has more potential or long-term variety and immersion, the immediate challenge and mechanical pressure provided by the BT agent is more effective for short term gameplay sessions. </w:t>
+      </w:r>
+    </w:p>
+    <w:p>
+      <w:pPr>
         <w:pStyle w:val="Heading1"/>
         <w:spacing w:line="360" w:lineRule="auto"/>
         <w:rPr>
           <w:rFonts w:ascii="Arial" w:hAnsi="Arial" w:cs="Arial"/>
         </w:rPr>
       </w:pPr>
-      <w:bookmarkStart w:id="55" w:name="_Toc228557262"/>
+      <w:bookmarkStart w:id="55" w:name="_Toc228820570"/>
       <w:r>
         <w:rPr>
           <w:rFonts w:ascii="Arial" w:hAnsi="Arial" w:cs="Arial"/>
@@ -23350,7 +23487,7 @@
           <w:rFonts w:ascii="Arial" w:hAnsi="Arial" w:cs="Arial"/>
         </w:rPr>
       </w:pPr>
-      <w:bookmarkStart w:id="56" w:name="_Toc228557263"/>
+      <w:bookmarkStart w:id="56" w:name="_Toc228820571"/>
       <w:r>
         <w:rPr>
           <w:rFonts w:ascii="Arial" w:hAnsi="Arial" w:cs="Arial"/>
@@ -23443,6 +23580,7 @@
           <w:sz w:val="22"/>
           <w:szCs w:val="22"/>
         </w:rPr>
+        <w:lastRenderedPageBreak/>
         <w:t xml:space="preserve">Training instability and </w:t>
       </w:r>
       <w:r>
@@ -24145,16 +24283,7 @@
           <w:sz w:val="22"/>
           <w:szCs w:val="22"/>
         </w:rPr>
-        <w:t xml:space="preserve"> is currently an expert on its specific training map. While the environment used a randomiser script to move obstacles </w:t>
-      </w:r>
-      <w:r>
-        <w:rPr>
-          <w:rFonts w:ascii="Arial" w:hAnsi="Arial" w:cs="Arial"/>
-          <w:sz w:val="22"/>
-          <w:szCs w:val="22"/>
-        </w:rPr>
-        <w:lastRenderedPageBreak/>
-        <w:t>and distract the agent , the current policy is highly specialised to this terrain. If the agent were placed into a completely new terrain structure with different features, such as vertical cliffs or narrow indoor corridors, it would likely struggle  to adapt immediately. Such a transition would require an additional fine-tuning phase to help the agent learn the new map layout.</w:t>
+        <w:t xml:space="preserve"> is currently an expert on its specific training map. While the environment used a randomiser script to move obstacles and distract the agent , the current policy is highly specialised to this terrain. If the agent were placed into a completely new terrain structure with different features, such as vertical cliffs or narrow indoor corridors, it would likely struggle  to adapt immediately. Such a transition would require an additional fine-tuning phase to help the agent learn the new map layout.</w:t>
       </w:r>
       <w:sdt>
         <w:sdtPr>
@@ -24221,13 +24350,63 @@
     </w:p>
     <w:p>
       <w:pPr>
+        <w:pStyle w:val="ListParagraph"/>
+        <w:rPr>
+          <w:rFonts w:ascii="Arial" w:hAnsi="Arial" w:cs="Arial"/>
+          <w:sz w:val="22"/>
+          <w:szCs w:val="22"/>
+        </w:rPr>
+      </w:pPr>
+    </w:p>
+    <w:p>
+      <w:pPr>
+        <w:pStyle w:val="ListParagraph"/>
+        <w:numPr>
+          <w:ilvl w:val="0"/>
+          <w:numId w:val="1"/>
+        </w:numPr>
+        <w:spacing w:line="360" w:lineRule="auto"/>
+        <w:rPr>
+          <w:rFonts w:ascii="Arial" w:hAnsi="Arial" w:cs="Arial"/>
+          <w:sz w:val="22"/>
+          <w:szCs w:val="22"/>
+        </w:rPr>
+      </w:pPr>
+      <w:r>
+        <w:rPr>
+          <w:rFonts w:ascii="Arial" w:hAnsi="Arial" w:cs="Arial"/>
+          <w:sz w:val="22"/>
+          <w:szCs w:val="22"/>
+        </w:rPr>
+        <w:t>Gameplay and mechanical friction: Beyond the AI logic, the current build suffered from minor mechanical friction that impacted the testing experience. Feedback from participants noted that the lack of a crosshair made aiming throwables difficult, and some reported visual and audio bugs, such as random white screen effects or missing audio cues during pursuits. Additionally, environmental hitbox glitches</w:t>
+      </w:r>
+      <w:r>
+        <w:rPr>
+          <w:rFonts w:ascii="Arial" w:hAnsi="Arial" w:cs="Arial"/>
+          <w:sz w:val="22"/>
+          <w:szCs w:val="22"/>
+        </w:rPr>
+        <w:t xml:space="preserve"> ( including floating rocks, T posing animations, and a bugged escape </w:t>
+      </w:r>
+      <w:r>
+        <w:rPr>
+          <w:rFonts w:ascii="Arial" w:hAnsi="Arial" w:cs="Arial"/>
+          <w:sz w:val="22"/>
+          <w:szCs w:val="22"/>
+        </w:rPr>
+        <w:lastRenderedPageBreak/>
+        <w:t>trigger) occasionally interfered with the player’s immersion and the core gameplay loop.</w:t>
+      </w:r>
+    </w:p>
+    <w:p>
+      <w:pPr>
         <w:pStyle w:val="Heading2"/>
         <w:spacing w:line="360" w:lineRule="auto"/>
         <w:rPr>
           <w:rFonts w:ascii="Arial" w:hAnsi="Arial" w:cs="Arial"/>
         </w:rPr>
       </w:pPr>
-      <w:bookmarkStart w:id="57" w:name="_Toc228557264"/>
+      <w:bookmarkStart w:id="57" w:name="_Toc228820572"/>
       <w:r>
         <w:rPr>
           <w:rFonts w:ascii="Arial" w:hAnsi="Arial" w:cs="Arial"/>
@@ -24656,7 +24835,7 @@
           <w:rFonts w:ascii="Arial" w:hAnsi="Arial" w:cs="Arial"/>
         </w:rPr>
       </w:pPr>
-      <w:bookmarkStart w:id="58" w:name="_Toc228557265"/>
+      <w:bookmarkStart w:id="58" w:name="_Toc228820573"/>
       <w:r>
         <w:rPr>
           <w:rFonts w:ascii="Arial" w:hAnsi="Arial" w:cs="Arial"/>
@@ -24679,7 +24858,7 @@
           <w:rFonts w:ascii="Arial" w:hAnsi="Arial" w:cs="Arial"/>
         </w:rPr>
       </w:pPr>
-      <w:bookmarkStart w:id="59" w:name="_Toc228557266"/>
+      <w:bookmarkStart w:id="59" w:name="_Toc228820574"/>
       <w:r>
         <w:rPr>
           <w:rFonts w:ascii="Arial" w:hAnsi="Arial" w:cs="Arial"/>
@@ -24859,16 +25038,7 @@
           <w:sz w:val="22"/>
           <w:szCs w:val="22"/>
         </w:rPr>
-        <w:t xml:space="preserve">on, hearing and scent tracking, the agent successfully learned to hunt a dynamic player target while filtering out environmental </w:t>
-      </w:r>
-      <w:r>
-        <w:rPr>
-          <w:rFonts w:ascii="Arial" w:hAnsi="Arial" w:cs="Arial"/>
-          <w:sz w:val="22"/>
-          <w:szCs w:val="22"/>
-        </w:rPr>
-        <w:lastRenderedPageBreak/>
-        <w:t>noise</w:t>
+        <w:t>on, hearing and scent tracking, the agent successfully learned to hunt a dynamic player target while filtering out environmental noise</w:t>
       </w:r>
       <w:sdt>
         <w:sdtPr>
@@ -24996,7 +25166,16 @@
           <w:sz w:val="22"/>
           <w:szCs w:val="22"/>
         </w:rPr>
-        <w:t xml:space="preserve">testers ultimately preferred the BT agent for short sessions. However, the project was not a failure. It is acceptable that the RL agent did not dominate player preference, because the results highlight that the short five-minute survival format was simply the wrong type of game mode for a slow learning network. The BT agent won in immediate difficulty, but the RL agent successfully learned a highly engaging and unscripted adaptability. </w:t>
+        <w:t xml:space="preserve">testers ultimately preferred the BT agent for short sessions. However, </w:t>
+      </w:r>
+      <w:r>
+        <w:rPr>
+          <w:rFonts w:ascii="Arial" w:hAnsi="Arial" w:cs="Arial"/>
+          <w:sz w:val="22"/>
+          <w:szCs w:val="22"/>
+        </w:rPr>
+        <w:lastRenderedPageBreak/>
+        <w:t xml:space="preserve">the project was not a failure. It is acceptable that the RL agent did not dominate player preference, because the results highlight that the short five-minute survival format was simply the wrong type of game mode for a slow learning network. The BT agent won in immediate difficulty, but the RL agent successfully learned a highly engaging and unscripted adaptability. </w:t>
       </w:r>
       <w:r>
         <w:rPr>
@@ -25157,7 +25336,7 @@
           <w:rFonts w:ascii="Arial" w:hAnsi="Arial" w:cs="Arial"/>
         </w:rPr>
       </w:pPr>
-      <w:bookmarkStart w:id="60" w:name="_Toc228557267"/>
+      <w:bookmarkStart w:id="60" w:name="_Toc228820575"/>
       <w:r>
         <w:rPr>
           <w:rFonts w:ascii="Arial" w:hAnsi="Arial" w:cs="Arial"/>
@@ -25600,16 +25779,7 @@
           <w:sz w:val="22"/>
           <w:szCs w:val="22"/>
         </w:rPr>
-        <w:t xml:space="preserve"> the predator and its </w:t>
-      </w:r>
-      <w:r>
-        <w:rPr>
-          <w:rFonts w:ascii="Arial" w:hAnsi="Arial" w:cs="Arial"/>
-          <w:sz w:val="22"/>
-          <w:szCs w:val="22"/>
-        </w:rPr>
-        <w:lastRenderedPageBreak/>
-        <w:t xml:space="preserve">scouts </w:t>
+        <w:t xml:space="preserve"> the predator and its scouts </w:t>
       </w:r>
       <w:r>
         <w:rPr>
@@ -25729,6 +25899,7 @@
           <w:sz w:val="22"/>
           <w:szCs w:val="22"/>
         </w:rPr>
+        <w:lastRenderedPageBreak/>
         <w:t xml:space="preserve">Multiplayer dynamics: </w:t>
       </w:r>
       <w:r>
@@ -25866,7 +26037,40 @@
         <w:t xml:space="preserve"> This would test the AI’s ability to make complex tactical decisions in a more chaotic environment.</w:t>
       </w:r>
     </w:p>
-    <w:bookmarkStart w:id="61" w:name="_Toc228557268" w:displacedByCustomXml="next"/>
+    <w:p>
+      <w:pPr>
+        <w:pStyle w:val="ListParagraph"/>
+        <w:rPr>
+          <w:rFonts w:ascii="Arial" w:hAnsi="Arial" w:cs="Arial"/>
+          <w:sz w:val="22"/>
+          <w:szCs w:val="22"/>
+        </w:rPr>
+      </w:pPr>
+    </w:p>
+    <w:p>
+      <w:pPr>
+        <w:pStyle w:val="ListParagraph"/>
+        <w:numPr>
+          <w:ilvl w:val="0"/>
+          <w:numId w:val="1"/>
+        </w:numPr>
+        <w:spacing w:line="360" w:lineRule="auto"/>
+        <w:rPr>
+          <w:rFonts w:ascii="Arial" w:hAnsi="Arial" w:cs="Arial"/>
+          <w:sz w:val="22"/>
+          <w:szCs w:val="22"/>
+        </w:rPr>
+      </w:pPr>
+      <w:r>
+        <w:rPr>
+          <w:rFonts w:ascii="Arial" w:hAnsi="Arial" w:cs="Arial"/>
+          <w:sz w:val="22"/>
+          <w:szCs w:val="22"/>
+        </w:rPr>
+        <w:t>Mechanical balancing and bug resolution: immediate future work must also address the “infinite stun” exploit found during testing. The logic for throwable rocks needs to be updated to prevent players from permanently paralysing the agents. Additionally, refining the sensory warning systems to ensure audio consistently triggers when an enemy approaches, alongside fixing environmental clipping and hitbox issues around trees, will be necessary to ensure a seamless and fair testing environment.</w:t>
+      </w:r>
+    </w:p>
+    <w:bookmarkStart w:id="61" w:name="_Toc228820576" w:displacedByCustomXml="next"/>
     <w:sdt>
       <w:sdtPr>
         <w:rPr>
@@ -26087,6 +26291,7 @@
                 <w:rPr>
                   <w:noProof/>
                 </w:rPr>
+                <w:lastRenderedPageBreak/>
                 <w:t xml:space="preserve">Isbister, K. &amp; Nass, C., 2000. </w:t>
               </w:r>
               <w:r>
@@ -26116,7 +26321,6 @@
                 <w:rPr>
                   <w:noProof/>
                 </w:rPr>
-                <w:lastRenderedPageBreak/>
                 <w:t xml:space="preserve">Jaderberg, M., Czarnecki, W., Dunning, I. &amp; al., e., 2019. Human-level performance in first-person multiplayer games with population-based deep reinforcement learning. </w:t>
               </w:r>
               <w:r>
@@ -26435,6 +26639,7 @@
                 <w:rPr>
                   <w:noProof/>
                 </w:rPr>
+                <w:lastRenderedPageBreak/>
                 <w:t xml:space="preserve">Silver, D., Schrittwieser, J., Simonyan, K. &amp; al., e., 2017. Mastering the game of Go without human knowledge. </w:t>
               </w:r>
               <w:r>
@@ -26464,7 +26669,6 @@
                 <w:rPr>
                   <w:noProof/>
                 </w:rPr>
-                <w:lastRenderedPageBreak/>
                 <w:t xml:space="preserve">Sutton, R. &amp; Barto, A., 2018. </w:t>
               </w:r>
               <w:r>
@@ -26561,7 +26765,7 @@
         <w:pStyle w:val="Heading2"/>
         <w:spacing w:line="360" w:lineRule="auto"/>
       </w:pPr>
-      <w:bookmarkStart w:id="62" w:name="_Toc228557269"/>
+      <w:bookmarkStart w:id="62" w:name="_Toc228820577"/>
       <w:r>
         <w:t>List of Assets used in implementation</w:t>
       </w:r>
@@ -27081,6 +27285,7 @@
           <w:sz w:val="22"/>
           <w:szCs w:val="22"/>
         </w:rPr>
+        <w:lastRenderedPageBreak/>
         <w:t xml:space="preserve">Audio source - AlesiaDavina - </w:t>
       </w:r>
       <w:hyperlink r:id="rId39" w:history="1">
@@ -27143,7 +27348,6 @@
           <w:sz w:val="22"/>
           <w:szCs w:val="22"/>
         </w:rPr>
-        <w:lastRenderedPageBreak/>
         <w:t xml:space="preserve">Audio music - meak363 - </w:t>
       </w:r>
       <w:hyperlink r:id="rId41" w:history="1">
@@ -27193,7 +27397,7 @@
         <w:pStyle w:val="Heading1"/>
         <w:spacing w:line="360" w:lineRule="auto"/>
       </w:pPr>
-      <w:bookmarkStart w:id="63" w:name="_Toc228557270"/>
+      <w:bookmarkStart w:id="63" w:name="_Toc228820578"/>
       <w:r>
         <w:t>Appendices</w:t>
       </w:r>
@@ -27259,10 +27463,10 @@
             <v:path o:extrusionok="f" gradientshapeok="t" o:connecttype="rect"/>
             <o:lock v:ext="edit" aspectratio="t"/>
           </v:shapetype>
-          <v:shape id="_x0000_i1025" type="#_x0000_t75" alt="Yaml code" style="width:324.45pt;height:388.05pt" o:ole="">
+          <v:shape id="_x0000_i1025" type="#_x0000_t75" alt="Yaml code" style="width:324.75pt;height:388.5pt" o:ole="">
             <v:imagedata r:id="rId43" o:title=""/>
           </v:shape>
-          <o:OLEObject Type="Embed" ProgID="Word.OpenDocumentText.12" ShapeID="_x0000_i1025" DrawAspect="Content" ObjectID="_1839185912" r:id="rId44"/>
+          <o:OLEObject Type="Embed" ProgID="Word.OpenDocumentText.12" ShapeID="_x0000_i1025" DrawAspect="Content" ObjectID="_1839433296" r:id="rId44"/>
         </w:object>
       </w:r>
     </w:p>
@@ -27281,7 +27485,7 @@
           <w:szCs w:val="22"/>
         </w:rPr>
       </w:pPr>
-      <w:bookmarkStart w:id="65" w:name="_Toc228557284"/>
+      <w:bookmarkStart w:id="65" w:name="_Toc228820592"/>
       <w:r>
         <w:rPr>
           <w:i w:val="0"/>
@@ -27389,10 +27593,10 @@
           <w:bCs/>
         </w:rPr>
         <w:object w:dxaOrig="9026" w:dyaOrig="13910" w14:anchorId="19A3EC3C">
-          <v:shape id="_x0000_i1026" type="#_x0000_t75" alt="ML observation code" style="width:195.45pt;height:313.25pt" o:ole="">
+          <v:shape id="_x0000_i1026" type="#_x0000_t75" alt="ML observation code" style="width:195.75pt;height:312.75pt" o:ole="">
             <v:imagedata r:id="rId45" o:title=""/>
           </v:shape>
-          <o:OLEObject Type="Embed" ProgID="Word.OpenDocumentText.12" ShapeID="_x0000_i1026" DrawAspect="Content" ObjectID="_1839185913" r:id="rId46"/>
+          <o:OLEObject Type="Embed" ProgID="Word.OpenDocumentText.12" ShapeID="_x0000_i1026" DrawAspect="Content" ObjectID="_1839433297" r:id="rId46"/>
         </w:object>
       </w:r>
       <w:bookmarkStart w:id="67" w:name="_MON_1838484010"/>
@@ -27404,10 +27608,10 @@
           <w:bCs/>
         </w:rPr>
         <w:object w:dxaOrig="9360" w:dyaOrig="12806" w14:anchorId="314D5B2D">
-          <v:shape id="_x0000_i1027" type="#_x0000_t75" alt="ML reward systrem" style="width:217.85pt;height:312.3pt" o:ole="">
+          <v:shape id="_x0000_i1027" type="#_x0000_t75" alt="ML reward systrem" style="width:217.5pt;height:312.75pt" o:ole="">
             <v:imagedata r:id="rId47" o:title=""/>
           </v:shape>
-          <o:OLEObject Type="Embed" ProgID="Word.OpenDocumentText.12" ShapeID="_x0000_i1027" DrawAspect="Content" ObjectID="_1839185914" r:id="rId48"/>
+          <o:OLEObject Type="Embed" ProgID="Word.OpenDocumentText.12" ShapeID="_x0000_i1027" DrawAspect="Content" ObjectID="_1839433298" r:id="rId48"/>
         </w:object>
       </w:r>
     </w:p>
@@ -27426,7 +27630,7 @@
           <w:szCs w:val="22"/>
         </w:rPr>
       </w:pPr>
-      <w:bookmarkStart w:id="68" w:name="_Toc228557285"/>
+      <w:bookmarkStart w:id="68" w:name="_Toc228820593"/>
       <w:r>
         <w:rPr>
           <w:i w:val="0"/>
@@ -27534,10 +27738,10 @@
           <w:bCs/>
         </w:rPr>
         <w:object w:dxaOrig="9026" w:dyaOrig="13647" w14:anchorId="1E3D96E0">
-          <v:shape id="_x0000_i1028" type="#_x0000_t75" alt="BT structuer " style="width:215.05pt;height:325.4pt" o:ole="">
+          <v:shape id="_x0000_i1028" type="#_x0000_t75" alt="BT structuer " style="width:215.25pt;height:325.5pt" o:ole="">
             <v:imagedata r:id="rId49" o:title=""/>
           </v:shape>
-          <o:OLEObject Type="Embed" ProgID="Word.OpenDocumentText.12" ShapeID="_x0000_i1028" DrawAspect="Content" ObjectID="_1839185915" r:id="rId50"/>
+          <o:OLEObject Type="Embed" ProgID="Word.OpenDocumentText.12" ShapeID="_x0000_i1028" DrawAspect="Content" ObjectID="_1839433299" r:id="rId50"/>
         </w:object>
       </w:r>
       <w:bookmarkStart w:id="70" w:name="_MON_1838484536"/>
@@ -27549,10 +27753,10 @@
           <w:bCs/>
         </w:rPr>
         <w:object w:dxaOrig="9026" w:dyaOrig="13910" w14:anchorId="08993597">
-          <v:shape id="_x0000_i1029" type="#_x0000_t75" alt="BT code" style="width:211.3pt;height:324.45pt;mso-position-horizontal:absolute" o:ole="">
+          <v:shape id="_x0000_i1029" type="#_x0000_t75" alt="BT code" style="width:211.5pt;height:324pt;mso-position-horizontal:absolute" o:ole="">
             <v:imagedata r:id="rId51" o:title=""/>
           </v:shape>
-          <o:OLEObject Type="Embed" ProgID="Word.OpenDocumentText.12" ShapeID="_x0000_i1029" DrawAspect="Content" ObjectID="_1839185916" r:id="rId52"/>
+          <o:OLEObject Type="Embed" ProgID="Word.OpenDocumentText.12" ShapeID="_x0000_i1029" DrawAspect="Content" ObjectID="_1839433300" r:id="rId52"/>
         </w:object>
       </w:r>
     </w:p>
@@ -27568,7 +27772,7 @@
           <w:szCs w:val="22"/>
         </w:rPr>
       </w:pPr>
-      <w:bookmarkStart w:id="71" w:name="_Toc228557286"/>
+      <w:bookmarkStart w:id="71" w:name="_Toc228820594"/>
       <w:r>
         <w:rPr>
           <w:i w:val="0"/>
@@ -28040,7 +28244,7 @@
           <w:szCs w:val="22"/>
         </w:rPr>
       </w:pPr>
-      <w:bookmarkStart w:id="72" w:name="_Toc228557289"/>
+      <w:bookmarkStart w:id="72" w:name="_Toc228820597"/>
       <w:r>
         <w:rPr>
           <w:i w:val="0"/>
@@ -32142,10 +32346,10 @@
                 <c:formatCode>General</c:formatCode>
                 <c:ptCount val="2"/>
                 <c:pt idx="0">
-                  <c:v>2</c:v>
+                  <c:v>4</c:v>
                 </c:pt>
                 <c:pt idx="1">
-                  <c:v>4</c:v>
+                  <c:v>7</c:v>
                 </c:pt>
               </c:numCache>
             </c:numRef>
@@ -32393,7 +32597,7 @@
                 <c:formatCode>General</c:formatCode>
                 <c:ptCount val="1"/>
                 <c:pt idx="0">
-                  <c:v>0</c:v>
+                  <c:v>2</c:v>
                 </c:pt>
               </c:numCache>
             </c:numRef>
@@ -32467,7 +32671,7 @@
                 <c:formatCode>General</c:formatCode>
                 <c:ptCount val="1"/>
                 <c:pt idx="0">
-                  <c:v>5</c:v>
+                  <c:v>7</c:v>
                 </c:pt>
               </c:numCache>
             </c:numRef>
@@ -32541,7 +32745,7 @@
                 <c:formatCode>General</c:formatCode>
                 <c:ptCount val="1"/>
                 <c:pt idx="0">
-                  <c:v>1</c:v>
+                  <c:v>2</c:v>
                 </c:pt>
               </c:numCache>
             </c:numRef>

</xml_diff>